<commit_message>
Add math formula rendering to docx converter
</commit_message>
<xml_diff>
--- a/毕业论文_完整版.docx
+++ b/毕业论文_完整版.docx
@@ -1324,36 +1324,179 @@
     </w:p>
     <w:p>
       <w:pPr>
-        <w:spacing w:after="60" w:before="60" w:line="360"/>
-      </w:pPr>
-      <w:r>
-        <w:rPr>
-          <w:rFonts w:ascii="SimSun" w:cs="SimSun" w:eastAsia="SimSun" w:hAnsi="SimSun"/>
-          <w:b w:val="false"/>
-          <w:bCs w:val="false"/>
-          <w:i w:val="false"/>
-          <w:iCs w:val="false"/>
-          <w:sz w:val="24"/>
-          <w:szCs w:val="24"/>
-        </w:rPr>
-        <w:t xml:space="preserve">$$X[k] = \sum_{n=0}^{N-1} x[n] \cdot e^{-j2\pi kn/N}$$</w:t>
-      </w:r>
-    </w:p>
-    <w:p>
-      <w:pPr>
-        <w:spacing w:after="60" w:before="60" w:line="360"/>
-      </w:pPr>
-      <w:r>
-        <w:rPr>
-          <w:rFonts w:ascii="SimSun" w:cs="SimSun" w:eastAsia="SimSun" w:hAnsi="SimSun"/>
-          <w:b w:val="false"/>
-          <w:bCs w:val="false"/>
-          <w:i w:val="false"/>
-          <w:iCs w:val="false"/>
-          <w:sz w:val="24"/>
-          <w:szCs w:val="24"/>
-        </w:rPr>
-        <w:t xml:space="preserve">其中，$x[n]$为时域采样序列，$X[k]$为对应的频域复数谱系数，$N$为DFT点数，$k$为频率索引。$|X[k]|$称为幅度谱，反映各频率成分的能量大小；$\angle X[k]$称为相位谱，反映各频率成分的相位偏移。</w:t>
+        <w:spacing w:after="80" w:before="80"/>
+        <w:jc w:val="center"/>
+      </w:pPr>
+      <w:r>
+        <w:rPr>
+          <w:rFonts w:ascii="Times New Roman" w:cs="Times New Roman" w:eastAsia="Times New Roman" w:hAnsi="Times New Roman"/>
+          <w:i/>
+          <w:iCs/>
+          <w:sz w:val="22"/>
+          <w:szCs w:val="22"/>
+        </w:rPr>
+        <w:t xml:space="preserve">X[k] = \sum_{n=0}^{N-1} x[n] \cdot e^{-j2\pi kn/N}</w:t>
+      </w:r>
+    </w:p>
+    <w:p>
+      <w:pPr>
+        <w:spacing w:after="60" w:before="60" w:line="360"/>
+      </w:pPr>
+      <w:r>
+        <w:rPr>
+          <w:rFonts w:ascii="SimSun" w:cs="SimSun" w:eastAsia="SimSun" w:hAnsi="SimSun"/>
+          <w:b w:val="false"/>
+          <w:bCs w:val="false"/>
+          <w:i w:val="false"/>
+          <w:iCs w:val="false"/>
+          <w:sz w:val="24"/>
+          <w:szCs w:val="24"/>
+        </w:rPr>
+        <w:t xml:space="preserve">其中，</w:t>
+      </w:r>
+      <w:r>
+        <w:rPr>
+          <w:rFonts w:ascii="SimSun" w:cs="SimSun" w:eastAsia="SimSun" w:hAnsi="SimSun"/>
+          <w:b w:val="false"/>
+          <w:bCs w:val="false"/>
+          <w:i/>
+          <w:iCs/>
+          <w:sz w:val="24"/>
+          <w:szCs w:val="24"/>
+        </w:rPr>
+        <w:t xml:space="preserve">x[n]</w:t>
+      </w:r>
+      <w:r>
+        <w:rPr>
+          <w:rFonts w:ascii="SimSun" w:cs="SimSun" w:eastAsia="SimSun" w:hAnsi="SimSun"/>
+          <w:b w:val="false"/>
+          <w:bCs w:val="false"/>
+          <w:i w:val="false"/>
+          <w:iCs w:val="false"/>
+          <w:sz w:val="24"/>
+          <w:szCs w:val="24"/>
+        </w:rPr>
+        <w:t xml:space="preserve">为时域采样序列，</w:t>
+      </w:r>
+      <w:r>
+        <w:rPr>
+          <w:rFonts w:ascii="SimSun" w:cs="SimSun" w:eastAsia="SimSun" w:hAnsi="SimSun"/>
+          <w:b w:val="false"/>
+          <w:bCs w:val="false"/>
+          <w:i/>
+          <w:iCs/>
+          <w:sz w:val="24"/>
+          <w:szCs w:val="24"/>
+        </w:rPr>
+        <w:t xml:space="preserve">X[k]</w:t>
+      </w:r>
+      <w:r>
+        <w:rPr>
+          <w:rFonts w:ascii="SimSun" w:cs="SimSun" w:eastAsia="SimSun" w:hAnsi="SimSun"/>
+          <w:b w:val="false"/>
+          <w:bCs w:val="false"/>
+          <w:i w:val="false"/>
+          <w:iCs w:val="false"/>
+          <w:sz w:val="24"/>
+          <w:szCs w:val="24"/>
+        </w:rPr>
+        <w:t xml:space="preserve">为对应的频域复数谱系数，</w:t>
+      </w:r>
+      <w:r>
+        <w:rPr>
+          <w:rFonts w:ascii="SimSun" w:cs="SimSun" w:eastAsia="SimSun" w:hAnsi="SimSun"/>
+          <w:b w:val="false"/>
+          <w:bCs w:val="false"/>
+          <w:i/>
+          <w:iCs/>
+          <w:sz w:val="24"/>
+          <w:szCs w:val="24"/>
+        </w:rPr>
+        <w:t xml:space="preserve">N</w:t>
+      </w:r>
+      <w:r>
+        <w:rPr>
+          <w:rFonts w:ascii="SimSun" w:cs="SimSun" w:eastAsia="SimSun" w:hAnsi="SimSun"/>
+          <w:b w:val="false"/>
+          <w:bCs w:val="false"/>
+          <w:i w:val="false"/>
+          <w:iCs w:val="false"/>
+          <w:sz w:val="24"/>
+          <w:szCs w:val="24"/>
+        </w:rPr>
+        <w:t xml:space="preserve">为DFT点数，</w:t>
+      </w:r>
+      <w:r>
+        <w:rPr>
+          <w:rFonts w:ascii="SimSun" w:cs="SimSun" w:eastAsia="SimSun" w:hAnsi="SimSun"/>
+          <w:b w:val="false"/>
+          <w:bCs w:val="false"/>
+          <w:i/>
+          <w:iCs/>
+          <w:sz w:val="24"/>
+          <w:szCs w:val="24"/>
+        </w:rPr>
+        <w:t xml:space="preserve">k</w:t>
+      </w:r>
+      <w:r>
+        <w:rPr>
+          <w:rFonts w:ascii="SimSun" w:cs="SimSun" w:eastAsia="SimSun" w:hAnsi="SimSun"/>
+          <w:b w:val="false"/>
+          <w:bCs w:val="false"/>
+          <w:i w:val="false"/>
+          <w:iCs w:val="false"/>
+          <w:sz w:val="24"/>
+          <w:szCs w:val="24"/>
+        </w:rPr>
+        <w:t xml:space="preserve">为频率索引。</w:t>
+      </w:r>
+      <w:r>
+        <w:rPr>
+          <w:rFonts w:ascii="SimSun" w:cs="SimSun" w:eastAsia="SimSun" w:hAnsi="SimSun"/>
+          <w:b w:val="false"/>
+          <w:bCs w:val="false"/>
+          <w:i/>
+          <w:iCs/>
+          <w:sz w:val="24"/>
+          <w:szCs w:val="24"/>
+        </w:rPr>
+        <w:t xml:space="preserve">|X[k]|</w:t>
+      </w:r>
+      <w:r>
+        <w:rPr>
+          <w:rFonts w:ascii="SimSun" w:cs="SimSun" w:eastAsia="SimSun" w:hAnsi="SimSun"/>
+          <w:b w:val="false"/>
+          <w:bCs w:val="false"/>
+          <w:i w:val="false"/>
+          <w:iCs w:val="false"/>
+          <w:sz w:val="24"/>
+          <w:szCs w:val="24"/>
+        </w:rPr>
+        <w:t xml:space="preserve">称为幅度谱，反映各频率成分的能量大小；</w:t>
+      </w:r>
+      <w:r>
+        <w:rPr>
+          <w:rFonts w:ascii="SimSun" w:cs="SimSun" w:eastAsia="SimSun" w:hAnsi="SimSun"/>
+          <w:b w:val="false"/>
+          <w:bCs w:val="false"/>
+          <w:i/>
+          <w:iCs/>
+          <w:sz w:val="24"/>
+          <w:szCs w:val="24"/>
+        </w:rPr>
+        <w:t xml:space="preserve">\angle X[k]</w:t>
+      </w:r>
+      <w:r>
+        <w:rPr>
+          <w:rFonts w:ascii="SimSun" w:cs="SimSun" w:eastAsia="SimSun" w:hAnsi="SimSun"/>
+          <w:b w:val="false"/>
+          <w:bCs w:val="false"/>
+          <w:i w:val="false"/>
+          <w:iCs w:val="false"/>
+          <w:sz w:val="24"/>
+          <w:szCs w:val="24"/>
+        </w:rPr>
+        <w:t xml:space="preserve">称为相位谱，反映各频率成分的相位偏移。</w:t>
       </w:r>
     </w:p>
     <w:p>
@@ -1404,7 +1547,127 @@
           <w:sz w:val="24"/>
           <w:szCs w:val="24"/>
         </w:rPr>
-        <w:t xml:space="preserve">STFT涉及三个关键参数：FFT点数（$N_{FFT}$）、帧移（hop_length）和窗函数类型。$N_{FFT}$决定了每帧在频域上的频率分辨率（分辨率 = 采样率/$N_{FFT}$）；帧移决定相邻帧的时间间隔；窗函数（如汉明窗、汉宁窗）用于抑制帧边缘的频谱泄漏。本文采用$N_{FFT}=512$、hop_length=128的配置，在16kHz采样率下，频率分辨率为31.25Hz，时间分辨率为8ms，频率维度输出257点（$N_{FFT}/2+1$，对称部分省略）。</w:t>
+        <w:t xml:space="preserve">STFT涉及三个关键参数：FFT点数（</w:t>
+      </w:r>
+      <w:r>
+        <w:rPr>
+          <w:rFonts w:ascii="SimSun" w:cs="SimSun" w:eastAsia="SimSun" w:hAnsi="SimSun"/>
+          <w:b w:val="false"/>
+          <w:bCs w:val="false"/>
+          <w:i/>
+          <w:iCs/>
+          <w:sz w:val="24"/>
+          <w:szCs w:val="24"/>
+        </w:rPr>
+        <w:t xml:space="preserve">N_{FFT}</w:t>
+      </w:r>
+      <w:r>
+        <w:rPr>
+          <w:rFonts w:ascii="SimSun" w:cs="SimSun" w:eastAsia="SimSun" w:hAnsi="SimSun"/>
+          <w:b w:val="false"/>
+          <w:bCs w:val="false"/>
+          <w:i w:val="false"/>
+          <w:iCs w:val="false"/>
+          <w:sz w:val="24"/>
+          <w:szCs w:val="24"/>
+        </w:rPr>
+        <w:t xml:space="preserve">）、帧移（hop_length）和窗函数类型。</w:t>
+      </w:r>
+      <w:r>
+        <w:rPr>
+          <w:rFonts w:ascii="SimSun" w:cs="SimSun" w:eastAsia="SimSun" w:hAnsi="SimSun"/>
+          <w:b w:val="false"/>
+          <w:bCs w:val="false"/>
+          <w:i/>
+          <w:iCs/>
+          <w:sz w:val="24"/>
+          <w:szCs w:val="24"/>
+        </w:rPr>
+        <w:t xml:space="preserve">N_{FFT}</w:t>
+      </w:r>
+      <w:r>
+        <w:rPr>
+          <w:rFonts w:ascii="SimSun" w:cs="SimSun" w:eastAsia="SimSun" w:hAnsi="SimSun"/>
+          <w:b w:val="false"/>
+          <w:bCs w:val="false"/>
+          <w:i w:val="false"/>
+          <w:iCs w:val="false"/>
+          <w:sz w:val="24"/>
+          <w:szCs w:val="24"/>
+        </w:rPr>
+        <w:t xml:space="preserve">决定了每帧在频域上的频率分辨率（分辨率 = 采样率/</w:t>
+      </w:r>
+      <w:r>
+        <w:rPr>
+          <w:rFonts w:ascii="SimSun" w:cs="SimSun" w:eastAsia="SimSun" w:hAnsi="SimSun"/>
+          <w:b w:val="false"/>
+          <w:bCs w:val="false"/>
+          <w:i/>
+          <w:iCs/>
+          <w:sz w:val="24"/>
+          <w:szCs w:val="24"/>
+        </w:rPr>
+        <w:t xml:space="preserve">N_{FFT}</w:t>
+      </w:r>
+      <w:r>
+        <w:rPr>
+          <w:rFonts w:ascii="SimSun" w:cs="SimSun" w:eastAsia="SimSun" w:hAnsi="SimSun"/>
+          <w:b w:val="false"/>
+          <w:bCs w:val="false"/>
+          <w:i w:val="false"/>
+          <w:iCs w:val="false"/>
+          <w:sz w:val="24"/>
+          <w:szCs w:val="24"/>
+        </w:rPr>
+        <w:t xml:space="preserve">）；帧移决定相邻帧的时间间隔；窗函数（如汉明窗、汉宁窗）用于抑制帧边缘的频谱泄漏。本文采用</w:t>
+      </w:r>
+      <w:r>
+        <w:rPr>
+          <w:rFonts w:ascii="SimSun" w:cs="SimSun" w:eastAsia="SimSun" w:hAnsi="SimSun"/>
+          <w:b w:val="false"/>
+          <w:bCs w:val="false"/>
+          <w:i/>
+          <w:iCs/>
+          <w:sz w:val="24"/>
+          <w:szCs w:val="24"/>
+        </w:rPr>
+        <w:t xml:space="preserve">N_{FFT}=512</w:t>
+      </w:r>
+      <w:r>
+        <w:rPr>
+          <w:rFonts w:ascii="SimSun" w:cs="SimSun" w:eastAsia="SimSun" w:hAnsi="SimSun"/>
+          <w:b w:val="false"/>
+          <w:bCs w:val="false"/>
+          <w:i w:val="false"/>
+          <w:iCs w:val="false"/>
+          <w:sz w:val="24"/>
+          <w:szCs w:val="24"/>
+        </w:rPr>
+        <w:t xml:space="preserve">、hop_length=128的配置，在16kHz采样率下，频率分辨率为31.25Hz，时间分辨率为8ms，频率维度输出257点（</w:t>
+      </w:r>
+      <w:r>
+        <w:rPr>
+          <w:rFonts w:ascii="SimSun" w:cs="SimSun" w:eastAsia="SimSun" w:hAnsi="SimSun"/>
+          <w:b w:val="false"/>
+          <w:bCs w:val="false"/>
+          <w:i/>
+          <w:iCs/>
+          <w:sz w:val="24"/>
+          <w:szCs w:val="24"/>
+        </w:rPr>
+        <w:t xml:space="preserve">N_{FFT}/2+1</w:t>
+      </w:r>
+      <w:r>
+        <w:rPr>
+          <w:rFonts w:ascii="SimSun" w:cs="SimSun" w:eastAsia="SimSun" w:hAnsi="SimSun"/>
+          <w:b w:val="false"/>
+          <w:bCs w:val="false"/>
+          <w:i w:val="false"/>
+          <w:iCs w:val="false"/>
+          <w:sz w:val="24"/>
+          <w:szCs w:val="24"/>
+        </w:rPr>
+        <w:t xml:space="preserve">，对称部分省略）。</w:t>
       </w:r>
     </w:p>
     <w:p>
@@ -1460,19 +1723,18 @@
     </w:p>
     <w:p>
       <w:pPr>
-        <w:spacing w:after="60" w:before="60" w:line="360"/>
-      </w:pPr>
-      <w:r>
-        <w:rPr>
-          <w:rFonts w:ascii="SimSun" w:cs="SimSun" w:eastAsia="SimSun" w:hAnsi="SimSun"/>
-          <w:b w:val="false"/>
-          <w:bCs w:val="false"/>
-          <w:i w:val="false"/>
-          <w:iCs w:val="false"/>
-          <w:sz w:val="24"/>
-          <w:szCs w:val="24"/>
-        </w:rPr>
-        <w:t xml:space="preserve">$$Mel(f) = 2595 \cdot \log_{10}(1 + f/700)$$</w:t>
+        <w:spacing w:after="80" w:before="80"/>
+        <w:jc w:val="center"/>
+      </w:pPr>
+      <w:r>
+        <w:rPr>
+          <w:rFonts w:ascii="Times New Roman" w:cs="Times New Roman" w:eastAsia="Times New Roman" w:hAnsi="Times New Roman"/>
+          <w:i/>
+          <w:iCs/>
+          <w:sz w:val="22"/>
+          <w:szCs w:val="22"/>
+        </w:rPr>
+        <w:t xml:space="preserve">Mel(f) = 2595 \cdot \log_{10}(1 + f/700)</w:t>
       </w:r>
     </w:p>
     <w:p>
@@ -1511,19 +1773,18 @@
     </w:p>
     <w:p>
       <w:pPr>
-        <w:spacing w:after="60" w:before="60" w:line="360"/>
-      </w:pPr>
-      <w:r>
-        <w:rPr>
-          <w:rFonts w:ascii="SimSun" w:cs="SimSun" w:eastAsia="SimSun" w:hAnsi="SimSun"/>
-          <w:b w:val="false"/>
-          <w:bCs w:val="false"/>
-          <w:i w:val="false"/>
-          <w:iCs w:val="false"/>
-          <w:sz w:val="24"/>
-          <w:szCs w:val="24"/>
-        </w:rPr>
-        <w:t xml:space="preserve">$$Bark(f) = 6 \cdot \text{arcsinh}(f/600)$$</w:t>
+        <w:spacing w:after="80" w:before="80"/>
+        <w:jc w:val="center"/>
+      </w:pPr>
+      <w:r>
+        <w:rPr>
+          <w:rFonts w:ascii="Times New Roman" w:cs="Times New Roman" w:eastAsia="Times New Roman" w:hAnsi="Times New Roman"/>
+          <w:i/>
+          <w:iCs/>
+          <w:sz w:val="22"/>
+          <w:szCs w:val="22"/>
+        </w:rPr>
+        <w:t xml:space="preserve">Bark(f) = 6 \cdot \text{arcsinh}(f/600)</w:t>
       </w:r>
     </w:p>
     <w:p>
@@ -1595,36 +1856,155 @@
     </w:p>
     <w:p>
       <w:pPr>
-        <w:spacing w:after="60" w:before="60" w:line="360"/>
-      </w:pPr>
-      <w:r>
-        <w:rPr>
-          <w:rFonts w:ascii="SimSun" w:cs="SimSun" w:eastAsia="SimSun" w:hAnsi="SimSun"/>
-          <w:b w:val="false"/>
-          <w:bCs w:val="false"/>
-          <w:i w:val="false"/>
-          <w:iCs w:val="false"/>
-          <w:sz w:val="24"/>
-          <w:szCs w:val="24"/>
-        </w:rPr>
-        <w:t xml:space="preserve">$$y = \sigma(Wx + b)$$</w:t>
-      </w:r>
-    </w:p>
-    <w:p>
-      <w:pPr>
-        <w:spacing w:after="60" w:before="60" w:line="360"/>
-      </w:pPr>
-      <w:r>
-        <w:rPr>
-          <w:rFonts w:ascii="SimSun" w:cs="SimSun" w:eastAsia="SimSun" w:hAnsi="SimSun"/>
-          <w:b w:val="false"/>
-          <w:bCs w:val="false"/>
-          <w:i w:val="false"/>
-          <w:iCs w:val="false"/>
-          <w:sz w:val="24"/>
-          <w:szCs w:val="24"/>
-        </w:rPr>
-        <w:t xml:space="preserve">其中$x$为输入向量，$W$为权重矩阵，$b$为偏置向量，$\sigma$为非线性激活函数（如ReLU、Sigmoid），$y$为输出。</w:t>
+        <w:spacing w:after="80" w:before="80"/>
+        <w:jc w:val="center"/>
+      </w:pPr>
+      <w:r>
+        <w:rPr>
+          <w:rFonts w:ascii="Times New Roman" w:cs="Times New Roman" w:eastAsia="Times New Roman" w:hAnsi="Times New Roman"/>
+          <w:i/>
+          <w:iCs/>
+          <w:sz w:val="22"/>
+          <w:szCs w:val="22"/>
+        </w:rPr>
+        <w:t xml:space="preserve">y = \sigma(Wx + b)</w:t>
+      </w:r>
+    </w:p>
+    <w:p>
+      <w:pPr>
+        <w:spacing w:after="60" w:before="60" w:line="360"/>
+      </w:pPr>
+      <w:r>
+        <w:rPr>
+          <w:rFonts w:ascii="SimSun" w:cs="SimSun" w:eastAsia="SimSun" w:hAnsi="SimSun"/>
+          <w:b w:val="false"/>
+          <w:bCs w:val="false"/>
+          <w:i w:val="false"/>
+          <w:iCs w:val="false"/>
+          <w:sz w:val="24"/>
+          <w:szCs w:val="24"/>
+        </w:rPr>
+        <w:t xml:space="preserve">其中</w:t>
+      </w:r>
+      <w:r>
+        <w:rPr>
+          <w:rFonts w:ascii="SimSun" w:cs="SimSun" w:eastAsia="SimSun" w:hAnsi="SimSun"/>
+          <w:b w:val="false"/>
+          <w:bCs w:val="false"/>
+          <w:i/>
+          <w:iCs/>
+          <w:sz w:val="24"/>
+          <w:szCs w:val="24"/>
+        </w:rPr>
+        <w:t xml:space="preserve">x</w:t>
+      </w:r>
+      <w:r>
+        <w:rPr>
+          <w:rFonts w:ascii="SimSun" w:cs="SimSun" w:eastAsia="SimSun" w:hAnsi="SimSun"/>
+          <w:b w:val="false"/>
+          <w:bCs w:val="false"/>
+          <w:i w:val="false"/>
+          <w:iCs w:val="false"/>
+          <w:sz w:val="24"/>
+          <w:szCs w:val="24"/>
+        </w:rPr>
+        <w:t xml:space="preserve">为输入向量，</w:t>
+      </w:r>
+      <w:r>
+        <w:rPr>
+          <w:rFonts w:ascii="SimSun" w:cs="SimSun" w:eastAsia="SimSun" w:hAnsi="SimSun"/>
+          <w:b w:val="false"/>
+          <w:bCs w:val="false"/>
+          <w:i/>
+          <w:iCs/>
+          <w:sz w:val="24"/>
+          <w:szCs w:val="24"/>
+        </w:rPr>
+        <w:t xml:space="preserve">W</w:t>
+      </w:r>
+      <w:r>
+        <w:rPr>
+          <w:rFonts w:ascii="SimSun" w:cs="SimSun" w:eastAsia="SimSun" w:hAnsi="SimSun"/>
+          <w:b w:val="false"/>
+          <w:bCs w:val="false"/>
+          <w:i w:val="false"/>
+          <w:iCs w:val="false"/>
+          <w:sz w:val="24"/>
+          <w:szCs w:val="24"/>
+        </w:rPr>
+        <w:t xml:space="preserve">为权重矩阵，</w:t>
+      </w:r>
+      <w:r>
+        <w:rPr>
+          <w:rFonts w:ascii="SimSun" w:cs="SimSun" w:eastAsia="SimSun" w:hAnsi="SimSun"/>
+          <w:b w:val="false"/>
+          <w:bCs w:val="false"/>
+          <w:i/>
+          <w:iCs/>
+          <w:sz w:val="24"/>
+          <w:szCs w:val="24"/>
+        </w:rPr>
+        <w:t xml:space="preserve">b</w:t>
+      </w:r>
+      <w:r>
+        <w:rPr>
+          <w:rFonts w:ascii="SimSun" w:cs="SimSun" w:eastAsia="SimSun" w:hAnsi="SimSun"/>
+          <w:b w:val="false"/>
+          <w:bCs w:val="false"/>
+          <w:i w:val="false"/>
+          <w:iCs w:val="false"/>
+          <w:sz w:val="24"/>
+          <w:szCs w:val="24"/>
+        </w:rPr>
+        <w:t xml:space="preserve">为偏置向量，</w:t>
+      </w:r>
+      <w:r>
+        <w:rPr>
+          <w:rFonts w:ascii="SimSun" w:cs="SimSun" w:eastAsia="SimSun" w:hAnsi="SimSun"/>
+          <w:b w:val="false"/>
+          <w:bCs w:val="false"/>
+          <w:i/>
+          <w:iCs/>
+          <w:sz w:val="24"/>
+          <w:szCs w:val="24"/>
+        </w:rPr>
+        <w:t xml:space="preserve">\sigma</w:t>
+      </w:r>
+      <w:r>
+        <w:rPr>
+          <w:rFonts w:ascii="SimSun" w:cs="SimSun" w:eastAsia="SimSun" w:hAnsi="SimSun"/>
+          <w:b w:val="false"/>
+          <w:bCs w:val="false"/>
+          <w:i w:val="false"/>
+          <w:iCs w:val="false"/>
+          <w:sz w:val="24"/>
+          <w:szCs w:val="24"/>
+        </w:rPr>
+        <w:t xml:space="preserve">为非线性激活函数（如ReLU、Sigmoid），</w:t>
+      </w:r>
+      <w:r>
+        <w:rPr>
+          <w:rFonts w:ascii="SimSun" w:cs="SimSun" w:eastAsia="SimSun" w:hAnsi="SimSun"/>
+          <w:b w:val="false"/>
+          <w:bCs w:val="false"/>
+          <w:i/>
+          <w:iCs/>
+          <w:sz w:val="24"/>
+          <w:szCs w:val="24"/>
+        </w:rPr>
+        <w:t xml:space="preserve">y</w:t>
+      </w:r>
+      <w:r>
+        <w:rPr>
+          <w:rFonts w:ascii="SimSun" w:cs="SimSun" w:eastAsia="SimSun" w:hAnsi="SimSun"/>
+          <w:b w:val="false"/>
+          <w:bCs w:val="false"/>
+          <w:i w:val="false"/>
+          <w:iCs w:val="false"/>
+          <w:sz w:val="24"/>
+          <w:szCs w:val="24"/>
+        </w:rPr>
+        <w:t xml:space="preserve">为输出。</w:t>
       </w:r>
     </w:p>
     <w:p>
@@ -1680,36 +2060,131 @@
     </w:p>
     <w:p>
       <w:pPr>
-        <w:spacing w:after="60" w:before="60" w:line="360"/>
-      </w:pPr>
-      <w:r>
-        <w:rPr>
-          <w:rFonts w:ascii="SimSun" w:cs="SimSun" w:eastAsia="SimSun" w:hAnsi="SimSun"/>
-          <w:b w:val="false"/>
-          <w:bCs w:val="false"/>
-          <w:i w:val="false"/>
-          <w:iCs w:val="false"/>
-          <w:sz w:val="24"/>
-          <w:szCs w:val="24"/>
-        </w:rPr>
-        <w:t xml:space="preserve">$$\theta_{t+1} = \theta_t - \eta \cdot \nabla_\theta L(\theta_t)$$</w:t>
-      </w:r>
-    </w:p>
-    <w:p>
-      <w:pPr>
-        <w:spacing w:after="60" w:before="60" w:line="360"/>
-      </w:pPr>
-      <w:r>
-        <w:rPr>
-          <w:rFonts w:ascii="SimSun" w:cs="SimSun" w:eastAsia="SimSun" w:hAnsi="SimSun"/>
-          <w:b w:val="false"/>
-          <w:bCs w:val="false"/>
-          <w:i w:val="false"/>
-          <w:iCs w:val="false"/>
-          <w:sz w:val="24"/>
-          <w:szCs w:val="24"/>
-        </w:rPr>
-        <w:t xml:space="preserve">其中$\theta_t$为当前参数，$\eta$为学习率，$L$为损失函数，$\nabla_\theta L(\theta_t)$为梯度。每一轮完整的前向-反向传播称为一次迭代（Iteration）。当模型处理完所有训练数据一次，即完成一个Epoch。</w:t>
+        <w:spacing w:after="80" w:before="80"/>
+        <w:jc w:val="center"/>
+      </w:pPr>
+      <w:r>
+        <w:rPr>
+          <w:rFonts w:ascii="Times New Roman" w:cs="Times New Roman" w:eastAsia="Times New Roman" w:hAnsi="Times New Roman"/>
+          <w:i/>
+          <w:iCs/>
+          <w:sz w:val="22"/>
+          <w:szCs w:val="22"/>
+        </w:rPr>
+        <w:t xml:space="preserve">\theta_{t+1} = \theta_t - \eta \cdot \nabla_\theta L(\theta_t)</w:t>
+      </w:r>
+    </w:p>
+    <w:p>
+      <w:pPr>
+        <w:spacing w:after="60" w:before="60" w:line="360"/>
+      </w:pPr>
+      <w:r>
+        <w:rPr>
+          <w:rFonts w:ascii="SimSun" w:cs="SimSun" w:eastAsia="SimSun" w:hAnsi="SimSun"/>
+          <w:b w:val="false"/>
+          <w:bCs w:val="false"/>
+          <w:i w:val="false"/>
+          <w:iCs w:val="false"/>
+          <w:sz w:val="24"/>
+          <w:szCs w:val="24"/>
+        </w:rPr>
+        <w:t xml:space="preserve">其中</w:t>
+      </w:r>
+      <w:r>
+        <w:rPr>
+          <w:rFonts w:ascii="SimSun" w:cs="SimSun" w:eastAsia="SimSun" w:hAnsi="SimSun"/>
+          <w:b w:val="false"/>
+          <w:bCs w:val="false"/>
+          <w:i/>
+          <w:iCs/>
+          <w:sz w:val="24"/>
+          <w:szCs w:val="24"/>
+        </w:rPr>
+        <w:t xml:space="preserve">\theta_t</w:t>
+      </w:r>
+      <w:r>
+        <w:rPr>
+          <w:rFonts w:ascii="SimSun" w:cs="SimSun" w:eastAsia="SimSun" w:hAnsi="SimSun"/>
+          <w:b w:val="false"/>
+          <w:bCs w:val="false"/>
+          <w:i w:val="false"/>
+          <w:iCs w:val="false"/>
+          <w:sz w:val="24"/>
+          <w:szCs w:val="24"/>
+        </w:rPr>
+        <w:t xml:space="preserve">为当前参数，</w:t>
+      </w:r>
+      <w:r>
+        <w:rPr>
+          <w:rFonts w:ascii="SimSun" w:cs="SimSun" w:eastAsia="SimSun" w:hAnsi="SimSun"/>
+          <w:b w:val="false"/>
+          <w:bCs w:val="false"/>
+          <w:i/>
+          <w:iCs/>
+          <w:sz w:val="24"/>
+          <w:szCs w:val="24"/>
+        </w:rPr>
+        <w:t xml:space="preserve">\eta</w:t>
+      </w:r>
+      <w:r>
+        <w:rPr>
+          <w:rFonts w:ascii="SimSun" w:cs="SimSun" w:eastAsia="SimSun" w:hAnsi="SimSun"/>
+          <w:b w:val="false"/>
+          <w:bCs w:val="false"/>
+          <w:i w:val="false"/>
+          <w:iCs w:val="false"/>
+          <w:sz w:val="24"/>
+          <w:szCs w:val="24"/>
+        </w:rPr>
+        <w:t xml:space="preserve">为学习率，</w:t>
+      </w:r>
+      <w:r>
+        <w:rPr>
+          <w:rFonts w:ascii="SimSun" w:cs="SimSun" w:eastAsia="SimSun" w:hAnsi="SimSun"/>
+          <w:b w:val="false"/>
+          <w:bCs w:val="false"/>
+          <w:i/>
+          <w:iCs/>
+          <w:sz w:val="24"/>
+          <w:szCs w:val="24"/>
+        </w:rPr>
+        <w:t xml:space="preserve">L</w:t>
+      </w:r>
+      <w:r>
+        <w:rPr>
+          <w:rFonts w:ascii="SimSun" w:cs="SimSun" w:eastAsia="SimSun" w:hAnsi="SimSun"/>
+          <w:b w:val="false"/>
+          <w:bCs w:val="false"/>
+          <w:i w:val="false"/>
+          <w:iCs w:val="false"/>
+          <w:sz w:val="24"/>
+          <w:szCs w:val="24"/>
+        </w:rPr>
+        <w:t xml:space="preserve">为损失函数，</w:t>
+      </w:r>
+      <w:r>
+        <w:rPr>
+          <w:rFonts w:ascii="SimSun" w:cs="SimSun" w:eastAsia="SimSun" w:hAnsi="SimSun"/>
+          <w:b w:val="false"/>
+          <w:bCs w:val="false"/>
+          <w:i/>
+          <w:iCs/>
+          <w:sz w:val="24"/>
+          <w:szCs w:val="24"/>
+        </w:rPr>
+        <w:t xml:space="preserve">\nabla_\theta L(\theta_t)</w:t>
+      </w:r>
+      <w:r>
+        <w:rPr>
+          <w:rFonts w:ascii="SimSun" w:cs="SimSun" w:eastAsia="SimSun" w:hAnsi="SimSun"/>
+          <w:b w:val="false"/>
+          <w:bCs w:val="false"/>
+          <w:i w:val="false"/>
+          <w:iCs w:val="false"/>
+          <w:sz w:val="24"/>
+          <w:szCs w:val="24"/>
+        </w:rPr>
+        <w:t xml:space="preserve">为梯度。每一轮完整的前向-反向传播称为一次迭代（Iteration）。当模型处理完所有训练数据一次，即完成一个Epoch。</w:t>
       </w:r>
     </w:p>
     <w:p>
@@ -2145,24 +2620,167 @@
           <w:sz w:val="24"/>
           <w:szCs w:val="24"/>
         </w:rPr>
-        <w:t xml:space="preserve">自注意力（Self-Attention）机制是Transformer的核心创新。对于输入序列中的每个位置（每个时间帧），自注意力计算其与序列中所有位置（包括自身）的"相关性"分数，并根据分数对所有位置的信息进行加权聚合。具体而言，对于输入序列$X \in \mathbb{R}^{T \times d}$（$T$为帧数，$d$为特征维度），通过三个可学习的线性投影矩阵生成Query（查询）矩阵$Q$、Key（键）矩阵$K$和Value（值）矩阵$V$：</w:t>
-      </w:r>
-    </w:p>
-    <w:p>
-      <w:pPr>
-        <w:spacing w:after="60" w:before="60" w:line="360"/>
-      </w:pPr>
-      <w:r>
-        <w:rPr>
-          <w:rFonts w:ascii="SimSun" w:cs="SimSun" w:eastAsia="SimSun" w:hAnsi="SimSun"/>
-          <w:b w:val="false"/>
-          <w:bCs w:val="false"/>
-          <w:i w:val="false"/>
-          <w:iCs w:val="false"/>
-          <w:sz w:val="24"/>
-          <w:szCs w:val="24"/>
-        </w:rPr>
-        <w:t xml:space="preserve">$$Q = XW_Q, \quad K = XW_K, \quad V = XW_V$$</w:t>
+        <w:t xml:space="preserve">自注意力（Self-Attention）机制是Transformer的核心创新。对于输入序列中的每个位置（每个时间帧），自注意力计算其与序列中所有位置（包括自身）的"相关性"分数，并根据分数对所有位置的信息进行加权聚合。具体而言，对于输入序列</w:t>
+      </w:r>
+      <w:r>
+        <w:rPr>
+          <w:rFonts w:ascii="SimSun" w:cs="SimSun" w:eastAsia="SimSun" w:hAnsi="SimSun"/>
+          <w:b w:val="false"/>
+          <w:bCs w:val="false"/>
+          <w:i/>
+          <w:iCs/>
+          <w:sz w:val="24"/>
+          <w:szCs w:val="24"/>
+        </w:rPr>
+        <w:t xml:space="preserve">X \in \mathbb{R}^{T \times d}</w:t>
+      </w:r>
+      <w:r>
+        <w:rPr>
+          <w:rFonts w:ascii="SimSun" w:cs="SimSun" w:eastAsia="SimSun" w:hAnsi="SimSun"/>
+          <w:b w:val="false"/>
+          <w:bCs w:val="false"/>
+          <w:i w:val="false"/>
+          <w:iCs w:val="false"/>
+          <w:sz w:val="24"/>
+          <w:szCs w:val="24"/>
+        </w:rPr>
+        <w:t xml:space="preserve">（</w:t>
+      </w:r>
+      <w:r>
+        <w:rPr>
+          <w:rFonts w:ascii="SimSun" w:cs="SimSun" w:eastAsia="SimSun" w:hAnsi="SimSun"/>
+          <w:b w:val="false"/>
+          <w:bCs w:val="false"/>
+          <w:i/>
+          <w:iCs/>
+          <w:sz w:val="24"/>
+          <w:szCs w:val="24"/>
+        </w:rPr>
+        <w:t xml:space="preserve">T</w:t>
+      </w:r>
+      <w:r>
+        <w:rPr>
+          <w:rFonts w:ascii="SimSun" w:cs="SimSun" w:eastAsia="SimSun" w:hAnsi="SimSun"/>
+          <w:b w:val="false"/>
+          <w:bCs w:val="false"/>
+          <w:i w:val="false"/>
+          <w:iCs w:val="false"/>
+          <w:sz w:val="24"/>
+          <w:szCs w:val="24"/>
+        </w:rPr>
+        <w:t xml:space="preserve">为帧数，</w:t>
+      </w:r>
+      <w:r>
+        <w:rPr>
+          <w:rFonts w:ascii="SimSun" w:cs="SimSun" w:eastAsia="SimSun" w:hAnsi="SimSun"/>
+          <w:b w:val="false"/>
+          <w:bCs w:val="false"/>
+          <w:i/>
+          <w:iCs/>
+          <w:sz w:val="24"/>
+          <w:szCs w:val="24"/>
+        </w:rPr>
+        <w:t xml:space="preserve">d</w:t>
+      </w:r>
+      <w:r>
+        <w:rPr>
+          <w:rFonts w:ascii="SimSun" w:cs="SimSun" w:eastAsia="SimSun" w:hAnsi="SimSun"/>
+          <w:b w:val="false"/>
+          <w:bCs w:val="false"/>
+          <w:i w:val="false"/>
+          <w:iCs w:val="false"/>
+          <w:sz w:val="24"/>
+          <w:szCs w:val="24"/>
+        </w:rPr>
+        <w:t xml:space="preserve">为特征维度），通过三个可学习的线性投影矩阵生成Query（查询）矩阵</w:t>
+      </w:r>
+      <w:r>
+        <w:rPr>
+          <w:rFonts w:ascii="SimSun" w:cs="SimSun" w:eastAsia="SimSun" w:hAnsi="SimSun"/>
+          <w:b w:val="false"/>
+          <w:bCs w:val="false"/>
+          <w:i/>
+          <w:iCs/>
+          <w:sz w:val="24"/>
+          <w:szCs w:val="24"/>
+        </w:rPr>
+        <w:t xml:space="preserve">Q</w:t>
+      </w:r>
+      <w:r>
+        <w:rPr>
+          <w:rFonts w:ascii="SimSun" w:cs="SimSun" w:eastAsia="SimSun" w:hAnsi="SimSun"/>
+          <w:b w:val="false"/>
+          <w:bCs w:val="false"/>
+          <w:i w:val="false"/>
+          <w:iCs w:val="false"/>
+          <w:sz w:val="24"/>
+          <w:szCs w:val="24"/>
+        </w:rPr>
+        <w:t xml:space="preserve">、Key（键）矩阵</w:t>
+      </w:r>
+      <w:r>
+        <w:rPr>
+          <w:rFonts w:ascii="SimSun" w:cs="SimSun" w:eastAsia="SimSun" w:hAnsi="SimSun"/>
+          <w:b w:val="false"/>
+          <w:bCs w:val="false"/>
+          <w:i/>
+          <w:iCs/>
+          <w:sz w:val="24"/>
+          <w:szCs w:val="24"/>
+        </w:rPr>
+        <w:t xml:space="preserve">K</w:t>
+      </w:r>
+      <w:r>
+        <w:rPr>
+          <w:rFonts w:ascii="SimSun" w:cs="SimSun" w:eastAsia="SimSun" w:hAnsi="SimSun"/>
+          <w:b w:val="false"/>
+          <w:bCs w:val="false"/>
+          <w:i w:val="false"/>
+          <w:iCs w:val="false"/>
+          <w:sz w:val="24"/>
+          <w:szCs w:val="24"/>
+        </w:rPr>
+        <w:t xml:space="preserve">和Value（值）矩阵</w:t>
+      </w:r>
+      <w:r>
+        <w:rPr>
+          <w:rFonts w:ascii="SimSun" w:cs="SimSun" w:eastAsia="SimSun" w:hAnsi="SimSun"/>
+          <w:b w:val="false"/>
+          <w:bCs w:val="false"/>
+          <w:i/>
+          <w:iCs/>
+          <w:sz w:val="24"/>
+          <w:szCs w:val="24"/>
+        </w:rPr>
+        <w:t xml:space="preserve">V</w:t>
+      </w:r>
+      <w:r>
+        <w:rPr>
+          <w:rFonts w:ascii="SimSun" w:cs="SimSun" w:eastAsia="SimSun" w:hAnsi="SimSun"/>
+          <w:b w:val="false"/>
+          <w:bCs w:val="false"/>
+          <w:i w:val="false"/>
+          <w:iCs w:val="false"/>
+          <w:sz w:val="24"/>
+          <w:szCs w:val="24"/>
+        </w:rPr>
+        <w:t xml:space="preserve">：</w:t>
+      </w:r>
+    </w:p>
+    <w:p>
+      <w:pPr>
+        <w:spacing w:after="80" w:before="80"/>
+        <w:jc w:val="center"/>
+      </w:pPr>
+      <w:r>
+        <w:rPr>
+          <w:rFonts w:ascii="Times New Roman" w:cs="Times New Roman" w:eastAsia="Times New Roman" w:hAnsi="Times New Roman"/>
+          <w:i/>
+          <w:iCs/>
+          <w:sz w:val="22"/>
+          <w:szCs w:val="22"/>
+        </w:rPr>
+        <w:t xml:space="preserve">Q = XW_Q, \quad K = XW_K, \quad V = XW_V</w:t>
       </w:r>
     </w:p>
     <w:p>
@@ -2184,36 +2802,107 @@
     </w:p>
     <w:p>
       <w:pPr>
-        <w:spacing w:after="60" w:before="60" w:line="360"/>
-      </w:pPr>
-      <w:r>
-        <w:rPr>
-          <w:rFonts w:ascii="SimSun" w:cs="SimSun" w:eastAsia="SimSun" w:hAnsi="SimSun"/>
-          <w:b w:val="false"/>
-          <w:bCs w:val="false"/>
-          <w:i w:val="false"/>
-          <w:iCs w:val="false"/>
-          <w:sz w:val="24"/>
-          <w:szCs w:val="24"/>
-        </w:rPr>
-        <w:t xml:space="preserve">$$\text{Attention}(Q, K, V) = \text{softmax}\left(\frac{QK^T}{\sqrt{d_k}}\right)V$$</w:t>
-      </w:r>
-    </w:p>
-    <w:p>
-      <w:pPr>
-        <w:spacing w:after="60" w:before="60" w:line="360"/>
-      </w:pPr>
-      <w:r>
-        <w:rPr>
-          <w:rFonts w:ascii="SimSun" w:cs="SimSun" w:eastAsia="SimSun" w:hAnsi="SimSun"/>
-          <w:b w:val="false"/>
-          <w:bCs w:val="false"/>
-          <w:i w:val="false"/>
-          <w:iCs w:val="false"/>
-          <w:sz w:val="24"/>
-          <w:szCs w:val="24"/>
-        </w:rPr>
-        <w:t xml:space="preserve">其中$d_k$为$K$向量的维度，除以$\sqrt{d_k}$是为了防止点积过大导致Softmax梯度消失。</w:t>
+        <w:spacing w:after="80" w:before="80"/>
+        <w:jc w:val="center"/>
+      </w:pPr>
+      <w:r>
+        <w:rPr>
+          <w:rFonts w:ascii="Times New Roman" w:cs="Times New Roman" w:eastAsia="Times New Roman" w:hAnsi="Times New Roman"/>
+          <w:i/>
+          <w:iCs/>
+          <w:sz w:val="22"/>
+          <w:szCs w:val="22"/>
+        </w:rPr>
+        <w:t xml:space="preserve">\text{Attention}(Q, K, V) = \text{softmax}\left(\frac{QK^T}{\sqrt{d_k}}\right)V</w:t>
+      </w:r>
+    </w:p>
+    <w:p>
+      <w:pPr>
+        <w:spacing w:after="60" w:before="60" w:line="360"/>
+      </w:pPr>
+      <w:r>
+        <w:rPr>
+          <w:rFonts w:ascii="SimSun" w:cs="SimSun" w:eastAsia="SimSun" w:hAnsi="SimSun"/>
+          <w:b w:val="false"/>
+          <w:bCs w:val="false"/>
+          <w:i w:val="false"/>
+          <w:iCs w:val="false"/>
+          <w:sz w:val="24"/>
+          <w:szCs w:val="24"/>
+        </w:rPr>
+        <w:t xml:space="preserve">其中</w:t>
+      </w:r>
+      <w:r>
+        <w:rPr>
+          <w:rFonts w:ascii="SimSun" w:cs="SimSun" w:eastAsia="SimSun" w:hAnsi="SimSun"/>
+          <w:b w:val="false"/>
+          <w:bCs w:val="false"/>
+          <w:i/>
+          <w:iCs/>
+          <w:sz w:val="24"/>
+          <w:szCs w:val="24"/>
+        </w:rPr>
+        <w:t xml:space="preserve">d_k</w:t>
+      </w:r>
+      <w:r>
+        <w:rPr>
+          <w:rFonts w:ascii="SimSun" w:cs="SimSun" w:eastAsia="SimSun" w:hAnsi="SimSun"/>
+          <w:b w:val="false"/>
+          <w:bCs w:val="false"/>
+          <w:i w:val="false"/>
+          <w:iCs w:val="false"/>
+          <w:sz w:val="24"/>
+          <w:szCs w:val="24"/>
+        </w:rPr>
+        <w:t xml:space="preserve">为</w:t>
+      </w:r>
+      <w:r>
+        <w:rPr>
+          <w:rFonts w:ascii="SimSun" w:cs="SimSun" w:eastAsia="SimSun" w:hAnsi="SimSun"/>
+          <w:b w:val="false"/>
+          <w:bCs w:val="false"/>
+          <w:i/>
+          <w:iCs/>
+          <w:sz w:val="24"/>
+          <w:szCs w:val="24"/>
+        </w:rPr>
+        <w:t xml:space="preserve">K</w:t>
+      </w:r>
+      <w:r>
+        <w:rPr>
+          <w:rFonts w:ascii="SimSun" w:cs="SimSun" w:eastAsia="SimSun" w:hAnsi="SimSun"/>
+          <w:b w:val="false"/>
+          <w:bCs w:val="false"/>
+          <w:i w:val="false"/>
+          <w:iCs w:val="false"/>
+          <w:sz w:val="24"/>
+          <w:szCs w:val="24"/>
+        </w:rPr>
+        <w:t xml:space="preserve">向量的维度，除以</w:t>
+      </w:r>
+      <w:r>
+        <w:rPr>
+          <w:rFonts w:ascii="SimSun" w:cs="SimSun" w:eastAsia="SimSun" w:hAnsi="SimSun"/>
+          <w:b w:val="false"/>
+          <w:bCs w:val="false"/>
+          <w:i/>
+          <w:iCs/>
+          <w:sz w:val="24"/>
+          <w:szCs w:val="24"/>
+        </w:rPr>
+        <w:t xml:space="preserve">\sqrt{d_k}</w:t>
+      </w:r>
+      <w:r>
+        <w:rPr>
+          <w:rFonts w:ascii="SimSun" w:cs="SimSun" w:eastAsia="SimSun" w:hAnsi="SimSun"/>
+          <w:b w:val="false"/>
+          <w:bCs w:val="false"/>
+          <w:i w:val="false"/>
+          <w:iCs w:val="false"/>
+          <w:sz w:val="24"/>
+          <w:szCs w:val="24"/>
+        </w:rPr>
+        <w:t xml:space="preserve">是为了防止点积过大导致Softmax梯度消失。</w:t>
       </w:r>
     </w:p>
     <w:p>
@@ -2264,58 +2953,152 @@
           <w:sz w:val="24"/>
           <w:szCs w:val="24"/>
         </w:rPr>
-        <w:t xml:space="preserve">单头注意力（Single-Head）能从一种子空间中提取帧间关联模式。多头注意力（Multi-Head Attention）思想是将$Q$、$K$、$V$在维度上切分为多个低维度子空间，对不同子空间分别计算自注意力，最后将多路径的Attention输出拼接后通过线性层投影回原始维度：</w:t>
-      </w:r>
-    </w:p>
-    <w:p>
-      <w:pPr>
-        <w:spacing w:after="60" w:before="60" w:line="360"/>
-      </w:pPr>
-      <w:r>
-        <w:rPr>
-          <w:rFonts w:ascii="SimSun" w:cs="SimSun" w:eastAsia="SimSun" w:hAnsi="SimSun"/>
-          <w:b w:val="false"/>
-          <w:bCs w:val="false"/>
-          <w:i w:val="false"/>
-          <w:iCs w:val="false"/>
-          <w:sz w:val="24"/>
-          <w:szCs w:val="24"/>
-        </w:rPr>
-        <w:t xml:space="preserve">$$\text{MultiHead}(Q, K, V) = \text{Concat}(\text{head}_1, ..., \text{head}_h)W_O$$</w:t>
-      </w:r>
-    </w:p>
-    <w:p>
-      <w:pPr>
-        <w:spacing w:after="60" w:before="60" w:line="360"/>
-      </w:pPr>
-      <w:r>
-        <w:rPr>
-          <w:rFonts w:ascii="SimSun" w:cs="SimSun" w:eastAsia="SimSun" w:hAnsi="SimSun"/>
-          <w:b w:val="false"/>
-          <w:bCs w:val="false"/>
-          <w:i w:val="false"/>
-          <w:iCs w:val="false"/>
-          <w:sz w:val="24"/>
-          <w:szCs w:val="24"/>
-        </w:rPr>
-        <w:t xml:space="preserve">$$\text{head}_i = \text{Attention}(QW_Q^i, KW_K^i, VW_V^i)$$</w:t>
-      </w:r>
-    </w:p>
-    <w:p>
-      <w:pPr>
-        <w:spacing w:after="60" w:before="60" w:line="360"/>
-      </w:pPr>
-      <w:r>
-        <w:rPr>
-          <w:rFonts w:ascii="SimSun" w:cs="SimSun" w:eastAsia="SimSun" w:hAnsi="SimSun"/>
-          <w:b w:val="false"/>
-          <w:bCs w:val="false"/>
-          <w:i w:val="false"/>
-          <w:iCs w:val="false"/>
-          <w:sz w:val="24"/>
-          <w:szCs w:val="24"/>
-        </w:rPr>
-        <w:t xml:space="preserve">多头的优势在于：模型可以从多个表征子空间中同时学习不同类型的帧间关联模式（如局部平滑、谐波追踪、能量包络、语音-噪声区分等），信息获取更全面。本文使用$h=4$个头。</w:t>
+        <w:t xml:space="preserve">单头注意力（Single-Head）能从一种子空间中提取帧间关联模式。多头注意力（Multi-Head Attention）思想是将</w:t>
+      </w:r>
+      <w:r>
+        <w:rPr>
+          <w:rFonts w:ascii="SimSun" w:cs="SimSun" w:eastAsia="SimSun" w:hAnsi="SimSun"/>
+          <w:b w:val="false"/>
+          <w:bCs w:val="false"/>
+          <w:i/>
+          <w:iCs/>
+          <w:sz w:val="24"/>
+          <w:szCs w:val="24"/>
+        </w:rPr>
+        <w:t xml:space="preserve">Q</w:t>
+      </w:r>
+      <w:r>
+        <w:rPr>
+          <w:rFonts w:ascii="SimSun" w:cs="SimSun" w:eastAsia="SimSun" w:hAnsi="SimSun"/>
+          <w:b w:val="false"/>
+          <w:bCs w:val="false"/>
+          <w:i w:val="false"/>
+          <w:iCs w:val="false"/>
+          <w:sz w:val="24"/>
+          <w:szCs w:val="24"/>
+        </w:rPr>
+        <w:t xml:space="preserve">、</w:t>
+      </w:r>
+      <w:r>
+        <w:rPr>
+          <w:rFonts w:ascii="SimSun" w:cs="SimSun" w:eastAsia="SimSun" w:hAnsi="SimSun"/>
+          <w:b w:val="false"/>
+          <w:bCs w:val="false"/>
+          <w:i/>
+          <w:iCs/>
+          <w:sz w:val="24"/>
+          <w:szCs w:val="24"/>
+        </w:rPr>
+        <w:t xml:space="preserve">K</w:t>
+      </w:r>
+      <w:r>
+        <w:rPr>
+          <w:rFonts w:ascii="SimSun" w:cs="SimSun" w:eastAsia="SimSun" w:hAnsi="SimSun"/>
+          <w:b w:val="false"/>
+          <w:bCs w:val="false"/>
+          <w:i w:val="false"/>
+          <w:iCs w:val="false"/>
+          <w:sz w:val="24"/>
+          <w:szCs w:val="24"/>
+        </w:rPr>
+        <w:t xml:space="preserve">、</w:t>
+      </w:r>
+      <w:r>
+        <w:rPr>
+          <w:rFonts w:ascii="SimSun" w:cs="SimSun" w:eastAsia="SimSun" w:hAnsi="SimSun"/>
+          <w:b w:val="false"/>
+          <w:bCs w:val="false"/>
+          <w:i/>
+          <w:iCs/>
+          <w:sz w:val="24"/>
+          <w:szCs w:val="24"/>
+        </w:rPr>
+        <w:t xml:space="preserve">V</w:t>
+      </w:r>
+      <w:r>
+        <w:rPr>
+          <w:rFonts w:ascii="SimSun" w:cs="SimSun" w:eastAsia="SimSun" w:hAnsi="SimSun"/>
+          <w:b w:val="false"/>
+          <w:bCs w:val="false"/>
+          <w:i w:val="false"/>
+          <w:iCs w:val="false"/>
+          <w:sz w:val="24"/>
+          <w:szCs w:val="24"/>
+        </w:rPr>
+        <w:t xml:space="preserve">在维度上切分为多个低维度子空间，对不同子空间分别计算自注意力，最后将多路径的Attention输出拼接后通过线性层投影回原始维度：</w:t>
+      </w:r>
+    </w:p>
+    <w:p>
+      <w:pPr>
+        <w:spacing w:after="80" w:before="80"/>
+        <w:jc w:val="center"/>
+      </w:pPr>
+      <w:r>
+        <w:rPr>
+          <w:rFonts w:ascii="Times New Roman" w:cs="Times New Roman" w:eastAsia="Times New Roman" w:hAnsi="Times New Roman"/>
+          <w:i/>
+          <w:iCs/>
+          <w:sz w:val="22"/>
+          <w:szCs w:val="22"/>
+        </w:rPr>
+        <w:t xml:space="preserve">\text{MultiHead}(Q, K, V) = \text{Concat}(\text{head}_1, ..., \text{head}_h)W_O</w:t>
+      </w:r>
+    </w:p>
+    <w:p>
+      <w:pPr>
+        <w:spacing w:after="80" w:before="80"/>
+        <w:jc w:val="center"/>
+      </w:pPr>
+      <w:r>
+        <w:rPr>
+          <w:rFonts w:ascii="Times New Roman" w:cs="Times New Roman" w:eastAsia="Times New Roman" w:hAnsi="Times New Roman"/>
+          <w:i/>
+          <w:iCs/>
+          <w:sz w:val="22"/>
+          <w:szCs w:val="22"/>
+        </w:rPr>
+        <w:t xml:space="preserve">\text{head}_i = \text{Attention}(QW_Q^i, KW_K^i, VW_V^i)</w:t>
+      </w:r>
+    </w:p>
+    <w:p>
+      <w:pPr>
+        <w:spacing w:after="60" w:before="60" w:line="360"/>
+      </w:pPr>
+      <w:r>
+        <w:rPr>
+          <w:rFonts w:ascii="SimSun" w:cs="SimSun" w:eastAsia="SimSun" w:hAnsi="SimSun"/>
+          <w:b w:val="false"/>
+          <w:bCs w:val="false"/>
+          <w:i w:val="false"/>
+          <w:iCs w:val="false"/>
+          <w:sz w:val="24"/>
+          <w:szCs w:val="24"/>
+        </w:rPr>
+        <w:t xml:space="preserve">多头的优势在于：模型可以从多个表征子空间中同时学习不同类型的帧间关联模式（如局部平滑、谐波追踪、能量包络、语音-噪声区分等），信息获取更全面。本文使用</w:t>
+      </w:r>
+      <w:r>
+        <w:rPr>
+          <w:rFonts w:ascii="SimSun" w:cs="SimSun" w:eastAsia="SimSun" w:hAnsi="SimSun"/>
+          <w:b w:val="false"/>
+          <w:bCs w:val="false"/>
+          <w:i/>
+          <w:iCs/>
+          <w:sz w:val="24"/>
+          <w:szCs w:val="24"/>
+        </w:rPr>
+        <w:t xml:space="preserve">h=4</w:t>
+      </w:r>
+      <w:r>
+        <w:rPr>
+          <w:rFonts w:ascii="SimSun" w:cs="SimSun" w:eastAsia="SimSun" w:hAnsi="SimSun"/>
+          <w:b w:val="false"/>
+          <w:bCs w:val="false"/>
+          <w:i w:val="false"/>
+          <w:iCs w:val="false"/>
+          <w:sz w:val="24"/>
+          <w:szCs w:val="24"/>
+        </w:rPr>
+        <w:t xml:space="preserve">个头。</w:t>
       </w:r>
     </w:p>
     <w:p>
@@ -2354,53 +3137,123 @@
     </w:p>
     <w:p>
       <w:pPr>
-        <w:spacing w:after="60" w:before="60" w:line="360"/>
-      </w:pPr>
-      <w:r>
-        <w:rPr>
-          <w:rFonts w:ascii="SimSun" w:cs="SimSun" w:eastAsia="SimSun" w:hAnsi="SimSun"/>
-          <w:b w:val="false"/>
-          <w:bCs w:val="false"/>
-          <w:i w:val="false"/>
-          <w:iCs w:val="false"/>
-          <w:sz w:val="24"/>
-          <w:szCs w:val="24"/>
-        </w:rPr>
-        <w:t xml:space="preserve">$$PE(pos, 2i) = \sin(pos / 10000^{2i/d_{model}})$$</w:t>
-      </w:r>
-    </w:p>
-    <w:p>
-      <w:pPr>
-        <w:spacing w:after="60" w:before="60" w:line="360"/>
-      </w:pPr>
-      <w:r>
-        <w:rPr>
-          <w:rFonts w:ascii="SimSun" w:cs="SimSun" w:eastAsia="SimSun" w:hAnsi="SimSun"/>
-          <w:b w:val="false"/>
-          <w:bCs w:val="false"/>
-          <w:i w:val="false"/>
-          <w:iCs w:val="false"/>
-          <w:sz w:val="24"/>
-          <w:szCs w:val="24"/>
-        </w:rPr>
-        <w:t xml:space="preserve">$$PE(pos, 2i+1) = \cos(pos / 10000^{2i/d_{model}})$$</w:t>
-      </w:r>
-    </w:p>
-    <w:p>
-      <w:pPr>
-        <w:spacing w:after="60" w:before="60" w:line="360"/>
-      </w:pPr>
-      <w:r>
-        <w:rPr>
-          <w:rFonts w:ascii="SimSun" w:cs="SimSun" w:eastAsia="SimSun" w:hAnsi="SimSun"/>
-          <w:b w:val="false"/>
-          <w:bCs w:val="false"/>
-          <w:i w:val="false"/>
-          <w:iCs w:val="false"/>
-          <w:sz w:val="24"/>
-          <w:szCs w:val="24"/>
-        </w:rPr>
-        <w:t xml:space="preserve">其中$pos$为时间帧位置，$i$为特征维度索引，$d_{model}$为模型维度。不同频率的正弦波编码不同位置，使模型能从编码中区分帧的相对位置。</w:t>
+        <w:spacing w:after="80" w:before="80"/>
+        <w:jc w:val="center"/>
+      </w:pPr>
+      <w:r>
+        <w:rPr>
+          <w:rFonts w:ascii="Times New Roman" w:cs="Times New Roman" w:eastAsia="Times New Roman" w:hAnsi="Times New Roman"/>
+          <w:i/>
+          <w:iCs/>
+          <w:sz w:val="22"/>
+          <w:szCs w:val="22"/>
+        </w:rPr>
+        <w:t xml:space="preserve">PE(pos, 2i) = \sin(pos / 10000^{2i/d_{model}})</w:t>
+      </w:r>
+    </w:p>
+    <w:p>
+      <w:pPr>
+        <w:spacing w:after="80" w:before="80"/>
+        <w:jc w:val="center"/>
+      </w:pPr>
+      <w:r>
+        <w:rPr>
+          <w:rFonts w:ascii="Times New Roman" w:cs="Times New Roman" w:eastAsia="Times New Roman" w:hAnsi="Times New Roman"/>
+          <w:i/>
+          <w:iCs/>
+          <w:sz w:val="22"/>
+          <w:szCs w:val="22"/>
+        </w:rPr>
+        <w:t xml:space="preserve">PE(pos, 2i+1) = \cos(pos / 10000^{2i/d_{model}})</w:t>
+      </w:r>
+    </w:p>
+    <w:p>
+      <w:pPr>
+        <w:spacing w:after="60" w:before="60" w:line="360"/>
+      </w:pPr>
+      <w:r>
+        <w:rPr>
+          <w:rFonts w:ascii="SimSun" w:cs="SimSun" w:eastAsia="SimSun" w:hAnsi="SimSun"/>
+          <w:b w:val="false"/>
+          <w:bCs w:val="false"/>
+          <w:i w:val="false"/>
+          <w:iCs w:val="false"/>
+          <w:sz w:val="24"/>
+          <w:szCs w:val="24"/>
+        </w:rPr>
+        <w:t xml:space="preserve">其中</w:t>
+      </w:r>
+      <w:r>
+        <w:rPr>
+          <w:rFonts w:ascii="SimSun" w:cs="SimSun" w:eastAsia="SimSun" w:hAnsi="SimSun"/>
+          <w:b w:val="false"/>
+          <w:bCs w:val="false"/>
+          <w:i/>
+          <w:iCs/>
+          <w:sz w:val="24"/>
+          <w:szCs w:val="24"/>
+        </w:rPr>
+        <w:t xml:space="preserve">pos</w:t>
+      </w:r>
+      <w:r>
+        <w:rPr>
+          <w:rFonts w:ascii="SimSun" w:cs="SimSun" w:eastAsia="SimSun" w:hAnsi="SimSun"/>
+          <w:b w:val="false"/>
+          <w:bCs w:val="false"/>
+          <w:i w:val="false"/>
+          <w:iCs w:val="false"/>
+          <w:sz w:val="24"/>
+          <w:szCs w:val="24"/>
+        </w:rPr>
+        <w:t xml:space="preserve">为时间帧位置，</w:t>
+      </w:r>
+      <w:r>
+        <w:rPr>
+          <w:rFonts w:ascii="SimSun" w:cs="SimSun" w:eastAsia="SimSun" w:hAnsi="SimSun"/>
+          <w:b w:val="false"/>
+          <w:bCs w:val="false"/>
+          <w:i/>
+          <w:iCs/>
+          <w:sz w:val="24"/>
+          <w:szCs w:val="24"/>
+        </w:rPr>
+        <w:t xml:space="preserve">i</w:t>
+      </w:r>
+      <w:r>
+        <w:rPr>
+          <w:rFonts w:ascii="SimSun" w:cs="SimSun" w:eastAsia="SimSun" w:hAnsi="SimSun"/>
+          <w:b w:val="false"/>
+          <w:bCs w:val="false"/>
+          <w:i w:val="false"/>
+          <w:iCs w:val="false"/>
+          <w:sz w:val="24"/>
+          <w:szCs w:val="24"/>
+        </w:rPr>
+        <w:t xml:space="preserve">为特征维度索引，</w:t>
+      </w:r>
+      <w:r>
+        <w:rPr>
+          <w:rFonts w:ascii="SimSun" w:cs="SimSun" w:eastAsia="SimSun" w:hAnsi="SimSun"/>
+          <w:b w:val="false"/>
+          <w:bCs w:val="false"/>
+          <w:i/>
+          <w:iCs/>
+          <w:sz w:val="24"/>
+          <w:szCs w:val="24"/>
+        </w:rPr>
+        <w:t xml:space="preserve">d_{model}</w:t>
+      </w:r>
+      <w:r>
+        <w:rPr>
+          <w:rFonts w:ascii="SimSun" w:cs="SimSun" w:eastAsia="SimSun" w:hAnsi="SimSun"/>
+          <w:b w:val="false"/>
+          <w:bCs w:val="false"/>
+          <w:i w:val="false"/>
+          <w:iCs w:val="false"/>
+          <w:sz w:val="24"/>
+          <w:szCs w:val="24"/>
+        </w:rPr>
+        <w:t xml:space="preserve">为模型维度。不同频率的正弦波编码不同位置，使模型能从编码中区分帧的相对位置。</w:t>
       </w:r>
     </w:p>
     <w:p>
@@ -2468,7 +3321,55 @@
           <w:sz w:val="24"/>
           <w:szCs w:val="24"/>
         </w:rPr>
-        <w:t xml:space="preserve">（2）位置前馈网络（Position-wise Feed-Forward Network, FFN）子层：两层全连接网络，第一层将维度扩展为$d_{model} \times 4$，激活函数为ReLU，第二层投影回$d_{model}$。FFN在每个位置独立运算（共享参数），引入非线性，增强特征表达能力。</w:t>
+        <w:t xml:space="preserve">（2）位置前馈网络（Position-wise Feed-Forward Network, FFN）子层：两层全连接网络，第一层将维度扩展为</w:t>
+      </w:r>
+      <w:r>
+        <w:rPr>
+          <w:rFonts w:ascii="SimSun" w:cs="SimSun" w:eastAsia="SimSun" w:hAnsi="SimSun"/>
+          <w:b w:val="false"/>
+          <w:bCs w:val="false"/>
+          <w:i/>
+          <w:iCs/>
+          <w:sz w:val="24"/>
+          <w:szCs w:val="24"/>
+        </w:rPr>
+        <w:t xml:space="preserve">d_{model} \times 4</w:t>
+      </w:r>
+      <w:r>
+        <w:rPr>
+          <w:rFonts w:ascii="SimSun" w:cs="SimSun" w:eastAsia="SimSun" w:hAnsi="SimSun"/>
+          <w:b w:val="false"/>
+          <w:bCs w:val="false"/>
+          <w:i w:val="false"/>
+          <w:iCs w:val="false"/>
+          <w:sz w:val="24"/>
+          <w:szCs w:val="24"/>
+        </w:rPr>
+        <w:t xml:space="preserve">，激活函数为ReLU，第二层投影回</w:t>
+      </w:r>
+      <w:r>
+        <w:rPr>
+          <w:rFonts w:ascii="SimSun" w:cs="SimSun" w:eastAsia="SimSun" w:hAnsi="SimSun"/>
+          <w:b w:val="false"/>
+          <w:bCs w:val="false"/>
+          <w:i/>
+          <w:iCs/>
+          <w:sz w:val="24"/>
+          <w:szCs w:val="24"/>
+        </w:rPr>
+        <w:t xml:space="preserve">d_{model}</w:t>
+      </w:r>
+      <w:r>
+        <w:rPr>
+          <w:rFonts w:ascii="SimSun" w:cs="SimSun" w:eastAsia="SimSun" w:hAnsi="SimSun"/>
+          <w:b w:val="false"/>
+          <w:bCs w:val="false"/>
+          <w:i w:val="false"/>
+          <w:iCs w:val="false"/>
+          <w:sz w:val="24"/>
+          <w:szCs w:val="24"/>
+        </w:rPr>
+        <w:t xml:space="preserve">。FFN在每个位置独立运算（共享参数），引入非线性，增强特征表达能力。</w:t>
       </w:r>
     </w:p>
     <w:p>
@@ -2490,19 +3391,18 @@
     </w:p>
     <w:p>
       <w:pPr>
-        <w:spacing w:after="60" w:before="60" w:line="360"/>
-      </w:pPr>
-      <w:r>
-        <w:rPr>
-          <w:rFonts w:ascii="SimSun" w:cs="SimSun" w:eastAsia="SimSun" w:hAnsi="SimSun"/>
-          <w:b w:val="false"/>
-          <w:bCs w:val="false"/>
-          <w:i w:val="false"/>
-          <w:iCs w:val="false"/>
-          <w:sz w:val="24"/>
-          <w:szCs w:val="24"/>
-        </w:rPr>
-        <w:t xml:space="preserve">$$\text{Output} = \text{LayerNorm}(x + \text{Sublayer}(x))$$</w:t>
+        <w:spacing w:after="80" w:before="80"/>
+        <w:jc w:val="center"/>
+      </w:pPr>
+      <w:r>
+        <w:rPr>
+          <w:rFonts w:ascii="Times New Roman" w:cs="Times New Roman" w:eastAsia="Times New Roman" w:hAnsi="Times New Roman"/>
+          <w:i/>
+          <w:iCs/>
+          <w:sz w:val="22"/>
+          <w:szCs w:val="22"/>
+        </w:rPr>
+        <w:t xml:space="preserve">\text{Output} = \text{LayerNorm}(x + \text{Sublayer}(x))</w:t>
       </w:r>
     </w:p>
     <w:p>
@@ -2569,75 +3469,217 @@
           <w:sz w:val="24"/>
           <w:szCs w:val="24"/>
         </w:rPr>
-        <w:t xml:space="preserve">对于输入含噪语音，通过STFT获取幅度谱$M_{noisy}[t, f]$和相位谱$\phi_{noisy}[t, f]$。干净语音的幅度谱为$M_{clean}[t, f]$。Ideal Ratio Mask（IRM）定义为：</w:t>
-      </w:r>
-    </w:p>
-    <w:p>
-      <w:pPr>
-        <w:spacing w:after="60" w:before="60" w:line="360"/>
-      </w:pPr>
-      <w:r>
-        <w:rPr>
-          <w:rFonts w:ascii="SimSun" w:cs="SimSun" w:eastAsia="SimSun" w:hAnsi="SimSun"/>
-          <w:b w:val="false"/>
-          <w:bCs w:val="false"/>
-          <w:i w:val="false"/>
-          <w:iCs w:val="false"/>
-          <w:sz w:val="24"/>
-          <w:szCs w:val="24"/>
-        </w:rPr>
-        <w:t xml:space="preserve">$$\text{IRM}[t, f] = \frac{M_{clean}[t, f]}{M_{noisy}[t, f]}$$</w:t>
-      </w:r>
-    </w:p>
-    <w:p>
-      <w:pPr>
-        <w:spacing w:after="60" w:before="60" w:line="360"/>
-      </w:pPr>
-      <w:r>
-        <w:rPr>
-          <w:rFonts w:ascii="SimSun" w:cs="SimSun" w:eastAsia="SimSun" w:hAnsi="SimSun"/>
-          <w:b w:val="false"/>
-          <w:bCs w:val="false"/>
-          <w:i w:val="false"/>
-          <w:iCs w:val="false"/>
-          <w:sz w:val="24"/>
-          <w:szCs w:val="24"/>
-        </w:rPr>
-        <w:t xml:space="preserve">IRM的值在$[0, 1]$之间——1代表该时频单元全部是语音，应被保留；0代表该单元全部是噪声，应予抑制。在训练阶段，神经网络的目标即为从含噪特征中预测IRM。使用Sigmoid激活函数将输出限制在$[0, 1]$，训练损失直接在增强后的幅度值与干净幅度值之间计算：</w:t>
-      </w:r>
-    </w:p>
-    <w:p>
-      <w:pPr>
-        <w:spacing w:after="60" w:before="60" w:line="360"/>
-      </w:pPr>
-      <w:r>
-        <w:rPr>
-          <w:rFonts w:ascii="SimSun" w:cs="SimSun" w:eastAsia="SimSun" w:hAnsi="SimSun"/>
-          <w:b w:val="false"/>
-          <w:bCs w:val="false"/>
-          <w:i w:val="false"/>
-          <w:iCs w:val="false"/>
-          <w:sz w:val="24"/>
-          <w:szCs w:val="24"/>
-        </w:rPr>
-        <w:t xml:space="preserve">$$\mathcal{L} = \frac{1}{|\mathcal{V}|} \sum_{(t,f) \in \mathcal{V}} |\text{Mask}[t,f] \cdot M_{noisy}[t,f] - M_{clean}[t,f]|$$</w:t>
-      </w:r>
-    </w:p>
-    <w:p>
-      <w:pPr>
-        <w:spacing w:after="60" w:before="60" w:line="360"/>
-      </w:pPr>
-      <w:r>
-        <w:rPr>
-          <w:rFonts w:ascii="SimSun" w:cs="SimSun" w:eastAsia="SimSun" w:hAnsi="SimSun"/>
-          <w:b w:val="false"/>
-          <w:bCs w:val="false"/>
-          <w:i w:val="false"/>
-          <w:iCs w:val="false"/>
-          <w:sz w:val="24"/>
-          <w:szCs w:val="24"/>
-        </w:rPr>
-        <w:t xml:space="preserve">其中$\mathcal{V}$为非填充区域（Valid region）的时频单元集合（详见3.4节Padding Mask机制）。</w:t>
+        <w:t xml:space="preserve">对于输入含噪语音，通过STFT获取幅度谱</w:t>
+      </w:r>
+      <w:r>
+        <w:rPr>
+          <w:rFonts w:ascii="SimSun" w:cs="SimSun" w:eastAsia="SimSun" w:hAnsi="SimSun"/>
+          <w:b w:val="false"/>
+          <w:bCs w:val="false"/>
+          <w:i/>
+          <w:iCs/>
+          <w:sz w:val="24"/>
+          <w:szCs w:val="24"/>
+        </w:rPr>
+        <w:t xml:space="preserve">M_{noisy}[t, f]</w:t>
+      </w:r>
+      <w:r>
+        <w:rPr>
+          <w:rFonts w:ascii="SimSun" w:cs="SimSun" w:eastAsia="SimSun" w:hAnsi="SimSun"/>
+          <w:b w:val="false"/>
+          <w:bCs w:val="false"/>
+          <w:i w:val="false"/>
+          <w:iCs w:val="false"/>
+          <w:sz w:val="24"/>
+          <w:szCs w:val="24"/>
+        </w:rPr>
+        <w:t xml:space="preserve">和相位谱</w:t>
+      </w:r>
+      <w:r>
+        <w:rPr>
+          <w:rFonts w:ascii="SimSun" w:cs="SimSun" w:eastAsia="SimSun" w:hAnsi="SimSun"/>
+          <w:b w:val="false"/>
+          <w:bCs w:val="false"/>
+          <w:i/>
+          <w:iCs/>
+          <w:sz w:val="24"/>
+          <w:szCs w:val="24"/>
+        </w:rPr>
+        <w:t xml:space="preserve">\phi_{noisy}[t, f]</w:t>
+      </w:r>
+      <w:r>
+        <w:rPr>
+          <w:rFonts w:ascii="SimSun" w:cs="SimSun" w:eastAsia="SimSun" w:hAnsi="SimSun"/>
+          <w:b w:val="false"/>
+          <w:bCs w:val="false"/>
+          <w:i w:val="false"/>
+          <w:iCs w:val="false"/>
+          <w:sz w:val="24"/>
+          <w:szCs w:val="24"/>
+        </w:rPr>
+        <w:t xml:space="preserve">。干净语音的幅度谱为</w:t>
+      </w:r>
+      <w:r>
+        <w:rPr>
+          <w:rFonts w:ascii="SimSun" w:cs="SimSun" w:eastAsia="SimSun" w:hAnsi="SimSun"/>
+          <w:b w:val="false"/>
+          <w:bCs w:val="false"/>
+          <w:i/>
+          <w:iCs/>
+          <w:sz w:val="24"/>
+          <w:szCs w:val="24"/>
+        </w:rPr>
+        <w:t xml:space="preserve">M_{clean}[t, f]</w:t>
+      </w:r>
+      <w:r>
+        <w:rPr>
+          <w:rFonts w:ascii="SimSun" w:cs="SimSun" w:eastAsia="SimSun" w:hAnsi="SimSun"/>
+          <w:b w:val="false"/>
+          <w:bCs w:val="false"/>
+          <w:i w:val="false"/>
+          <w:iCs w:val="false"/>
+          <w:sz w:val="24"/>
+          <w:szCs w:val="24"/>
+        </w:rPr>
+        <w:t xml:space="preserve">。Ideal Ratio Mask（IRM）定义为：</w:t>
+      </w:r>
+    </w:p>
+    <w:p>
+      <w:pPr>
+        <w:spacing w:after="80" w:before="80"/>
+        <w:jc w:val="center"/>
+      </w:pPr>
+      <w:r>
+        <w:rPr>
+          <w:rFonts w:ascii="Times New Roman" w:cs="Times New Roman" w:eastAsia="Times New Roman" w:hAnsi="Times New Roman"/>
+          <w:i/>
+          <w:iCs/>
+          <w:sz w:val="22"/>
+          <w:szCs w:val="22"/>
+        </w:rPr>
+        <w:t xml:space="preserve">\text{IRM}[t, f] = \frac{M_{clean}[t, f]}{M_{noisy}[t, f]}</w:t>
+      </w:r>
+    </w:p>
+    <w:p>
+      <w:pPr>
+        <w:spacing w:after="60" w:before="60" w:line="360"/>
+      </w:pPr>
+      <w:r>
+        <w:rPr>
+          <w:rFonts w:ascii="SimSun" w:cs="SimSun" w:eastAsia="SimSun" w:hAnsi="SimSun"/>
+          <w:b w:val="false"/>
+          <w:bCs w:val="false"/>
+          <w:i w:val="false"/>
+          <w:iCs w:val="false"/>
+          <w:sz w:val="24"/>
+          <w:szCs w:val="24"/>
+        </w:rPr>
+        <w:t xml:space="preserve">IRM的值在</w:t>
+      </w:r>
+      <w:r>
+        <w:rPr>
+          <w:rFonts w:ascii="SimSun" w:cs="SimSun" w:eastAsia="SimSun" w:hAnsi="SimSun"/>
+          <w:b w:val="false"/>
+          <w:bCs w:val="false"/>
+          <w:i/>
+          <w:iCs/>
+          <w:sz w:val="24"/>
+          <w:szCs w:val="24"/>
+        </w:rPr>
+        <w:t xml:space="preserve">[0, 1]</w:t>
+      </w:r>
+      <w:r>
+        <w:rPr>
+          <w:rFonts w:ascii="SimSun" w:cs="SimSun" w:eastAsia="SimSun" w:hAnsi="SimSun"/>
+          <w:b w:val="false"/>
+          <w:bCs w:val="false"/>
+          <w:i w:val="false"/>
+          <w:iCs w:val="false"/>
+          <w:sz w:val="24"/>
+          <w:szCs w:val="24"/>
+        </w:rPr>
+        <w:t xml:space="preserve">之间——1代表该时频单元全部是语音，应被保留；0代表该单元全部是噪声，应予抑制。在训练阶段，神经网络的目标即为从含噪特征中预测IRM。使用Sigmoid激活函数将输出限制在</w:t>
+      </w:r>
+      <w:r>
+        <w:rPr>
+          <w:rFonts w:ascii="SimSun" w:cs="SimSun" w:eastAsia="SimSun" w:hAnsi="SimSun"/>
+          <w:b w:val="false"/>
+          <w:bCs w:val="false"/>
+          <w:i/>
+          <w:iCs/>
+          <w:sz w:val="24"/>
+          <w:szCs w:val="24"/>
+        </w:rPr>
+        <w:t xml:space="preserve">[0, 1]</w:t>
+      </w:r>
+      <w:r>
+        <w:rPr>
+          <w:rFonts w:ascii="SimSun" w:cs="SimSun" w:eastAsia="SimSun" w:hAnsi="SimSun"/>
+          <w:b w:val="false"/>
+          <w:bCs w:val="false"/>
+          <w:i w:val="false"/>
+          <w:iCs w:val="false"/>
+          <w:sz w:val="24"/>
+          <w:szCs w:val="24"/>
+        </w:rPr>
+        <w:t xml:space="preserve">，训练损失直接在增强后的幅度值与干净幅度值之间计算：</w:t>
+      </w:r>
+    </w:p>
+    <w:p>
+      <w:pPr>
+        <w:spacing w:after="80" w:before="80"/>
+        <w:jc w:val="center"/>
+      </w:pPr>
+      <w:r>
+        <w:rPr>
+          <w:rFonts w:ascii="Times New Roman" w:cs="Times New Roman" w:eastAsia="Times New Roman" w:hAnsi="Times New Roman"/>
+          <w:i/>
+          <w:iCs/>
+          <w:sz w:val="22"/>
+          <w:szCs w:val="22"/>
+        </w:rPr>
+        <w:t xml:space="preserve">\mathcal{L} = \frac{1}{|\mathcal{V}|} \sum_{(t,f) \in \mathcal{V}} |\text{Mask}[t,f] \cdot M_{noisy}[t,f] - M_{clean}[t,f]|</w:t>
+      </w:r>
+    </w:p>
+    <w:p>
+      <w:pPr>
+        <w:spacing w:after="60" w:before="60" w:line="360"/>
+      </w:pPr>
+      <w:r>
+        <w:rPr>
+          <w:rFonts w:ascii="SimSun" w:cs="SimSun" w:eastAsia="SimSun" w:hAnsi="SimSun"/>
+          <w:b w:val="false"/>
+          <w:bCs w:val="false"/>
+          <w:i w:val="false"/>
+          <w:iCs w:val="false"/>
+          <w:sz w:val="24"/>
+          <w:szCs w:val="24"/>
+        </w:rPr>
+        <w:t xml:space="preserve">其中</w:t>
+      </w:r>
+      <w:r>
+        <w:rPr>
+          <w:rFonts w:ascii="SimSun" w:cs="SimSun" w:eastAsia="SimSun" w:hAnsi="SimSun"/>
+          <w:b w:val="false"/>
+          <w:bCs w:val="false"/>
+          <w:i/>
+          <w:iCs/>
+          <w:sz w:val="24"/>
+          <w:szCs w:val="24"/>
+        </w:rPr>
+        <w:t xml:space="preserve">\mathcal{V}</w:t>
+      </w:r>
+      <w:r>
+        <w:rPr>
+          <w:rFonts w:ascii="SimSun" w:cs="SimSun" w:eastAsia="SimSun" w:hAnsi="SimSun"/>
+          <w:b w:val="false"/>
+          <w:bCs w:val="false"/>
+          <w:i w:val="false"/>
+          <w:iCs w:val="false"/>
+          <w:sz w:val="24"/>
+          <w:szCs w:val="24"/>
+        </w:rPr>
+        <w:t xml:space="preserve">为非填充区域（Valid region）的时频单元集合（详见3.4节Padding Mask机制）。</w:t>
       </w:r>
     </w:p>
     <w:p>
@@ -2659,53 +3701,50 @@
     </w:p>
     <w:p>
       <w:pPr>
-        <w:spacing w:after="60" w:before="60" w:line="360"/>
-      </w:pPr>
-      <w:r>
-        <w:rPr>
-          <w:rFonts w:ascii="SimSun" w:cs="SimSun" w:eastAsia="SimSun" w:hAnsi="SimSun"/>
-          <w:b w:val="false"/>
-          <w:bCs w:val="false"/>
-          <w:i w:val="false"/>
-          <w:iCs w:val="false"/>
-          <w:sz w:val="24"/>
-          <w:szCs w:val="24"/>
-        </w:rPr>
-        <w:t xml:space="preserve">$$\hat{M}_{clean} = \text{Mask} \odot M_{noisy}$$</w:t>
-      </w:r>
-    </w:p>
-    <w:p>
-      <w:pPr>
-        <w:spacing w:after="60" w:before="60" w:line="360"/>
-      </w:pPr>
-      <w:r>
-        <w:rPr>
-          <w:rFonts w:ascii="SimSun" w:cs="SimSun" w:eastAsia="SimSun" w:hAnsi="SimSun"/>
-          <w:b w:val="false"/>
-          <w:bCs w:val="false"/>
-          <w:i w:val="false"/>
-          <w:iCs w:val="false"/>
-          <w:sz w:val="24"/>
-          <w:szCs w:val="24"/>
-        </w:rPr>
-        <w:t xml:space="preserve">$$\hat{X}_{clean}[t,f] = \hat{M}_{clean}[t,f] \cdot e^{j\phi_{noisy}[t,f]}$$</w:t>
-      </w:r>
-    </w:p>
-    <w:p>
-      <w:pPr>
-        <w:spacing w:after="60" w:before="60" w:line="360"/>
-      </w:pPr>
-      <w:r>
-        <w:rPr>
-          <w:rFonts w:ascii="SimSun" w:cs="SimSun" w:eastAsia="SimSun" w:hAnsi="SimSun"/>
-          <w:b w:val="false"/>
-          <w:bCs w:val="false"/>
-          <w:i w:val="false"/>
-          <w:iCs w:val="false"/>
-          <w:sz w:val="24"/>
-          <w:szCs w:val="24"/>
-        </w:rPr>
-        <w:t xml:space="preserve">$$\hat{x}_{clean}[n] = \text{iSTFT}(\hat{X}_{clean})$$</w:t>
+        <w:spacing w:after="80" w:before="80"/>
+        <w:jc w:val="center"/>
+      </w:pPr>
+      <w:r>
+        <w:rPr>
+          <w:rFonts w:ascii="Times New Roman" w:cs="Times New Roman" w:eastAsia="Times New Roman" w:hAnsi="Times New Roman"/>
+          <w:i/>
+          <w:iCs/>
+          <w:sz w:val="22"/>
+          <w:szCs w:val="22"/>
+        </w:rPr>
+        <w:t xml:space="preserve">\hat{M}_{clean} = \text{Mask} \odot M_{noisy}</w:t>
+      </w:r>
+    </w:p>
+    <w:p>
+      <w:pPr>
+        <w:spacing w:after="80" w:before="80"/>
+        <w:jc w:val="center"/>
+      </w:pPr>
+      <w:r>
+        <w:rPr>
+          <w:rFonts w:ascii="Times New Roman" w:cs="Times New Roman" w:eastAsia="Times New Roman" w:hAnsi="Times New Roman"/>
+          <w:i/>
+          <w:iCs/>
+          <w:sz w:val="22"/>
+          <w:szCs w:val="22"/>
+        </w:rPr>
+        <w:t xml:space="preserve">\hat{X}_{clean}[t,f] = \hat{M}_{clean}[t,f] \cdot e^{j\phi_{noisy}[t,f]}</w:t>
+      </w:r>
+    </w:p>
+    <w:p>
+      <w:pPr>
+        <w:spacing w:after="80" w:before="80"/>
+        <w:jc w:val="center"/>
+      </w:pPr>
+      <w:r>
+        <w:rPr>
+          <w:rFonts w:ascii="Times New Roman" w:cs="Times New Roman" w:eastAsia="Times New Roman" w:hAnsi="Times New Roman"/>
+          <w:i/>
+          <w:iCs/>
+          <w:sz w:val="22"/>
+          <w:szCs w:val="22"/>
+        </w:rPr>
+        <w:t xml:space="preserve">\hat{x}_{clean}[n] = \text{iSTFT}(\hat{X}_{clean})</w:t>
       </w:r>
     </w:p>
     <w:p>
@@ -2789,7 +3828,55 @@
           <w:sz w:val="24"/>
           <w:szCs w:val="24"/>
         </w:rPr>
-        <w:t xml:space="preserve">PESQ（Perceptual Evaluation of Speech Quality）由ITU-T P.862标准定义，是当前最广泛使用的客观语音质量评价指标之一。PESQ结合了听觉感知模型，比较降噪后语音与干净参考语音之间的差异，输出分数范围约为$-0.5$至$4.5$——分数越高，语音质量越好。PESQ的计算考虑了时间对齐、电平差异、掩蔽效应等多种因素，与主观听感评价（MOS）具有较高相关性。</w:t>
+        <w:t xml:space="preserve">PESQ（Perceptual Evaluation of Speech Quality）由ITU-T P.862标准定义，是当前最广泛使用的客观语音质量评价指标之一。PESQ结合了听觉感知模型，比较降噪后语音与干净参考语音之间的差异，输出分数范围约为</w:t>
+      </w:r>
+      <w:r>
+        <w:rPr>
+          <w:rFonts w:ascii="SimSun" w:cs="SimSun" w:eastAsia="SimSun" w:hAnsi="SimSun"/>
+          <w:b w:val="false"/>
+          <w:bCs w:val="false"/>
+          <w:i/>
+          <w:iCs/>
+          <w:sz w:val="24"/>
+          <w:szCs w:val="24"/>
+        </w:rPr>
+        <w:t xml:space="preserve">-0.5</w:t>
+      </w:r>
+      <w:r>
+        <w:rPr>
+          <w:rFonts w:ascii="SimSun" w:cs="SimSun" w:eastAsia="SimSun" w:hAnsi="SimSun"/>
+          <w:b w:val="false"/>
+          <w:bCs w:val="false"/>
+          <w:i w:val="false"/>
+          <w:iCs w:val="false"/>
+          <w:sz w:val="24"/>
+          <w:szCs w:val="24"/>
+        </w:rPr>
+        <w:t xml:space="preserve">至</w:t>
+      </w:r>
+      <w:r>
+        <w:rPr>
+          <w:rFonts w:ascii="SimSun" w:cs="SimSun" w:eastAsia="SimSun" w:hAnsi="SimSun"/>
+          <w:b w:val="false"/>
+          <w:bCs w:val="false"/>
+          <w:i/>
+          <w:iCs/>
+          <w:sz w:val="24"/>
+          <w:szCs w:val="24"/>
+        </w:rPr>
+        <w:t xml:space="preserve">4.5</w:t>
+      </w:r>
+      <w:r>
+        <w:rPr>
+          <w:rFonts w:ascii="SimSun" w:cs="SimSun" w:eastAsia="SimSun" w:hAnsi="SimSun"/>
+          <w:b w:val="false"/>
+          <w:bCs w:val="false"/>
+          <w:i w:val="false"/>
+          <w:iCs w:val="false"/>
+          <w:sz w:val="24"/>
+          <w:szCs w:val="24"/>
+        </w:rPr>
+        <w:t xml:space="preserve">——分数越高，语音质量越好。PESQ的计算考虑了时间对齐、电平差异、掩蔽效应等多种因素，与主观听感评价（MOS）具有较高相关性。</w:t>
       </w:r>
     </w:p>
     <w:p>
@@ -2862,19 +3949,18 @@
     </w:p>
     <w:p>
       <w:pPr>
-        <w:spacing w:after="60" w:before="60" w:line="360"/>
-      </w:pPr>
-      <w:r>
-        <w:rPr>
-          <w:rFonts w:ascii="SimSun" w:cs="SimSun" w:eastAsia="SimSun" w:hAnsi="SimSun"/>
-          <w:b w:val="false"/>
-          <w:bCs w:val="false"/>
-          <w:i w:val="false"/>
-          <w:iCs w:val="false"/>
-          <w:sz w:val="24"/>
-          <w:szCs w:val="24"/>
-        </w:rPr>
-        <w:t xml:space="preserve">$$\text{SDR} = 10 \cdot \log_{10}\left(\frac{\sum_n s_{clean}[n]^2}{\sum_n (s_{clean}[n] - s_{enhanced}[n])^2}\right)$$</w:t>
+        <w:spacing w:after="80" w:before="80"/>
+        <w:jc w:val="center"/>
+      </w:pPr>
+      <w:r>
+        <w:rPr>
+          <w:rFonts w:ascii="Times New Roman" w:cs="Times New Roman" w:eastAsia="Times New Roman" w:hAnsi="Times New Roman"/>
+          <w:i/>
+          <w:iCs/>
+          <w:sz w:val="22"/>
+          <w:szCs w:val="22"/>
+        </w:rPr>
+        <w:t xml:space="preserve">\text{SDR} = 10 \cdot \log_{10}\left(\frac{\sum_n s_{clean}[n]^2}{\sum_n (s_{clean}[n] - s_{enhanced}[n])^2}\right)</w:t>
       </w:r>
     </w:p>
     <w:p>
@@ -3314,36 +4400,59 @@
     </w:p>
     <w:p>
       <w:pPr>
-        <w:spacing w:after="60" w:before="60" w:line="360"/>
-      </w:pPr>
-      <w:r>
-        <w:rPr>
-          <w:rFonts w:ascii="SimSun" w:cs="SimSun" w:eastAsia="SimSun" w:hAnsi="SimSun"/>
-          <w:b w:val="false"/>
-          <w:bCs w:val="false"/>
-          <w:i w:val="false"/>
-          <w:iCs w:val="false"/>
-          <w:sz w:val="24"/>
-          <w:szCs w:val="24"/>
-        </w:rPr>
-        <w:t xml:space="preserve">$$\alpha = \frac{\text{RMS}_{clean}}{\text{RMS}_{noise} \cdot 10^{\text{SNR}/20}}$$</w:t>
-      </w:r>
-    </w:p>
-    <w:p>
-      <w:pPr>
-        <w:spacing w:after="60" w:before="60" w:line="360"/>
-      </w:pPr>
-      <w:r>
-        <w:rPr>
-          <w:rFonts w:ascii="SimSun" w:cs="SimSun" w:eastAsia="SimSun" w:hAnsi="SimSun"/>
-          <w:b w:val="false"/>
-          <w:bCs w:val="false"/>
-          <w:i w:val="false"/>
-          <w:iCs w:val="false"/>
-          <w:sz w:val="24"/>
-          <w:szCs w:val="24"/>
-        </w:rPr>
-        <w:t xml:space="preserve">将噪声幅度按$\alpha$缩放后与干净语音逐采样点相加，获得混合信号。</w:t>
+        <w:spacing w:after="80" w:before="80"/>
+        <w:jc w:val="center"/>
+      </w:pPr>
+      <w:r>
+        <w:rPr>
+          <w:rFonts w:ascii="Times New Roman" w:cs="Times New Roman" w:eastAsia="Times New Roman" w:hAnsi="Times New Roman"/>
+          <w:i/>
+          <w:iCs/>
+          <w:sz w:val="22"/>
+          <w:szCs w:val="22"/>
+        </w:rPr>
+        <w:t xml:space="preserve">\alpha = \frac{\text{RMS}_{clean}}{\text{RMS}_{noise} \cdot 10^{\text{SNR}/20}}</w:t>
+      </w:r>
+    </w:p>
+    <w:p>
+      <w:pPr>
+        <w:spacing w:after="60" w:before="60" w:line="360"/>
+      </w:pPr>
+      <w:r>
+        <w:rPr>
+          <w:rFonts w:ascii="SimSun" w:cs="SimSun" w:eastAsia="SimSun" w:hAnsi="SimSun"/>
+          <w:b w:val="false"/>
+          <w:bCs w:val="false"/>
+          <w:i w:val="false"/>
+          <w:iCs w:val="false"/>
+          <w:sz w:val="24"/>
+          <w:szCs w:val="24"/>
+        </w:rPr>
+        <w:t xml:space="preserve">将噪声幅度按</w:t>
+      </w:r>
+      <w:r>
+        <w:rPr>
+          <w:rFonts w:ascii="SimSun" w:cs="SimSun" w:eastAsia="SimSun" w:hAnsi="SimSun"/>
+          <w:b w:val="false"/>
+          <w:bCs w:val="false"/>
+          <w:i/>
+          <w:iCs/>
+          <w:sz w:val="24"/>
+          <w:szCs w:val="24"/>
+        </w:rPr>
+        <w:t xml:space="preserve">\alpha</w:t>
+      </w:r>
+      <w:r>
+        <w:rPr>
+          <w:rFonts w:ascii="SimSun" w:cs="SimSun" w:eastAsia="SimSun" w:hAnsi="SimSun"/>
+          <w:b w:val="false"/>
+          <w:bCs w:val="false"/>
+          <w:i w:val="false"/>
+          <w:iCs w:val="false"/>
+          <w:sz w:val="24"/>
+          <w:szCs w:val="24"/>
+        </w:rPr>
+        <w:t xml:space="preserve">缩放后与干净语音逐采样点相加，获得混合信号。</w:t>
       </w:r>
     </w:p>
     <w:p>
@@ -3687,7 +4796,164 @@
           <w:sz w:val="24"/>
           <w:szCs w:val="24"/>
         </w:rPr>
-        <w:t xml:space="preserve">采用</w:t>
+        <w:t xml:space="preserve">采用`log1p`而非普通对数的原因：当幅度接近0时，普通对数会产生</w:t>
+      </w:r>
+      <w:r>
+        <w:rPr>
+          <w:rFonts w:ascii="SimSun" w:cs="SimSun" w:eastAsia="SimSun" w:hAnsi="SimSun"/>
+          <w:b w:val="false"/>
+          <w:bCs w:val="false"/>
+          <w:i/>
+          <w:iCs/>
+          <w:sz w:val="24"/>
+          <w:szCs w:val="24"/>
+        </w:rPr>
+        <w:t xml:space="preserve">-\infty</w:t>
+      </w:r>
+      <w:r>
+        <w:rPr>
+          <w:rFonts w:ascii="SimSun" w:cs="SimSun" w:eastAsia="SimSun" w:hAnsi="SimSun"/>
+          <w:b w:val="false"/>
+          <w:bCs w:val="false"/>
+          <w:i w:val="false"/>
+          <w:iCs w:val="false"/>
+          <w:sz w:val="24"/>
+          <w:szCs w:val="24"/>
+        </w:rPr>
+        <w:t xml:space="preserve">，而`log1p`将0映射为</w:t>
+      </w:r>
+      <w:r>
+        <w:rPr>
+          <w:rFonts w:ascii="SimSun" w:cs="SimSun" w:eastAsia="SimSun" w:hAnsi="SimSun"/>
+          <w:b w:val="false"/>
+          <w:bCs w:val="false"/>
+          <w:i/>
+          <w:iCs/>
+          <w:sz w:val="24"/>
+          <w:szCs w:val="24"/>
+        </w:rPr>
+        <w:t xml:space="preserve">\log(1+0)=0</w:t>
+      </w:r>
+      <w:r>
+        <w:rPr>
+          <w:rFonts w:ascii="SimSun" w:cs="SimSun" w:eastAsia="SimSun" w:hAnsi="SimSun"/>
+          <w:b w:val="false"/>
+          <w:bCs w:val="false"/>
+          <w:i w:val="false"/>
+          <w:iCs w:val="false"/>
+          <w:sz w:val="24"/>
+          <w:szCs w:val="24"/>
+        </w:rPr>
+        <w:t xml:space="preserve">，有效缓解零值附近的数值不稳定问题。</w:t>
+      </w:r>
+    </w:p>
+    <w:p>
+      <w:pPr>
+        <w:spacing w:after="60" w:before="60" w:line="360"/>
+      </w:pPr>
+      <w:r>
+        <w:rPr>
+          <w:rFonts w:ascii="SimSun" w:cs="SimSun" w:eastAsia="SimSun" w:hAnsi="SimSun"/>
+          <w:b w:val="false"/>
+          <w:bCs w:val="false"/>
+          <w:i w:val="false"/>
+          <w:iCs w:val="false"/>
+          <w:sz w:val="24"/>
+          <w:szCs w:val="24"/>
+        </w:rPr>
+        <w:t xml:space="preserve">#### 3.3.2 Log-Mel频谱特征</w:t>
+      </w:r>
+    </w:p>
+    <w:p>
+      <w:pPr>
+        <w:spacing w:after="60" w:before="60" w:line="360"/>
+      </w:pPr>
+      <w:r>
+        <w:rPr>
+          <w:rFonts w:ascii="SimSun" w:cs="SimSun" w:eastAsia="SimSun" w:hAnsi="SimSun"/>
+          <w:b w:val="false"/>
+          <w:bCs w:val="false"/>
+          <w:i w:val="false"/>
+          <w:iCs w:val="false"/>
+          <w:sz w:val="24"/>
+          <w:szCs w:val="24"/>
+        </w:rPr>
+        <w:t xml:space="preserve">该特征在对幅度谱进行频域压缩（Mel滤波）后再进行对数非线性处理，模拟了人耳对不同频率的感知特性。流程为：</w:t>
+      </w:r>
+    </w:p>
+    <w:p>
+      <w:pPr>
+        <w:spacing w:after="60" w:before="60" w:line="360"/>
+      </w:pPr>
+      <w:r>
+        <w:rPr>
+          <w:rFonts w:ascii="SimSun" w:cs="SimSun" w:eastAsia="SimSun" w:hAnsi="SimSun"/>
+          <w:b w:val="false"/>
+          <w:bCs w:val="false"/>
+          <w:i w:val="false"/>
+          <w:iCs w:val="false"/>
+          <w:sz w:val="24"/>
+          <w:szCs w:val="24"/>
+        </w:rPr>
+        <w:t xml:space="preserve">（1）使用</w:t>
+      </w:r>
+      <w:r>
+        <w:rPr>
+          <w:rFonts w:ascii="SimSun" w:cs="SimSun" w:eastAsia="SimSun" w:hAnsi="SimSun"/>
+          <w:b w:val="false"/>
+          <w:bCs w:val="false"/>
+          <w:i w:val="false"/>
+          <w:iCs w:val="false"/>
+          <w:sz w:val="24"/>
+          <w:szCs w:val="24"/>
+        </w:rPr>
+        <w:t xml:space="preserve">build_mel_filterbank</w:t>
+      </w:r>
+      <w:r>
+        <w:rPr>
+          <w:rFonts w:ascii="SimSun" w:cs="SimSun" w:eastAsia="SimSun" w:hAnsi="SimSun"/>
+          <w:b w:val="false"/>
+          <w:bCs w:val="false"/>
+          <w:i w:val="false"/>
+          <w:iCs w:val="false"/>
+          <w:sz w:val="24"/>
+          <w:szCs w:val="24"/>
+        </w:rPr>
+        <w:t xml:space="preserve">函数构建40三角Mel滤波器：在Hz域的0至8000Hz范围，通过Hz→Mel→线性采样→Mel→Hz的转换，生成覆盖全频段的40个Mel滤波器。</w:t>
+      </w:r>
+    </w:p>
+    <w:p>
+      <w:pPr>
+        <w:spacing w:after="60" w:before="60" w:line="360"/>
+      </w:pPr>
+      <w:r>
+        <w:rPr>
+          <w:rFonts w:ascii="SimSun" w:cs="SimSun" w:eastAsia="SimSun" w:hAnsi="SimSun"/>
+          <w:b w:val="false"/>
+          <w:bCs w:val="false"/>
+          <w:i w:val="false"/>
+          <w:iCs w:val="false"/>
+          <w:sz w:val="24"/>
+          <w:szCs w:val="24"/>
+        </w:rPr>
+        <w:t xml:space="preserve">（2）对STFT功率谱与Mel滤波器组进行矩阵乘法，获取40维Mel能量。</w:t>
+      </w:r>
+    </w:p>
+    <w:p>
+      <w:pPr>
+        <w:spacing w:after="60" w:before="60" w:line="360"/>
+      </w:pPr>
+      <w:r>
+        <w:rPr>
+          <w:rFonts w:ascii="SimSun" w:cs="SimSun" w:eastAsia="SimSun" w:hAnsi="SimSun"/>
+          <w:b w:val="false"/>
+          <w:bCs w:val="false"/>
+          <w:i w:val="false"/>
+          <w:iCs w:val="false"/>
+          <w:sz w:val="24"/>
+          <w:szCs w:val="24"/>
+        </w:rPr>
+        <w:t xml:space="preserve">（3）对Mel能量做</w:t>
       </w:r>
       <w:r>
         <w:rPr>
@@ -3711,7 +4977,116 @@
           <w:sz w:val="24"/>
           <w:szCs w:val="24"/>
         </w:rPr>
-        <w:t xml:space="preserve">而非普通对数的原因：当幅度接近0时，普通对数会产生$-\infty$，而</w:t>
+        <w:t xml:space="preserve">操作，获得40维Log-Mel特征。</w:t>
+      </w:r>
+    </w:p>
+    <w:p>
+      <w:pPr>
+        <w:spacing w:after="60" w:before="60" w:line="360"/>
+      </w:pPr>
+      <w:r>
+        <w:rPr>
+          <w:rFonts w:ascii="SimSun" w:cs="SimSun" w:eastAsia="SimSun" w:hAnsi="SimSun"/>
+          <w:b w:val="false"/>
+          <w:bCs w:val="false"/>
+          <w:i w:val="false"/>
+          <w:iCs w:val="false"/>
+          <w:sz w:val="24"/>
+          <w:szCs w:val="24"/>
+        </w:rPr>
+        <w:t xml:space="preserve">#### 3.3.3 类RNNoise Bark带能量特征（含帧间差分）</w:t>
+      </w:r>
+    </w:p>
+    <w:p>
+      <w:pPr>
+        <w:spacing w:after="60" w:before="60" w:line="360"/>
+      </w:pPr>
+      <w:r>
+        <w:rPr>
+          <w:rFonts w:ascii="SimSun" w:cs="SimSun" w:eastAsia="SimSun" w:hAnsi="SimSun"/>
+          <w:b w:val="false"/>
+          <w:bCs w:val="false"/>
+          <w:i w:val="false"/>
+          <w:iCs w:val="false"/>
+          <w:sz w:val="24"/>
+          <w:szCs w:val="24"/>
+        </w:rPr>
+        <w:t xml:space="preserve">RNNoise方法使用Bark刻度频带能量以及帧间差分（delta）作为输入特征。本文在</w:t>
+      </w:r>
+      <w:r>
+        <w:rPr>
+          <w:rFonts w:ascii="SimSun" w:cs="SimSun" w:eastAsia="SimSun" w:hAnsi="SimSun"/>
+          <w:b w:val="false"/>
+          <w:bCs w:val="false"/>
+          <w:i w:val="false"/>
+          <w:iCs w:val="false"/>
+          <w:sz w:val="24"/>
+          <w:szCs w:val="24"/>
+        </w:rPr>
+        <w:t xml:space="preserve">build_rnnoise_like_bands</w:t>
+      </w:r>
+      <w:r>
+        <w:rPr>
+          <w:rFonts w:ascii="SimSun" w:cs="SimSun" w:eastAsia="SimSun" w:hAnsi="SimSun"/>
+          <w:b w:val="false"/>
+          <w:bCs w:val="false"/>
+          <w:i w:val="false"/>
+          <w:iCs w:val="false"/>
+          <w:sz w:val="24"/>
+          <w:szCs w:val="24"/>
+        </w:rPr>
+        <w:t xml:space="preserve">函数中实现了类似的Bark域频带滤波器结构：</w:t>
+      </w:r>
+    </w:p>
+    <w:p>
+      <w:pPr>
+        <w:spacing w:after="60" w:before="60" w:line="360"/>
+      </w:pPr>
+      <w:r>
+        <w:rPr>
+          <w:rFonts w:ascii="SimSun" w:cs="SimSun" w:eastAsia="SimSun" w:hAnsi="SimSun"/>
+          <w:b w:val="false"/>
+          <w:bCs w:val="false"/>
+          <w:i w:val="false"/>
+          <w:iCs w:val="false"/>
+          <w:sz w:val="24"/>
+          <w:szCs w:val="24"/>
+        </w:rPr>
+        <w:t xml:space="preserve">（1）计算STFT频率轴在Bark刻度下的映射值。</w:t>
+      </w:r>
+    </w:p>
+    <w:p>
+      <w:pPr>
+        <w:spacing w:after="60" w:before="60" w:line="360"/>
+      </w:pPr>
+      <w:r>
+        <w:rPr>
+          <w:rFonts w:ascii="SimSun" w:cs="SimSun" w:eastAsia="SimSun" w:hAnsi="SimSun"/>
+          <w:b w:val="false"/>
+          <w:bCs w:val="false"/>
+          <w:i w:val="false"/>
+          <w:iCs w:val="false"/>
+          <w:sz w:val="24"/>
+          <w:szCs w:val="24"/>
+        </w:rPr>
+        <w:t xml:space="preserve">（2）在Bark域均匀划分22个子带（Bark边界），每个子带内的FFT频点加权聚合（三角加权），权归一化使得每个子带的总增益为1。</w:t>
+      </w:r>
+    </w:p>
+    <w:p>
+      <w:pPr>
+        <w:spacing w:after="60" w:before="60" w:line="360"/>
+      </w:pPr>
+      <w:r>
+        <w:rPr>
+          <w:rFonts w:ascii="SimSun" w:cs="SimSun" w:eastAsia="SimSun" w:hAnsi="SimSun"/>
+          <w:b w:val="false"/>
+          <w:bCs w:val="false"/>
+          <w:i w:val="false"/>
+          <w:iCs w:val="false"/>
+          <w:sz w:val="24"/>
+          <w:szCs w:val="24"/>
+        </w:rPr>
+        <w:t xml:space="preserve">（3）将22个Bark子带的功率能量（加权求和后）进行</w:t>
       </w:r>
       <w:r>
         <w:rPr>
@@ -3735,272 +5110,6 @@
           <w:sz w:val="24"/>
           <w:szCs w:val="24"/>
         </w:rPr>
-        <w:t xml:space="preserve">将0映射为$\log(1+0)=0$，有效缓解零值附近的数值不稳定问题。</w:t>
-      </w:r>
-    </w:p>
-    <w:p>
-      <w:pPr>
-        <w:spacing w:after="60" w:before="60" w:line="360"/>
-      </w:pPr>
-      <w:r>
-        <w:rPr>
-          <w:rFonts w:ascii="SimSun" w:cs="SimSun" w:eastAsia="SimSun" w:hAnsi="SimSun"/>
-          <w:b w:val="false"/>
-          <w:bCs w:val="false"/>
-          <w:i w:val="false"/>
-          <w:iCs w:val="false"/>
-          <w:sz w:val="24"/>
-          <w:szCs w:val="24"/>
-        </w:rPr>
-        <w:t xml:space="preserve">#### 3.3.2 Log-Mel频谱特征</w:t>
-      </w:r>
-    </w:p>
-    <w:p>
-      <w:pPr>
-        <w:spacing w:after="60" w:before="60" w:line="360"/>
-      </w:pPr>
-      <w:r>
-        <w:rPr>
-          <w:rFonts w:ascii="SimSun" w:cs="SimSun" w:eastAsia="SimSun" w:hAnsi="SimSun"/>
-          <w:b w:val="false"/>
-          <w:bCs w:val="false"/>
-          <w:i w:val="false"/>
-          <w:iCs w:val="false"/>
-          <w:sz w:val="24"/>
-          <w:szCs w:val="24"/>
-        </w:rPr>
-        <w:t xml:space="preserve">该特征在对幅度谱进行频域压缩（Mel滤波）后再进行对数非线性处理，模拟了人耳对不同频率的感知特性。流程为：</w:t>
-      </w:r>
-    </w:p>
-    <w:p>
-      <w:pPr>
-        <w:spacing w:after="60" w:before="60" w:line="360"/>
-      </w:pPr>
-      <w:r>
-        <w:rPr>
-          <w:rFonts w:ascii="SimSun" w:cs="SimSun" w:eastAsia="SimSun" w:hAnsi="SimSun"/>
-          <w:b w:val="false"/>
-          <w:bCs w:val="false"/>
-          <w:i w:val="false"/>
-          <w:iCs w:val="false"/>
-          <w:sz w:val="24"/>
-          <w:szCs w:val="24"/>
-        </w:rPr>
-        <w:t xml:space="preserve">（1）使用</w:t>
-      </w:r>
-      <w:r>
-        <w:rPr>
-          <w:rFonts w:ascii="SimSun" w:cs="SimSun" w:eastAsia="SimSun" w:hAnsi="SimSun"/>
-          <w:b w:val="false"/>
-          <w:bCs w:val="false"/>
-          <w:i w:val="false"/>
-          <w:iCs w:val="false"/>
-          <w:sz w:val="24"/>
-          <w:szCs w:val="24"/>
-        </w:rPr>
-        <w:t xml:space="preserve">build_mel_filterbank</w:t>
-      </w:r>
-      <w:r>
-        <w:rPr>
-          <w:rFonts w:ascii="SimSun" w:cs="SimSun" w:eastAsia="SimSun" w:hAnsi="SimSun"/>
-          <w:b w:val="false"/>
-          <w:bCs w:val="false"/>
-          <w:i w:val="false"/>
-          <w:iCs w:val="false"/>
-          <w:sz w:val="24"/>
-          <w:szCs w:val="24"/>
-        </w:rPr>
-        <w:t xml:space="preserve">函数构建40三角Mel滤波器：在Hz域的0至8000Hz范围，通过Hz→Mel→线性采样→Mel→Hz的转换，生成覆盖全频段的40个Mel滤波器。</w:t>
-      </w:r>
-    </w:p>
-    <w:p>
-      <w:pPr>
-        <w:spacing w:after="60" w:before="60" w:line="360"/>
-      </w:pPr>
-      <w:r>
-        <w:rPr>
-          <w:rFonts w:ascii="SimSun" w:cs="SimSun" w:eastAsia="SimSun" w:hAnsi="SimSun"/>
-          <w:b w:val="false"/>
-          <w:bCs w:val="false"/>
-          <w:i w:val="false"/>
-          <w:iCs w:val="false"/>
-          <w:sz w:val="24"/>
-          <w:szCs w:val="24"/>
-        </w:rPr>
-        <w:t xml:space="preserve">（2）对STFT功率谱与Mel滤波器组进行矩阵乘法，获取40维Mel能量。</w:t>
-      </w:r>
-    </w:p>
-    <w:p>
-      <w:pPr>
-        <w:spacing w:after="60" w:before="60" w:line="360"/>
-      </w:pPr>
-      <w:r>
-        <w:rPr>
-          <w:rFonts w:ascii="SimSun" w:cs="SimSun" w:eastAsia="SimSun" w:hAnsi="SimSun"/>
-          <w:b w:val="false"/>
-          <w:bCs w:val="false"/>
-          <w:i w:val="false"/>
-          <w:iCs w:val="false"/>
-          <w:sz w:val="24"/>
-          <w:szCs w:val="24"/>
-        </w:rPr>
-        <w:t xml:space="preserve">（3）对Mel能量做</w:t>
-      </w:r>
-      <w:r>
-        <w:rPr>
-          <w:rFonts w:ascii="SimSun" w:cs="SimSun" w:eastAsia="SimSun" w:hAnsi="SimSun"/>
-          <w:b w:val="false"/>
-          <w:bCs w:val="false"/>
-          <w:i w:val="false"/>
-          <w:iCs w:val="false"/>
-          <w:sz w:val="24"/>
-          <w:szCs w:val="24"/>
-        </w:rPr>
-        <w:t xml:space="preserve">log1p</w:t>
-      </w:r>
-      <w:r>
-        <w:rPr>
-          <w:rFonts w:ascii="SimSun" w:cs="SimSun" w:eastAsia="SimSun" w:hAnsi="SimSun"/>
-          <w:b w:val="false"/>
-          <w:bCs w:val="false"/>
-          <w:i w:val="false"/>
-          <w:iCs w:val="false"/>
-          <w:sz w:val="24"/>
-          <w:szCs w:val="24"/>
-        </w:rPr>
-        <w:t xml:space="preserve">操作，获得40维Log-Mel特征。</w:t>
-      </w:r>
-    </w:p>
-    <w:p>
-      <w:pPr>
-        <w:spacing w:after="60" w:before="60" w:line="360"/>
-      </w:pPr>
-      <w:r>
-        <w:rPr>
-          <w:rFonts w:ascii="SimSun" w:cs="SimSun" w:eastAsia="SimSun" w:hAnsi="SimSun"/>
-          <w:b w:val="false"/>
-          <w:bCs w:val="false"/>
-          <w:i w:val="false"/>
-          <w:iCs w:val="false"/>
-          <w:sz w:val="24"/>
-          <w:szCs w:val="24"/>
-        </w:rPr>
-        <w:t xml:space="preserve">#### 3.3.3 类RNNoise Bark带能量特征（含帧间差分）</w:t>
-      </w:r>
-    </w:p>
-    <w:p>
-      <w:pPr>
-        <w:spacing w:after="60" w:before="60" w:line="360"/>
-      </w:pPr>
-      <w:r>
-        <w:rPr>
-          <w:rFonts w:ascii="SimSun" w:cs="SimSun" w:eastAsia="SimSun" w:hAnsi="SimSun"/>
-          <w:b w:val="false"/>
-          <w:bCs w:val="false"/>
-          <w:i w:val="false"/>
-          <w:iCs w:val="false"/>
-          <w:sz w:val="24"/>
-          <w:szCs w:val="24"/>
-        </w:rPr>
-        <w:t xml:space="preserve">RNNoise方法使用Bark刻度频带能量以及帧间差分（delta）作为输入特征。本文在</w:t>
-      </w:r>
-      <w:r>
-        <w:rPr>
-          <w:rFonts w:ascii="SimSun" w:cs="SimSun" w:eastAsia="SimSun" w:hAnsi="SimSun"/>
-          <w:b w:val="false"/>
-          <w:bCs w:val="false"/>
-          <w:i w:val="false"/>
-          <w:iCs w:val="false"/>
-          <w:sz w:val="24"/>
-          <w:szCs w:val="24"/>
-        </w:rPr>
-        <w:t xml:space="preserve">build_rnnoise_like_bands</w:t>
-      </w:r>
-      <w:r>
-        <w:rPr>
-          <w:rFonts w:ascii="SimSun" w:cs="SimSun" w:eastAsia="SimSun" w:hAnsi="SimSun"/>
-          <w:b w:val="false"/>
-          <w:bCs w:val="false"/>
-          <w:i w:val="false"/>
-          <w:iCs w:val="false"/>
-          <w:sz w:val="24"/>
-          <w:szCs w:val="24"/>
-        </w:rPr>
-        <w:t xml:space="preserve">函数中实现了类似的Bark域频带滤波器结构：</w:t>
-      </w:r>
-    </w:p>
-    <w:p>
-      <w:pPr>
-        <w:spacing w:after="60" w:before="60" w:line="360"/>
-      </w:pPr>
-      <w:r>
-        <w:rPr>
-          <w:rFonts w:ascii="SimSun" w:cs="SimSun" w:eastAsia="SimSun" w:hAnsi="SimSun"/>
-          <w:b w:val="false"/>
-          <w:bCs w:val="false"/>
-          <w:i w:val="false"/>
-          <w:iCs w:val="false"/>
-          <w:sz w:val="24"/>
-          <w:szCs w:val="24"/>
-        </w:rPr>
-        <w:t xml:space="preserve">（1）计算STFT频率轴在Bark刻度下的映射值。</w:t>
-      </w:r>
-    </w:p>
-    <w:p>
-      <w:pPr>
-        <w:spacing w:after="60" w:before="60" w:line="360"/>
-      </w:pPr>
-      <w:r>
-        <w:rPr>
-          <w:rFonts w:ascii="SimSun" w:cs="SimSun" w:eastAsia="SimSun" w:hAnsi="SimSun"/>
-          <w:b w:val="false"/>
-          <w:bCs w:val="false"/>
-          <w:i w:val="false"/>
-          <w:iCs w:val="false"/>
-          <w:sz w:val="24"/>
-          <w:szCs w:val="24"/>
-        </w:rPr>
-        <w:t xml:space="preserve">（2）在Bark域均匀划分22个子带（Bark边界），每个子带内的FFT频点加权聚合（三角加权），权归一化使得每个子带的总增益为1。</w:t>
-      </w:r>
-    </w:p>
-    <w:p>
-      <w:pPr>
-        <w:spacing w:after="60" w:before="60" w:line="360"/>
-      </w:pPr>
-      <w:r>
-        <w:rPr>
-          <w:rFonts w:ascii="SimSun" w:cs="SimSun" w:eastAsia="SimSun" w:hAnsi="SimSun"/>
-          <w:b w:val="false"/>
-          <w:bCs w:val="false"/>
-          <w:i w:val="false"/>
-          <w:iCs w:val="false"/>
-          <w:sz w:val="24"/>
-          <w:szCs w:val="24"/>
-        </w:rPr>
-        <w:t xml:space="preserve">（3）将22个Bark子带的功率能量（加权求和后）进行</w:t>
-      </w:r>
-      <w:r>
-        <w:rPr>
-          <w:rFonts w:ascii="SimSun" w:cs="SimSun" w:eastAsia="SimSun" w:hAnsi="SimSun"/>
-          <w:b w:val="false"/>
-          <w:bCs w:val="false"/>
-          <w:i w:val="false"/>
-          <w:iCs w:val="false"/>
-          <w:sz w:val="24"/>
-          <w:szCs w:val="24"/>
-        </w:rPr>
-        <w:t xml:space="preserve">log1p</w:t>
-      </w:r>
-      <w:r>
-        <w:rPr>
-          <w:rFonts w:ascii="SimSun" w:cs="SimSun" w:eastAsia="SimSun" w:hAnsi="SimSun"/>
-          <w:b w:val="false"/>
-          <w:bCs w:val="false"/>
-          <w:i w:val="false"/>
-          <w:iCs w:val="false"/>
-          <w:sz w:val="24"/>
-          <w:szCs w:val="24"/>
-        </w:rPr>
         <w:t xml:space="preserve">操作，获得22维Band Energy。</w:t>
       </w:r>
     </w:p>
@@ -4018,7 +5127,31 @@
           <w:sz w:val="24"/>
           <w:szCs w:val="24"/>
         </w:rPr>
-        <w:t xml:space="preserve">（4）计算帧间一阶差分（Delta）：$\Delta_t = \text{Energy}_t - \text{Energy}_{t-1}$（首帧以自身作为差分），生成22维Delta特征。</w:t>
+        <w:t xml:space="preserve">（4）计算帧间一阶差分（Delta）：</w:t>
+      </w:r>
+      <w:r>
+        <w:rPr>
+          <w:rFonts w:ascii="SimSun" w:cs="SimSun" w:eastAsia="SimSun" w:hAnsi="SimSun"/>
+          <w:b w:val="false"/>
+          <w:bCs w:val="false"/>
+          <w:i/>
+          <w:iCs/>
+          <w:sz w:val="24"/>
+          <w:szCs w:val="24"/>
+        </w:rPr>
+        <w:t xml:space="preserve">\Delta_t = \text{Energy}_t - \text{Energy}_{t-1}</w:t>
+      </w:r>
+      <w:r>
+        <w:rPr>
+          <w:rFonts w:ascii="SimSun" w:cs="SimSun" w:eastAsia="SimSun" w:hAnsi="SimSun"/>
+          <w:b w:val="false"/>
+          <w:bCs w:val="false"/>
+          <w:i w:val="false"/>
+          <w:iCs w:val="false"/>
+          <w:sz w:val="24"/>
+          <w:szCs w:val="24"/>
+        </w:rPr>
+        <w:t xml:space="preserve">（首帧以自身作为差分），生成22维Delta特征。</w:t>
       </w:r>
     </w:p>
     <w:p>
@@ -4536,7 +5669,103 @@
           <w:sz w:val="24"/>
           <w:szCs w:val="24"/>
         </w:rPr>
-        <w:t xml:space="preserve">模型输入为$B \times T \times E$三维张量：$T$为音频STFT帧数，$E$为特征维度（257/40/44取决于选择的feature_type）。输出为$B \times T \times 257$的三维张量，267维度对应STFT频点数——即对每个频率bin输出一个掩蔽值。</w:t>
+        <w:t xml:space="preserve">模型输入为</w:t>
+      </w:r>
+      <w:r>
+        <w:rPr>
+          <w:rFonts w:ascii="SimSun" w:cs="SimSun" w:eastAsia="SimSun" w:hAnsi="SimSun"/>
+          <w:b w:val="false"/>
+          <w:bCs w:val="false"/>
+          <w:i/>
+          <w:iCs/>
+          <w:sz w:val="24"/>
+          <w:szCs w:val="24"/>
+        </w:rPr>
+        <w:t xml:space="preserve">B \times T \times E</w:t>
+      </w:r>
+      <w:r>
+        <w:rPr>
+          <w:rFonts w:ascii="SimSun" w:cs="SimSun" w:eastAsia="SimSun" w:hAnsi="SimSun"/>
+          <w:b w:val="false"/>
+          <w:bCs w:val="false"/>
+          <w:i w:val="false"/>
+          <w:iCs w:val="false"/>
+          <w:sz w:val="24"/>
+          <w:szCs w:val="24"/>
+        </w:rPr>
+        <w:t xml:space="preserve">三维张量：</w:t>
+      </w:r>
+      <w:r>
+        <w:rPr>
+          <w:rFonts w:ascii="SimSun" w:cs="SimSun" w:eastAsia="SimSun" w:hAnsi="SimSun"/>
+          <w:b w:val="false"/>
+          <w:bCs w:val="false"/>
+          <w:i/>
+          <w:iCs/>
+          <w:sz w:val="24"/>
+          <w:szCs w:val="24"/>
+        </w:rPr>
+        <w:t xml:space="preserve">T</w:t>
+      </w:r>
+      <w:r>
+        <w:rPr>
+          <w:rFonts w:ascii="SimSun" w:cs="SimSun" w:eastAsia="SimSun" w:hAnsi="SimSun"/>
+          <w:b w:val="false"/>
+          <w:bCs w:val="false"/>
+          <w:i w:val="false"/>
+          <w:iCs w:val="false"/>
+          <w:sz w:val="24"/>
+          <w:szCs w:val="24"/>
+        </w:rPr>
+        <w:t xml:space="preserve">为音频STFT帧数，</w:t>
+      </w:r>
+      <w:r>
+        <w:rPr>
+          <w:rFonts w:ascii="SimSun" w:cs="SimSun" w:eastAsia="SimSun" w:hAnsi="SimSun"/>
+          <w:b w:val="false"/>
+          <w:bCs w:val="false"/>
+          <w:i/>
+          <w:iCs/>
+          <w:sz w:val="24"/>
+          <w:szCs w:val="24"/>
+        </w:rPr>
+        <w:t xml:space="preserve">E</w:t>
+      </w:r>
+      <w:r>
+        <w:rPr>
+          <w:rFonts w:ascii="SimSun" w:cs="SimSun" w:eastAsia="SimSun" w:hAnsi="SimSun"/>
+          <w:b w:val="false"/>
+          <w:bCs w:val="false"/>
+          <w:i w:val="false"/>
+          <w:iCs w:val="false"/>
+          <w:sz w:val="24"/>
+          <w:szCs w:val="24"/>
+        </w:rPr>
+        <w:t xml:space="preserve">为特征维度（257/40/44取决于选择的feature_type）。输出为</w:t>
+      </w:r>
+      <w:r>
+        <w:rPr>
+          <w:rFonts w:ascii="SimSun" w:cs="SimSun" w:eastAsia="SimSun" w:hAnsi="SimSun"/>
+          <w:b w:val="false"/>
+          <w:bCs w:val="false"/>
+          <w:i/>
+          <w:iCs/>
+          <w:sz w:val="24"/>
+          <w:szCs w:val="24"/>
+        </w:rPr>
+        <w:t xml:space="preserve">B \times T \times 257</w:t>
+      </w:r>
+      <w:r>
+        <w:rPr>
+          <w:rFonts w:ascii="SimSun" w:cs="SimSun" w:eastAsia="SimSun" w:hAnsi="SimSun"/>
+          <w:b w:val="false"/>
+          <w:bCs w:val="false"/>
+          <w:i w:val="false"/>
+          <w:iCs w:val="false"/>
+          <w:sz w:val="24"/>
+          <w:szCs w:val="24"/>
+        </w:rPr>
+        <w:t xml:space="preserve">的三维张量，267维度对应STFT频点数——即对每个频率bin输出一个掩蔽值。</w:t>
       </w:r>
     </w:p>
     <w:p>
@@ -4867,24 +6096,48 @@
           <w:sz w:val="24"/>
           <w:szCs w:val="24"/>
         </w:rPr>
-        <w:t xml:space="preserve">  - 偶数Dim：$\sin(0)$</w:t>
-      </w:r>
-    </w:p>
-    <w:p>
-      <w:pPr>
-        <w:spacing w:after="60" w:before="60" w:line="360"/>
-      </w:pPr>
-      <w:r>
-        <w:rPr>
-          <w:rFonts w:ascii="SimSun" w:cs="SimSun" w:eastAsia="SimSun" w:hAnsi="SimSun"/>
-          <w:b w:val="false"/>
-          <w:bCs w:val="false"/>
-          <w:i w:val="false"/>
-          <w:iCs w:val="false"/>
-          <w:sz w:val="24"/>
-          <w:szCs w:val="24"/>
-        </w:rPr>
-        <w:t xml:space="preserve">  - 奇数Dim：$\cos(0)$</w:t>
+        <w:t xml:space="preserve">  - 偶数Dim：</w:t>
+      </w:r>
+      <w:r>
+        <w:rPr>
+          <w:rFonts w:ascii="SimSun" w:cs="SimSun" w:eastAsia="SimSun" w:hAnsi="SimSun"/>
+          <w:b w:val="false"/>
+          <w:bCs w:val="false"/>
+          <w:i/>
+          <w:iCs/>
+          <w:sz w:val="24"/>
+          <w:szCs w:val="24"/>
+        </w:rPr>
+        <w:t xml:space="preserve">\sin(0)</w:t>
+      </w:r>
+    </w:p>
+    <w:p>
+      <w:pPr>
+        <w:spacing w:after="60" w:before="60" w:line="360"/>
+      </w:pPr>
+      <w:r>
+        <w:rPr>
+          <w:rFonts w:ascii="SimSun" w:cs="SimSun" w:eastAsia="SimSun" w:hAnsi="SimSun"/>
+          <w:b w:val="false"/>
+          <w:bCs w:val="false"/>
+          <w:i w:val="false"/>
+          <w:iCs w:val="false"/>
+          <w:sz w:val="24"/>
+          <w:szCs w:val="24"/>
+        </w:rPr>
+        <w:t xml:space="preserve">  - 奇数Dim：</w:t>
+      </w:r>
+      <w:r>
+        <w:rPr>
+          <w:rFonts w:ascii="SimSun" w:cs="SimSun" w:eastAsia="SimSun" w:hAnsi="SimSun"/>
+          <w:b w:val="false"/>
+          <w:bCs w:val="false"/>
+          <w:i/>
+          <w:iCs/>
+          <w:sz w:val="24"/>
+          <w:szCs w:val="24"/>
+        </w:rPr>
+        <w:t xml:space="preserve">\cos(0)</w:t>
       </w:r>
     </w:p>
     <w:p>
@@ -4918,24 +6171,48 @@
           <w:sz w:val="24"/>
           <w:szCs w:val="24"/>
         </w:rPr>
-        <w:t xml:space="preserve">  - 偶数Dim：$\sin(p / 10000^{2i/128})$</w:t>
-      </w:r>
-    </w:p>
-    <w:p>
-      <w:pPr>
-        <w:spacing w:after="60" w:before="60" w:line="360"/>
-      </w:pPr>
-      <w:r>
-        <w:rPr>
-          <w:rFonts w:ascii="SimSun" w:cs="SimSun" w:eastAsia="SimSun" w:hAnsi="SimSun"/>
-          <w:b w:val="false"/>
-          <w:bCs w:val="false"/>
-          <w:i w:val="false"/>
-          <w:iCs w:val="false"/>
-          <w:sz w:val="24"/>
-          <w:szCs w:val="24"/>
-        </w:rPr>
-        <w:t xml:space="preserve">  - 奇数Dim：$\cos(p / 10000^{2i/128})$</w:t>
+        <w:t xml:space="preserve">  - 偶数Dim：</w:t>
+      </w:r>
+      <w:r>
+        <w:rPr>
+          <w:rFonts w:ascii="SimSun" w:cs="SimSun" w:eastAsia="SimSun" w:hAnsi="SimSun"/>
+          <w:b w:val="false"/>
+          <w:bCs w:val="false"/>
+          <w:i/>
+          <w:iCs/>
+          <w:sz w:val="24"/>
+          <w:szCs w:val="24"/>
+        </w:rPr>
+        <w:t xml:space="preserve">\sin(p / 10000^{2i/128})</w:t>
+      </w:r>
+    </w:p>
+    <w:p>
+      <w:pPr>
+        <w:spacing w:after="60" w:before="60" w:line="360"/>
+      </w:pPr>
+      <w:r>
+        <w:rPr>
+          <w:rFonts w:ascii="SimSun" w:cs="SimSun" w:eastAsia="SimSun" w:hAnsi="SimSun"/>
+          <w:b w:val="false"/>
+          <w:bCs w:val="false"/>
+          <w:i w:val="false"/>
+          <w:iCs w:val="false"/>
+          <w:sz w:val="24"/>
+          <w:szCs w:val="24"/>
+        </w:rPr>
+        <w:t xml:space="preserve">  - 奇数Dim：</w:t>
+      </w:r>
+      <w:r>
+        <w:rPr>
+          <w:rFonts w:ascii="SimSun" w:cs="SimSun" w:eastAsia="SimSun" w:hAnsi="SimSun"/>
+          <w:b w:val="false"/>
+          <w:bCs w:val="false"/>
+          <w:i/>
+          <w:iCs/>
+          <w:sz w:val="24"/>
+          <w:szCs w:val="24"/>
+        </w:rPr>
+        <w:t xml:space="preserve">\cos(p / 10000^{2i/128})</w:t>
       </w:r>
     </w:p>
     <w:p>
@@ -4986,7 +6263,31 @@
           <w:sz w:val="24"/>
           <w:szCs w:val="24"/>
         </w:rPr>
-        <w:t xml:space="preserve">- 输入投影nn.Linear(40→128)：$40×128 + 128 = 5,248$参数（以log_mel=40为例）</w:t>
+        <w:t xml:space="preserve">- 输入投影nn.Linear(40→128)：</w:t>
+      </w:r>
+      <w:r>
+        <w:rPr>
+          <w:rFonts w:ascii="SimSun" w:cs="SimSun" w:eastAsia="SimSun" w:hAnsi="SimSun"/>
+          <w:b w:val="false"/>
+          <w:bCs w:val="false"/>
+          <w:i/>
+          <w:iCs/>
+          <w:sz w:val="24"/>
+          <w:szCs w:val="24"/>
+        </w:rPr>
+        <w:t xml:space="preserve">40×128 + 128 = 5,248</w:t>
+      </w:r>
+      <w:r>
+        <w:rPr>
+          <w:rFonts w:ascii="SimSun" w:cs="SimSun" w:eastAsia="SimSun" w:hAnsi="SimSun"/>
+          <w:b w:val="false"/>
+          <w:bCs w:val="false"/>
+          <w:i w:val="false"/>
+          <w:iCs w:val="false"/>
+          <w:sz w:val="24"/>
+          <w:szCs w:val="24"/>
+        </w:rPr>
+        <w:t xml:space="preserve">参数（以log_mel=40为例）</w:t>
       </w:r>
     </w:p>
     <w:p>
@@ -5037,75 +6338,195 @@
           <w:sz w:val="24"/>
           <w:szCs w:val="24"/>
         </w:rPr>
-        <w:t xml:space="preserve">  - 自注意力QKV投影（每层）：$3×(128×128/4)×4 = 49,152$参数（另有bias）</w:t>
-      </w:r>
-    </w:p>
-    <w:p>
-      <w:pPr>
-        <w:spacing w:after="60" w:before="60" w:line="360"/>
-      </w:pPr>
-      <w:r>
-        <w:rPr>
-          <w:rFonts w:ascii="SimSun" w:cs="SimSun" w:eastAsia="SimSun" w:hAnsi="SimSun"/>
-          <w:b w:val="false"/>
-          <w:bCs w:val="false"/>
-          <w:i w:val="false"/>
-          <w:iCs w:val="false"/>
-          <w:sz w:val="24"/>
-          <w:szCs w:val="24"/>
-        </w:rPr>
-        <w:t xml:space="preserve">  - 输出投影：$128×128 + 128 = 16,512$参数</w:t>
-      </w:r>
-    </w:p>
-    <w:p>
-      <w:pPr>
-        <w:spacing w:after="60" w:before="60" w:line="360"/>
-      </w:pPr>
-      <w:r>
-        <w:rPr>
-          <w:rFonts w:ascii="SimSun" w:cs="SimSun" w:eastAsia="SimSun" w:hAnsi="SimSun"/>
-          <w:b w:val="false"/>
-          <w:bCs w:val="false"/>
-          <w:i w:val="false"/>
-          <w:iCs w:val="false"/>
-          <w:sz w:val="24"/>
-          <w:szCs w:val="24"/>
-        </w:rPr>
-        <w:t xml:space="preserve">  - FFN1：$128×512 + 512 = 66,048$参数</w:t>
-      </w:r>
-    </w:p>
-    <w:p>
-      <w:pPr>
-        <w:spacing w:after="60" w:before="60" w:line="360"/>
-      </w:pPr>
-      <w:r>
-        <w:rPr>
-          <w:rFonts w:ascii="SimSun" w:cs="SimSun" w:eastAsia="SimSun" w:hAnsi="SimSun"/>
-          <w:b w:val="false"/>
-          <w:bCs w:val="false"/>
-          <w:i w:val="false"/>
-          <w:iCs w:val="false"/>
-          <w:sz w:val="24"/>
-          <w:szCs w:val="24"/>
-        </w:rPr>
-        <w:t xml:space="preserve">  - FFN2：$512×128 + 128 = 65,664$参数</w:t>
-      </w:r>
-    </w:p>
-    <w:p>
-      <w:pPr>
-        <w:spacing w:after="60" w:before="60" w:line="360"/>
-      </w:pPr>
-      <w:r>
-        <w:rPr>
-          <w:rFonts w:ascii="SimSun" w:cs="SimSun" w:eastAsia="SimSun" w:hAnsi="SimSun"/>
-          <w:b w:val="false"/>
-          <w:bCs w:val="false"/>
-          <w:i w:val="false"/>
-          <w:iCs w:val="false"/>
-          <w:sz w:val="24"/>
-          <w:szCs w:val="24"/>
-        </w:rPr>
-        <w:t xml:space="preserve">  - LayerNorm×2：$128×2 + 128×2 = 512$参数</w:t>
+        <w:t xml:space="preserve">  - 自注意力QKV投影（每层）：</w:t>
+      </w:r>
+      <w:r>
+        <w:rPr>
+          <w:rFonts w:ascii="SimSun" w:cs="SimSun" w:eastAsia="SimSun" w:hAnsi="SimSun"/>
+          <w:b w:val="false"/>
+          <w:bCs w:val="false"/>
+          <w:i/>
+          <w:iCs/>
+          <w:sz w:val="24"/>
+          <w:szCs w:val="24"/>
+        </w:rPr>
+        <w:t xml:space="preserve">3×(128×128/4)×4 = 49,152</w:t>
+      </w:r>
+      <w:r>
+        <w:rPr>
+          <w:rFonts w:ascii="SimSun" w:cs="SimSun" w:eastAsia="SimSun" w:hAnsi="SimSun"/>
+          <w:b w:val="false"/>
+          <w:bCs w:val="false"/>
+          <w:i w:val="false"/>
+          <w:iCs w:val="false"/>
+          <w:sz w:val="24"/>
+          <w:szCs w:val="24"/>
+        </w:rPr>
+        <w:t xml:space="preserve">参数（另有bias）</w:t>
+      </w:r>
+    </w:p>
+    <w:p>
+      <w:pPr>
+        <w:spacing w:after="60" w:before="60" w:line="360"/>
+      </w:pPr>
+      <w:r>
+        <w:rPr>
+          <w:rFonts w:ascii="SimSun" w:cs="SimSun" w:eastAsia="SimSun" w:hAnsi="SimSun"/>
+          <w:b w:val="false"/>
+          <w:bCs w:val="false"/>
+          <w:i w:val="false"/>
+          <w:iCs w:val="false"/>
+          <w:sz w:val="24"/>
+          <w:szCs w:val="24"/>
+        </w:rPr>
+        <w:t xml:space="preserve">  - 输出投影：</w:t>
+      </w:r>
+      <w:r>
+        <w:rPr>
+          <w:rFonts w:ascii="SimSun" w:cs="SimSun" w:eastAsia="SimSun" w:hAnsi="SimSun"/>
+          <w:b w:val="false"/>
+          <w:bCs w:val="false"/>
+          <w:i/>
+          <w:iCs/>
+          <w:sz w:val="24"/>
+          <w:szCs w:val="24"/>
+        </w:rPr>
+        <w:t xml:space="preserve">128×128 + 128 = 16,512</w:t>
+      </w:r>
+      <w:r>
+        <w:rPr>
+          <w:rFonts w:ascii="SimSun" w:cs="SimSun" w:eastAsia="SimSun" w:hAnsi="SimSun"/>
+          <w:b w:val="false"/>
+          <w:bCs w:val="false"/>
+          <w:i w:val="false"/>
+          <w:iCs w:val="false"/>
+          <w:sz w:val="24"/>
+          <w:szCs w:val="24"/>
+        </w:rPr>
+        <w:t xml:space="preserve">参数</w:t>
+      </w:r>
+    </w:p>
+    <w:p>
+      <w:pPr>
+        <w:spacing w:after="60" w:before="60" w:line="360"/>
+      </w:pPr>
+      <w:r>
+        <w:rPr>
+          <w:rFonts w:ascii="SimSun" w:cs="SimSun" w:eastAsia="SimSun" w:hAnsi="SimSun"/>
+          <w:b w:val="false"/>
+          <w:bCs w:val="false"/>
+          <w:i w:val="false"/>
+          <w:iCs w:val="false"/>
+          <w:sz w:val="24"/>
+          <w:szCs w:val="24"/>
+        </w:rPr>
+        <w:t xml:space="preserve">  - FFN1：</w:t>
+      </w:r>
+      <w:r>
+        <w:rPr>
+          <w:rFonts w:ascii="SimSun" w:cs="SimSun" w:eastAsia="SimSun" w:hAnsi="SimSun"/>
+          <w:b w:val="false"/>
+          <w:bCs w:val="false"/>
+          <w:i/>
+          <w:iCs/>
+          <w:sz w:val="24"/>
+          <w:szCs w:val="24"/>
+        </w:rPr>
+        <w:t xml:space="preserve">128×512 + 512 = 66,048</w:t>
+      </w:r>
+      <w:r>
+        <w:rPr>
+          <w:rFonts w:ascii="SimSun" w:cs="SimSun" w:eastAsia="SimSun" w:hAnsi="SimSun"/>
+          <w:b w:val="false"/>
+          <w:bCs w:val="false"/>
+          <w:i w:val="false"/>
+          <w:iCs w:val="false"/>
+          <w:sz w:val="24"/>
+          <w:szCs w:val="24"/>
+        </w:rPr>
+        <w:t xml:space="preserve">参数</w:t>
+      </w:r>
+    </w:p>
+    <w:p>
+      <w:pPr>
+        <w:spacing w:after="60" w:before="60" w:line="360"/>
+      </w:pPr>
+      <w:r>
+        <w:rPr>
+          <w:rFonts w:ascii="SimSun" w:cs="SimSun" w:eastAsia="SimSun" w:hAnsi="SimSun"/>
+          <w:b w:val="false"/>
+          <w:bCs w:val="false"/>
+          <w:i w:val="false"/>
+          <w:iCs w:val="false"/>
+          <w:sz w:val="24"/>
+          <w:szCs w:val="24"/>
+        </w:rPr>
+        <w:t xml:space="preserve">  - FFN2：</w:t>
+      </w:r>
+      <w:r>
+        <w:rPr>
+          <w:rFonts w:ascii="SimSun" w:cs="SimSun" w:eastAsia="SimSun" w:hAnsi="SimSun"/>
+          <w:b w:val="false"/>
+          <w:bCs w:val="false"/>
+          <w:i/>
+          <w:iCs/>
+          <w:sz w:val="24"/>
+          <w:szCs w:val="24"/>
+        </w:rPr>
+        <w:t xml:space="preserve">512×128 + 128 = 65,664</w:t>
+      </w:r>
+      <w:r>
+        <w:rPr>
+          <w:rFonts w:ascii="SimSun" w:cs="SimSun" w:eastAsia="SimSun" w:hAnsi="SimSun"/>
+          <w:b w:val="false"/>
+          <w:bCs w:val="false"/>
+          <w:i w:val="false"/>
+          <w:iCs w:val="false"/>
+          <w:sz w:val="24"/>
+          <w:szCs w:val="24"/>
+        </w:rPr>
+        <w:t xml:space="preserve">参数</w:t>
+      </w:r>
+    </w:p>
+    <w:p>
+      <w:pPr>
+        <w:spacing w:after="60" w:before="60" w:line="360"/>
+      </w:pPr>
+      <w:r>
+        <w:rPr>
+          <w:rFonts w:ascii="SimSun" w:cs="SimSun" w:eastAsia="SimSun" w:hAnsi="SimSun"/>
+          <w:b w:val="false"/>
+          <w:bCs w:val="false"/>
+          <w:i w:val="false"/>
+          <w:iCs w:val="false"/>
+          <w:sz w:val="24"/>
+          <w:szCs w:val="24"/>
+        </w:rPr>
+        <w:t xml:space="preserve">  - LayerNorm×2：</w:t>
+      </w:r>
+      <w:r>
+        <w:rPr>
+          <w:rFonts w:ascii="SimSun" w:cs="SimSun" w:eastAsia="SimSun" w:hAnsi="SimSun"/>
+          <w:b w:val="false"/>
+          <w:bCs w:val="false"/>
+          <w:i/>
+          <w:iCs/>
+          <w:sz w:val="24"/>
+          <w:szCs w:val="24"/>
+        </w:rPr>
+        <w:t xml:space="preserve">128×2 + 128×2 = 512</w:t>
+      </w:r>
+      <w:r>
+        <w:rPr>
+          <w:rFonts w:ascii="SimSun" w:cs="SimSun" w:eastAsia="SimSun" w:hAnsi="SimSun"/>
+          <w:b w:val="false"/>
+          <w:bCs w:val="false"/>
+          <w:i w:val="false"/>
+          <w:iCs w:val="false"/>
+          <w:sz w:val="24"/>
+          <w:szCs w:val="24"/>
+        </w:rPr>
+        <w:t xml:space="preserve">参数</w:t>
       </w:r>
     </w:p>
     <w:p>
@@ -5156,7 +6577,31 @@
           <w:sz w:val="24"/>
           <w:szCs w:val="24"/>
         </w:rPr>
-        <w:t xml:space="preserve">- Mask输出层nn.Linear(128→257)：$128×257 + 257 = 33,153$参数</w:t>
+        <w:t xml:space="preserve">- Mask输出层nn.Linear(128→257)：</w:t>
+      </w:r>
+      <w:r>
+        <w:rPr>
+          <w:rFonts w:ascii="SimSun" w:cs="SimSun" w:eastAsia="SimSun" w:hAnsi="SimSun"/>
+          <w:b w:val="false"/>
+          <w:bCs w:val="false"/>
+          <w:i/>
+          <w:iCs/>
+          <w:sz w:val="24"/>
+          <w:szCs w:val="24"/>
+        </w:rPr>
+        <w:t xml:space="preserve">128×257 + 257 = 33,153</w:t>
+      </w:r>
+      <w:r>
+        <w:rPr>
+          <w:rFonts w:ascii="SimSun" w:cs="SimSun" w:eastAsia="SimSun" w:hAnsi="SimSun"/>
+          <w:b w:val="false"/>
+          <w:bCs w:val="false"/>
+          <w:i w:val="false"/>
+          <w:iCs w:val="false"/>
+          <w:sz w:val="24"/>
+          <w:szCs w:val="24"/>
+        </w:rPr>
+        <w:t xml:space="preserve">参数</w:t>
       </w:r>
     </w:p>
     <w:p>
@@ -5629,31 +7074,55 @@
           <w:sz w:val="24"/>
           <w:szCs w:val="24"/>
         </w:rPr>
-        <w:t xml:space="preserve">不同音频样本经过STFT后帧数$T$不同。</w:t>
-      </w:r>
-      <w:r>
-        <w:rPr>
-          <w:rFonts w:ascii="SimSun" w:cs="SimSun" w:eastAsia="SimSun" w:hAnsi="SimSun"/>
-          <w:b w:val="false"/>
-          <w:bCs w:val="false"/>
-          <w:i w:val="false"/>
-          <w:iCs w:val="false"/>
-          <w:sz w:val="24"/>
-          <w:szCs w:val="24"/>
-        </w:rPr>
-        <w:t xml:space="preserve">collate_batch</w:t>
-      </w:r>
-      <w:r>
-        <w:rPr>
-          <w:rFonts w:ascii="SimSun" w:cs="SimSun" w:eastAsia="SimSun" w:hAnsi="SimSun"/>
-          <w:b w:val="false"/>
-          <w:bCs w:val="false"/>
-          <w:i w:val="false"/>
-          <w:iCs w:val="false"/>
-          <w:sz w:val="24"/>
-          <w:szCs w:val="24"/>
-        </w:rPr>
-        <w:t xml:space="preserve">函数实现变长批处理——在批次内找最大帧数$T_{max}$，将短序列在时间轴后方进行Zero Padding（置0），并生成一个布尔型</w:t>
+        <w:t xml:space="preserve">不同音频样本经过STFT后帧数</w:t>
+      </w:r>
+      <w:r>
+        <w:rPr>
+          <w:rFonts w:ascii="SimSun" w:cs="SimSun" w:eastAsia="SimSun" w:hAnsi="SimSun"/>
+          <w:b w:val="false"/>
+          <w:bCs w:val="false"/>
+          <w:i/>
+          <w:iCs/>
+          <w:sz w:val="24"/>
+          <w:szCs w:val="24"/>
+        </w:rPr>
+        <w:t xml:space="preserve">T</w:t>
+      </w:r>
+      <w:r>
+        <w:rPr>
+          <w:rFonts w:ascii="SimSun" w:cs="SimSun" w:eastAsia="SimSun" w:hAnsi="SimSun"/>
+          <w:b w:val="false"/>
+          <w:bCs w:val="false"/>
+          <w:i w:val="false"/>
+          <w:iCs w:val="false"/>
+          <w:sz w:val="24"/>
+          <w:szCs w:val="24"/>
+        </w:rPr>
+        <w:t xml:space="preserve">不同。`collate_batch`函数实现变长批处理——在批次内找最大帧数</w:t>
+      </w:r>
+      <w:r>
+        <w:rPr>
+          <w:rFonts w:ascii="SimSun" w:cs="SimSun" w:eastAsia="SimSun" w:hAnsi="SimSun"/>
+          <w:b w:val="false"/>
+          <w:bCs w:val="false"/>
+          <w:i/>
+          <w:iCs/>
+          <w:sz w:val="24"/>
+          <w:szCs w:val="24"/>
+        </w:rPr>
+        <w:t xml:space="preserve">T_{max}</w:t>
+      </w:r>
+      <w:r>
+        <w:rPr>
+          <w:rFonts w:ascii="SimSun" w:cs="SimSun" w:eastAsia="SimSun" w:hAnsi="SimSun"/>
+          <w:b w:val="false"/>
+          <w:bCs w:val="false"/>
+          <w:i w:val="false"/>
+          <w:iCs w:val="false"/>
+          <w:sz w:val="24"/>
+          <w:szCs w:val="24"/>
+        </w:rPr>
+        <w:t xml:space="preserve">，将短序列在时间轴后方进行Zero Padding（置0），并生成一个布尔型</w:t>
       </w:r>
       <w:r>
         <w:rPr>
@@ -5800,7 +7269,55 @@
           <w:sz w:val="24"/>
           <w:szCs w:val="24"/>
         </w:rPr>
-        <w:t xml:space="preserve">：Adam，学习率初始值$\text{lr}=1\times10^{-3}$，动量参数使用默认值（$\beta_1=0.9, \beta_2=0.999$）。</w:t>
+        <w:t xml:space="preserve">：Adam，学习率初始值</w:t>
+      </w:r>
+      <w:r>
+        <w:rPr>
+          <w:rFonts w:ascii="SimSun" w:cs="SimSun" w:eastAsia="SimSun" w:hAnsi="SimSun"/>
+          <w:b w:val="false"/>
+          <w:bCs w:val="false"/>
+          <w:i/>
+          <w:iCs/>
+          <w:sz w:val="24"/>
+          <w:szCs w:val="24"/>
+        </w:rPr>
+        <w:t xml:space="preserve">\text{lr}=1\times10^{-3}</w:t>
+      </w:r>
+      <w:r>
+        <w:rPr>
+          <w:rFonts w:ascii="SimSun" w:cs="SimSun" w:eastAsia="SimSun" w:hAnsi="SimSun"/>
+          <w:b w:val="false"/>
+          <w:bCs w:val="false"/>
+          <w:i w:val="false"/>
+          <w:iCs w:val="false"/>
+          <w:sz w:val="24"/>
+          <w:szCs w:val="24"/>
+        </w:rPr>
+        <w:t xml:space="preserve">，动量参数使用默认值（</w:t>
+      </w:r>
+      <w:r>
+        <w:rPr>
+          <w:rFonts w:ascii="SimSun" w:cs="SimSun" w:eastAsia="SimSun" w:hAnsi="SimSun"/>
+          <w:b w:val="false"/>
+          <w:bCs w:val="false"/>
+          <w:i/>
+          <w:iCs/>
+          <w:sz w:val="24"/>
+          <w:szCs w:val="24"/>
+        </w:rPr>
+        <w:t xml:space="preserve">\beta_1=0.9, \beta_2=0.999</w:t>
+      </w:r>
+      <w:r>
+        <w:rPr>
+          <w:rFonts w:ascii="SimSun" w:cs="SimSun" w:eastAsia="SimSun" w:hAnsi="SimSun"/>
+          <w:b w:val="false"/>
+          <w:bCs w:val="false"/>
+          <w:i w:val="false"/>
+          <w:iCs w:val="false"/>
+          <w:sz w:val="24"/>
+          <w:szCs w:val="24"/>
+        </w:rPr>
+        <w:t xml:space="preserve">）。</w:t>
       </w:r>
     </w:p>
     <w:p>
@@ -5938,24 +7455,192 @@
           <w:sz w:val="24"/>
           <w:szCs w:val="24"/>
         </w:rPr>
-        <w:t xml:space="preserve">- 频域加权L1 Loss：引入频率权重向量$w[f] = 1.0 + 2.0 \times (1.0 - f/F)$，其中$f$为频率索引，$F=257$为总频点数。权重从DC处的约3.0线性衰减至Nyquist频率处的约1.0，使低频（语音能量集中区）对损失的贡献更大。</w:t>
-      </w:r>
-    </w:p>
-    <w:p>
-      <w:pPr>
-        <w:spacing w:after="60" w:before="60" w:line="360"/>
-      </w:pPr>
-      <w:r>
-        <w:rPr>
-          <w:rFonts w:ascii="SimSun" w:cs="SimSun" w:eastAsia="SimSun" w:hAnsi="SimSun"/>
-          <w:b w:val="false"/>
-          <w:bCs w:val="false"/>
-          <w:i w:val="false"/>
-          <w:iCs w:val="false"/>
-          <w:sz w:val="24"/>
-          <w:szCs w:val="24"/>
-        </w:rPr>
-        <w:t xml:space="preserve">- 余弦退火学习率调度（Cosine Annealing LR）：$\eta_t = \eta_{min} + \frac{\eta_{max} - \eta_{min}}{2}(1 + \cos(\frac{t}{T}\pi))$，其中$\eta_{max}=10^{-3}$，$\eta_{min}=10^{-6}$，$T=30$为总Epoch数。该调度使学习率按照余弦曲线从最大值平滑衰减至最小值，前期快速收敛、后期精细微调。</w:t>
+        <w:t xml:space="preserve">- 频域加权L1 Loss：引入频率权重向量</w:t>
+      </w:r>
+      <w:r>
+        <w:rPr>
+          <w:rFonts w:ascii="SimSun" w:cs="SimSun" w:eastAsia="SimSun" w:hAnsi="SimSun"/>
+          <w:b w:val="false"/>
+          <w:bCs w:val="false"/>
+          <w:i/>
+          <w:iCs/>
+          <w:sz w:val="24"/>
+          <w:szCs w:val="24"/>
+        </w:rPr>
+        <w:t xml:space="preserve">w[f] = 1.0 + 2.0 \times (1.0 - f/F)</w:t>
+      </w:r>
+      <w:r>
+        <w:rPr>
+          <w:rFonts w:ascii="SimSun" w:cs="SimSun" w:eastAsia="SimSun" w:hAnsi="SimSun"/>
+          <w:b w:val="false"/>
+          <w:bCs w:val="false"/>
+          <w:i w:val="false"/>
+          <w:iCs w:val="false"/>
+          <w:sz w:val="24"/>
+          <w:szCs w:val="24"/>
+        </w:rPr>
+        <w:t xml:space="preserve">，其中</w:t>
+      </w:r>
+      <w:r>
+        <w:rPr>
+          <w:rFonts w:ascii="SimSun" w:cs="SimSun" w:eastAsia="SimSun" w:hAnsi="SimSun"/>
+          <w:b w:val="false"/>
+          <w:bCs w:val="false"/>
+          <w:i/>
+          <w:iCs/>
+          <w:sz w:val="24"/>
+          <w:szCs w:val="24"/>
+        </w:rPr>
+        <w:t xml:space="preserve">f</w:t>
+      </w:r>
+      <w:r>
+        <w:rPr>
+          <w:rFonts w:ascii="SimSun" w:cs="SimSun" w:eastAsia="SimSun" w:hAnsi="SimSun"/>
+          <w:b w:val="false"/>
+          <w:bCs w:val="false"/>
+          <w:i w:val="false"/>
+          <w:iCs w:val="false"/>
+          <w:sz w:val="24"/>
+          <w:szCs w:val="24"/>
+        </w:rPr>
+        <w:t xml:space="preserve">为频率索引，</w:t>
+      </w:r>
+      <w:r>
+        <w:rPr>
+          <w:rFonts w:ascii="SimSun" w:cs="SimSun" w:eastAsia="SimSun" w:hAnsi="SimSun"/>
+          <w:b w:val="false"/>
+          <w:bCs w:val="false"/>
+          <w:i/>
+          <w:iCs/>
+          <w:sz w:val="24"/>
+          <w:szCs w:val="24"/>
+        </w:rPr>
+        <w:t xml:space="preserve">F=257</w:t>
+      </w:r>
+      <w:r>
+        <w:rPr>
+          <w:rFonts w:ascii="SimSun" w:cs="SimSun" w:eastAsia="SimSun" w:hAnsi="SimSun"/>
+          <w:b w:val="false"/>
+          <w:bCs w:val="false"/>
+          <w:i w:val="false"/>
+          <w:iCs w:val="false"/>
+          <w:sz w:val="24"/>
+          <w:szCs w:val="24"/>
+        </w:rPr>
+        <w:t xml:space="preserve">为总频点数。权重从DC处的约3.0线性衰减至Nyquist频率处的约1.0，使低频（语音能量集中区）对损失的贡献更大。</w:t>
+      </w:r>
+    </w:p>
+    <w:p>
+      <w:pPr>
+        <w:spacing w:after="60" w:before="60" w:line="360"/>
+      </w:pPr>
+      <w:r>
+        <w:rPr>
+          <w:rFonts w:ascii="SimSun" w:cs="SimSun" w:eastAsia="SimSun" w:hAnsi="SimSun"/>
+          <w:b w:val="false"/>
+          <w:bCs w:val="false"/>
+          <w:i w:val="false"/>
+          <w:iCs w:val="false"/>
+          <w:sz w:val="24"/>
+          <w:szCs w:val="24"/>
+        </w:rPr>
+        <w:t xml:space="preserve">- 余弦退火学习率调度（Cosine Annealing LR）：</w:t>
+      </w:r>
+      <w:r>
+        <w:rPr>
+          <w:rFonts w:ascii="SimSun" w:cs="SimSun" w:eastAsia="SimSun" w:hAnsi="SimSun"/>
+          <w:b w:val="false"/>
+          <w:bCs w:val="false"/>
+          <w:i/>
+          <w:iCs/>
+          <w:sz w:val="24"/>
+          <w:szCs w:val="24"/>
+        </w:rPr>
+        <w:t xml:space="preserve">\eta_t = \eta_{min} + \frac{\eta_{max} - \eta_{min}}{2}(1 + \cos(\frac{t}{T}\pi))</w:t>
+      </w:r>
+      <w:r>
+        <w:rPr>
+          <w:rFonts w:ascii="SimSun" w:cs="SimSun" w:eastAsia="SimSun" w:hAnsi="SimSun"/>
+          <w:b w:val="false"/>
+          <w:bCs w:val="false"/>
+          <w:i w:val="false"/>
+          <w:iCs w:val="false"/>
+          <w:sz w:val="24"/>
+          <w:szCs w:val="24"/>
+        </w:rPr>
+        <w:t xml:space="preserve">，其中</w:t>
+      </w:r>
+      <w:r>
+        <w:rPr>
+          <w:rFonts w:ascii="SimSun" w:cs="SimSun" w:eastAsia="SimSun" w:hAnsi="SimSun"/>
+          <w:b w:val="false"/>
+          <w:bCs w:val="false"/>
+          <w:i/>
+          <w:iCs/>
+          <w:sz w:val="24"/>
+          <w:szCs w:val="24"/>
+        </w:rPr>
+        <w:t xml:space="preserve">\eta_{max}=10^{-3}</w:t>
+      </w:r>
+      <w:r>
+        <w:rPr>
+          <w:rFonts w:ascii="SimSun" w:cs="SimSun" w:eastAsia="SimSun" w:hAnsi="SimSun"/>
+          <w:b w:val="false"/>
+          <w:bCs w:val="false"/>
+          <w:i w:val="false"/>
+          <w:iCs w:val="false"/>
+          <w:sz w:val="24"/>
+          <w:szCs w:val="24"/>
+        </w:rPr>
+        <w:t xml:space="preserve">，</w:t>
+      </w:r>
+      <w:r>
+        <w:rPr>
+          <w:rFonts w:ascii="SimSun" w:cs="SimSun" w:eastAsia="SimSun" w:hAnsi="SimSun"/>
+          <w:b w:val="false"/>
+          <w:bCs w:val="false"/>
+          <w:i/>
+          <w:iCs/>
+          <w:sz w:val="24"/>
+          <w:szCs w:val="24"/>
+        </w:rPr>
+        <w:t xml:space="preserve">\eta_{min}=10^{-6}</w:t>
+      </w:r>
+      <w:r>
+        <w:rPr>
+          <w:rFonts w:ascii="SimSun" w:cs="SimSun" w:eastAsia="SimSun" w:hAnsi="SimSun"/>
+          <w:b w:val="false"/>
+          <w:bCs w:val="false"/>
+          <w:i w:val="false"/>
+          <w:iCs w:val="false"/>
+          <w:sz w:val="24"/>
+          <w:szCs w:val="24"/>
+        </w:rPr>
+        <w:t xml:space="preserve">，</w:t>
+      </w:r>
+      <w:r>
+        <w:rPr>
+          <w:rFonts w:ascii="SimSun" w:cs="SimSun" w:eastAsia="SimSun" w:hAnsi="SimSun"/>
+          <w:b w:val="false"/>
+          <w:bCs w:val="false"/>
+          <w:i/>
+          <w:iCs/>
+          <w:sz w:val="24"/>
+          <w:szCs w:val="24"/>
+        </w:rPr>
+        <w:t xml:space="preserve">T=30</w:t>
+      </w:r>
+      <w:r>
+        <w:rPr>
+          <w:rFonts w:ascii="SimSun" w:cs="SimSun" w:eastAsia="SimSun" w:hAnsi="SimSun"/>
+          <w:b w:val="false"/>
+          <w:bCs w:val="false"/>
+          <w:i w:val="false"/>
+          <w:iCs w:val="false"/>
+          <w:sz w:val="24"/>
+          <w:szCs w:val="24"/>
+        </w:rPr>
+        <w:t xml:space="preserve">为总Epoch数。该调度使学习率按照余弦曲线从最大值平滑衰减至最小值，前期快速收敛、后期精细微调。</w:t>
       </w:r>
     </w:p>
     <w:p>
@@ -6967,7 +8652,31 @@
           <w:sz w:val="24"/>
           <w:szCs w:val="24"/>
         </w:rPr>
-        <w:t xml:space="preserve">：信号失真比，以dB为单位，$SDR = 10 \cdot \log_{10}\left(\frac{\sum s_{clean}^2}{\sum (s_{clean} - s_{enhanced})^2}\right)$，越高代表降噪后的信号越接近原始干净语音。</w:t>
+        <w:t xml:space="preserve">：信号失真比，以dB为单位，</w:t>
+      </w:r>
+      <w:r>
+        <w:rPr>
+          <w:rFonts w:ascii="SimSun" w:cs="SimSun" w:eastAsia="SimSun" w:hAnsi="SimSun"/>
+          <w:b w:val="false"/>
+          <w:bCs w:val="false"/>
+          <w:i/>
+          <w:iCs/>
+          <w:sz w:val="24"/>
+          <w:szCs w:val="24"/>
+        </w:rPr>
+        <w:t xml:space="preserve">SDR = 10 \cdot \log_{10}\left(\frac{\sum s_{clean}^2}{\sum (s_{clean} - s_{enhanced})^2}\right)</w:t>
+      </w:r>
+      <w:r>
+        <w:rPr>
+          <w:rFonts w:ascii="SimSun" w:cs="SimSun" w:eastAsia="SimSun" w:hAnsi="SimSun"/>
+          <w:b w:val="false"/>
+          <w:bCs w:val="false"/>
+          <w:i w:val="false"/>
+          <w:iCs w:val="false"/>
+          <w:sz w:val="24"/>
+          <w:szCs w:val="24"/>
+        </w:rPr>
+        <w:t xml:space="preserve">，越高代表降噪后的信号越接近原始干净语音。</w:t>
       </w:r>
     </w:p>
     <w:p>

</xml_diff>

<commit_message>
Add Transformer speech enhancement references from literature review
</commit_message>
<xml_diff>
--- a/毕业论文_完整版.docx
+++ b/毕业论文_完整版.docx
@@ -3811,89 +3811,7 @@
           <w:sz w:val="24"/>
           <w:szCs w:val="24"/>
         </w:rPr>
-        <w:t xml:space="preserve">#### 2.5.1 PESQ（语音质量的感知评估）</w:t>
-      </w:r>
-    </w:p>
-    <w:p>
-      <w:pPr>
-        <w:spacing w:after="60" w:before="60" w:line="360"/>
-      </w:pPr>
-      <w:r>
-        <w:rPr>
-          <w:rFonts w:ascii="SimSun" w:cs="SimSun" w:eastAsia="SimSun" w:hAnsi="SimSun"/>
-          <w:b w:val="false"/>
-          <w:bCs w:val="false"/>
-          <w:i w:val="false"/>
-          <w:iCs w:val="false"/>
-          <w:sz w:val="24"/>
-          <w:szCs w:val="24"/>
-        </w:rPr>
-        <w:t xml:space="preserve">PESQ（Perceptual Evaluation of Speech Quality）由ITU-T P.862标准定义，是当前最广泛使用的客观语音质量评价指标之一。PESQ结合了听觉感知模型，比较降噪后语音与干净参考语音之间的差异，输出分数范围约为</w:t>
-      </w:r>
-      <w:r>
-        <w:rPr>
-          <w:rFonts w:ascii="SimSun" w:cs="SimSun" w:eastAsia="SimSun" w:hAnsi="SimSun"/>
-          <w:b w:val="false"/>
-          <w:bCs w:val="false"/>
-          <w:i/>
-          <w:iCs/>
-          <w:sz w:val="24"/>
-          <w:szCs w:val="24"/>
-        </w:rPr>
-        <w:t xml:space="preserve">-0.5</w:t>
-      </w:r>
-      <w:r>
-        <w:rPr>
-          <w:rFonts w:ascii="SimSun" w:cs="SimSun" w:eastAsia="SimSun" w:hAnsi="SimSun"/>
-          <w:b w:val="false"/>
-          <w:bCs w:val="false"/>
-          <w:i w:val="false"/>
-          <w:iCs w:val="false"/>
-          <w:sz w:val="24"/>
-          <w:szCs w:val="24"/>
-        </w:rPr>
-        <w:t xml:space="preserve">至</w:t>
-      </w:r>
-      <w:r>
-        <w:rPr>
-          <w:rFonts w:ascii="SimSun" w:cs="SimSun" w:eastAsia="SimSun" w:hAnsi="SimSun"/>
-          <w:b w:val="false"/>
-          <w:bCs w:val="false"/>
-          <w:i/>
-          <w:iCs/>
-          <w:sz w:val="24"/>
-          <w:szCs w:val="24"/>
-        </w:rPr>
-        <w:t xml:space="preserve">4.5</w:t>
-      </w:r>
-      <w:r>
-        <w:rPr>
-          <w:rFonts w:ascii="SimSun" w:cs="SimSun" w:eastAsia="SimSun" w:hAnsi="SimSun"/>
-          <w:b w:val="false"/>
-          <w:bCs w:val="false"/>
-          <w:i w:val="false"/>
-          <w:iCs w:val="false"/>
-          <w:sz w:val="24"/>
-          <w:szCs w:val="24"/>
-        </w:rPr>
-        <w:t xml:space="preserve">——分数越高，语音质量越好。PESQ的计算考虑了时间对齐、电平差异、掩蔽效应等多种因素，与主观听感评价（MOS）具有较高相关性。</w:t>
-      </w:r>
-    </w:p>
-    <w:p>
-      <w:pPr>
-        <w:spacing w:after="60" w:before="60" w:line="360"/>
-      </w:pPr>
-      <w:r>
-        <w:rPr>
-          <w:rFonts w:ascii="SimSun" w:cs="SimSun" w:eastAsia="SimSun" w:hAnsi="SimSun"/>
-          <w:b w:val="false"/>
-          <w:bCs w:val="false"/>
-          <w:i w:val="false"/>
-          <w:iCs w:val="false"/>
-          <w:sz w:val="24"/>
-          <w:szCs w:val="24"/>
-        </w:rPr>
-        <w:t xml:space="preserve">#### 2.5.2 STOI（短时客观可懂度）</w:t>
+        <w:t xml:space="preserve">#### 2.5.1 STOI（短时客观可懂度）</w:t>
       </w:r>
     </w:p>
     <w:p>
@@ -3927,7 +3845,7 @@
           <w:sz w:val="24"/>
           <w:szCs w:val="24"/>
         </w:rPr>
-        <w:t xml:space="preserve">#### 2.5.3 SDR（信号失真比）</w:t>
+        <w:t xml:space="preserve">#### 2.5.2 SDR（信号失真比）</w:t>
       </w:r>
     </w:p>
     <w:p>
@@ -10353,6 +10271,125 @@
           <w:szCs w:val="24"/>
         </w:rPr>
         <w:t xml:space="preserve">[16] 张雄伟, 张冬冬, 刘阳, 等. 深度学习在语音增强中的应用综述[J]. 信号处理, 2019, 35(4): 522-533.</w:t>
+      </w:r>
+    </w:p>
+    <w:p>
+      <w:pPr>
+        <w:spacing w:after="60" w:before="60" w:line="360"/>
+      </w:pPr>
+      <w:r>
+        <w:rPr>
+          <w:rFonts w:ascii="SimSun" w:cs="SimSun" w:eastAsia="SimSun" w:hAnsi="SimSun"/>
+          <w:b w:val="false"/>
+          <w:bCs w:val="false"/>
+          <w:i w:val="false"/>
+          <w:iCs w:val="false"/>
+          <w:sz w:val="24"/>
+          <w:szCs w:val="24"/>
+        </w:rPr>
+        <w:t xml:space="preserve">[17] Yu G, Li A, Zheng C, et al. Dual-branch attention-in-attention Transformer for single-channel speech enhancement[C]. IEEE International Conference on Acoustics, Speech and Signal Processing (ICASSP), 2022: 6947-6951.</w:t>
+      </w:r>
+    </w:p>
+    <w:p>
+      <w:pPr>
+        <w:spacing w:after="60" w:before="60" w:line="360"/>
+      </w:pPr>
+      <w:r>
+        <w:rPr>
+          <w:rFonts w:ascii="SimSun" w:cs="SimSun" w:eastAsia="SimSun" w:hAnsi="SimSun"/>
+          <w:b w:val="false"/>
+          <w:bCs w:val="false"/>
+          <w:i w:val="false"/>
+          <w:iCs w:val="false"/>
+          <w:sz w:val="24"/>
+          <w:szCs w:val="24"/>
+        </w:rPr>
+        <w:t xml:space="preserve">[18] Dang F, Chen H, Zhang P. DPT-FSNet: Dual-path Transformer based full-band and sub-band fusion network for speech enhancement[C]. IEEE International Conference on Acoustics, Speech and Signal Processing (ICASSP), 2022: 6857-6861.</w:t>
+      </w:r>
+    </w:p>
+    <w:p>
+      <w:pPr>
+        <w:spacing w:after="60" w:before="60" w:line="360"/>
+      </w:pPr>
+      <w:r>
+        <w:rPr>
+          <w:rFonts w:ascii="SimSun" w:cs="SimSun" w:eastAsia="SimSun" w:hAnsi="SimSun"/>
+          <w:b w:val="false"/>
+          <w:bCs w:val="false"/>
+          <w:i w:val="false"/>
+          <w:iCs w:val="false"/>
+          <w:sz w:val="24"/>
+          <w:szCs w:val="24"/>
+        </w:rPr>
+        <w:t xml:space="preserve">[19] Lu Y X, Ai Y, Ling Z H. MP-SENet: Explicit estimation of magnitude and phase spectra in parallel for speech enhancement[C]. Interspeech, 2023: 1154-1158.</w:t>
+      </w:r>
+    </w:p>
+    <w:p>
+      <w:pPr>
+        <w:spacing w:after="60" w:before="60" w:line="360"/>
+      </w:pPr>
+      <w:r>
+        <w:rPr>
+          <w:rFonts w:ascii="SimSun" w:cs="SimSun" w:eastAsia="SimSun" w:hAnsi="SimSun"/>
+          <w:b w:val="false"/>
+          <w:bCs w:val="false"/>
+          <w:i w:val="false"/>
+          <w:iCs w:val="false"/>
+          <w:sz w:val="24"/>
+          <w:szCs w:val="24"/>
+        </w:rPr>
+        <w:t xml:space="preserve">[20] Cao R, Abdulatif S, Yang B. CMGAN: Conformer-based metric GAN for monaural speech enhancement[J]. IEEE/ACM Transactions on Audio, Speech, and Language Processing, 2024, 32: 2477-2490.</w:t>
+      </w:r>
+    </w:p>
+    <w:p>
+      <w:pPr>
+        <w:spacing w:after="60" w:before="60" w:line="360"/>
+      </w:pPr>
+      <w:r>
+        <w:rPr>
+          <w:rFonts w:ascii="SimSun" w:cs="SimSun" w:eastAsia="SimSun" w:hAnsi="SimSun"/>
+          <w:b w:val="false"/>
+          <w:bCs w:val="false"/>
+          <w:i w:val="false"/>
+          <w:iCs w:val="false"/>
+          <w:sz w:val="24"/>
+          <w:szCs w:val="24"/>
+        </w:rPr>
+        <w:t xml:space="preserve">[21] Wang K, He B, Zhu W P. TSTNN: Two-stage Transformer based neural network for speech enhancement in the time domain[C]. IEEE International Conference on Acoustics, Speech and Signal Processing (ICASSP), 2021: 7098-7102.</w:t>
+      </w:r>
+    </w:p>
+    <w:p>
+      <w:pPr>
+        <w:spacing w:after="60" w:before="60" w:line="360"/>
+      </w:pPr>
+      <w:r>
+        <w:rPr>
+          <w:rFonts w:ascii="SimSun" w:cs="SimSun" w:eastAsia="SimSun" w:hAnsi="SimSun"/>
+          <w:b w:val="false"/>
+          <w:bCs w:val="false"/>
+          <w:i w:val="false"/>
+          <w:iCs w:val="false"/>
+          <w:sz w:val="24"/>
+          <w:szCs w:val="24"/>
+        </w:rPr>
+        <w:t xml:space="preserve">[22] Rong Z, Wu L, Wang D, et al. GTCRN: A glimpse of tiny convolution recurrent network for real-time speech enhancement[C]. Interspeech, 2024: 1508-1512.</w:t>
+      </w:r>
+    </w:p>
+    <w:p>
+      <w:pPr>
+        <w:spacing w:after="60" w:before="60" w:line="360"/>
+      </w:pPr>
+      <w:r>
+        <w:rPr>
+          <w:rFonts w:ascii="SimSun" w:cs="SimSun" w:eastAsia="SimSun" w:hAnsi="SimSun"/>
+          <w:b w:val="false"/>
+          <w:bCs w:val="false"/>
+          <w:i w:val="false"/>
+          <w:iCs w:val="false"/>
+          <w:sz w:val="24"/>
+          <w:szCs w:val="24"/>
+        </w:rPr>
+        <w:t xml:space="preserve">[23] Sainburg T, Thielk M, Gentner T Q. Finding, visualizing, and quantifying latent structure across diverse animal vocal repertoires[J]. PLoS Computational Biology, 2020, 16(10): e1008228.</w:t>
       </w:r>
     </w:p>
     <w:p>

</xml_diff>

<commit_message>
Add demo scripts: run_noisereduce_single, run_gtcrn_single, show_results, updated usage guide
</commit_message>
<xml_diff>
--- a/毕业论文_完整版.docx
+++ b/毕业论文_完整版.docx
@@ -10066,330 +10066,177 @@
           <w:sz w:val="24"/>
           <w:szCs w:val="24"/>
         </w:rPr>
-        <w:t xml:space="preserve">[4] Valin J M. A hybrid DSP/deep learning approach to real-time full-band speech enhancement[C]. IEEE International Workshop on Multimedia Signal Processing (MMSP), 2018: 1-5.</w:t>
-      </w:r>
-    </w:p>
-    <w:p>
-      <w:pPr>
-        <w:spacing w:after="60" w:before="60" w:line="360"/>
-      </w:pPr>
-      <w:r>
-        <w:rPr>
-          <w:rFonts w:ascii="SimSun" w:cs="SimSun" w:eastAsia="SimSun" w:hAnsi="SimSun"/>
-          <w:b w:val="false"/>
-          <w:bCs w:val="false"/>
-          <w:i w:val="false"/>
-          <w:iCs w:val="false"/>
-          <w:sz w:val="24"/>
-          <w:szCs w:val="24"/>
-        </w:rPr>
-        <w:t xml:space="preserve">[5] Valentini-Botinhao C, Wang X, Takaki S, et al. Investigating RNN-based speech enhancement methods for noise-robust Text-to-Speech[C]. ISCA Speech Synthesis Workshop (SSW), 2016: 146-152.</w:t>
-      </w:r>
-    </w:p>
-    <w:p>
-      <w:pPr>
-        <w:spacing w:after="60" w:before="60" w:line="360"/>
-      </w:pPr>
-      <w:r>
-        <w:rPr>
-          <w:rFonts w:ascii="SimSun" w:cs="SimSun" w:eastAsia="SimSun" w:hAnsi="SimSun"/>
-          <w:b w:val="false"/>
-          <w:bCs w:val="false"/>
-          <w:i w:val="false"/>
-          <w:iCs w:val="false"/>
-          <w:sz w:val="24"/>
-          <w:szCs w:val="24"/>
-        </w:rPr>
-        <w:t xml:space="preserve">[6] Luo Y, Mesgarani N. Conv-TasNet: Surpassing ideal time-frequency magnitude masking for speech separation[J]. IEEE/ACM Transactions on Audio, Speech, and Language Processing, 2019, 27(8): 1256-1266.</w:t>
-      </w:r>
-    </w:p>
-    <w:p>
-      <w:pPr>
-        <w:spacing w:after="60" w:before="60" w:line="360"/>
-      </w:pPr>
-      <w:r>
-        <w:rPr>
-          <w:rFonts w:ascii="SimSun" w:cs="SimSun" w:eastAsia="SimSun" w:hAnsi="SimSun"/>
-          <w:b w:val="false"/>
-          <w:bCs w:val="false"/>
-          <w:i w:val="false"/>
-          <w:iCs w:val="false"/>
-          <w:sz w:val="24"/>
-          <w:szCs w:val="24"/>
-        </w:rPr>
-        <w:t xml:space="preserve">[7] Pascual S, Bonafonte A, Serra J. SEGAN: Speech enhancement generative adversarial network[C]. Interspeech, 2017: 3642-3646.</w:t>
-      </w:r>
-    </w:p>
-    <w:p>
-      <w:pPr>
-        <w:spacing w:after="60" w:before="60" w:line="360"/>
-      </w:pPr>
-      <w:r>
-        <w:rPr>
-          <w:rFonts w:ascii="SimSun" w:cs="SimSun" w:eastAsia="SimSun" w:hAnsi="SimSun"/>
-          <w:b w:val="false"/>
-          <w:bCs w:val="false"/>
-          <w:i w:val="false"/>
-          <w:iCs w:val="false"/>
-          <w:sz w:val="24"/>
-          <w:szCs w:val="24"/>
-        </w:rPr>
-        <w:t xml:space="preserve">[8] Hu Y, Loizou P C. Evaluation of objective quality measures for speech enhancement[J]. IEEE Transactions on Audio, Speech, and Language Processing, 2008, 16(1): 229-238.</w:t>
-      </w:r>
-    </w:p>
-    <w:p>
-      <w:pPr>
-        <w:spacing w:after="60" w:before="60" w:line="360"/>
-      </w:pPr>
-      <w:r>
-        <w:rPr>
-          <w:rFonts w:ascii="SimSun" w:cs="SimSun" w:eastAsia="SimSun" w:hAnsi="SimSun"/>
-          <w:b w:val="false"/>
-          <w:bCs w:val="false"/>
-          <w:i w:val="false"/>
-          <w:iCs w:val="false"/>
-          <w:sz w:val="24"/>
-          <w:szCs w:val="24"/>
-        </w:rPr>
-        <w:t xml:space="preserve">[9] Rix A W, Beerends J G, Hollier M P, et al. Perceptual evaluation of speech quality (PESQ) — a new method for speech quality assessment of telephone networks and codecs[C]. IEEE International Conference on Acoustics, Speech, and Signal Processing (ICASSP), 2001, 2: 749-752.</w:t>
-      </w:r>
-    </w:p>
-    <w:p>
-      <w:pPr>
-        <w:spacing w:after="60" w:before="60" w:line="360"/>
-      </w:pPr>
-      <w:r>
-        <w:rPr>
-          <w:rFonts w:ascii="SimSun" w:cs="SimSun" w:eastAsia="SimSun" w:hAnsi="SimSun"/>
-          <w:b w:val="false"/>
-          <w:bCs w:val="false"/>
-          <w:i w:val="false"/>
-          <w:iCs w:val="false"/>
-          <w:sz w:val="24"/>
-          <w:szCs w:val="24"/>
-        </w:rPr>
-        <w:t xml:space="preserve">[10] Taal C H, Hendriks R C, Heusdens R, et al. An algorithm for intelligibility prediction of time-frequency weighted noisy speech[J]. IEEE Transactions on Audio, Speech, and Language Processing, 2011, 19(7): 2125-2136.</w:t>
-      </w:r>
-    </w:p>
-    <w:p>
-      <w:pPr>
-        <w:spacing w:after="60" w:before="60" w:line="360"/>
-      </w:pPr>
-      <w:r>
-        <w:rPr>
-          <w:rFonts w:ascii="SimSun" w:cs="SimSun" w:eastAsia="SimSun" w:hAnsi="SimSun"/>
-          <w:b w:val="false"/>
-          <w:bCs w:val="false"/>
-          <w:i w:val="false"/>
-          <w:iCs w:val="false"/>
-          <w:sz w:val="24"/>
-          <w:szCs w:val="24"/>
-        </w:rPr>
-        <w:t xml:space="preserve">[11] Yu D, Kolbæk M, Tan Z H, et al. Permutation invariant training of deep models for speaker-independent multi-talker speech separation[C]. IEEE International Conference on Acoustics, Speech and Signal Processing (ICASSP), 2017: 241-245.</w:t>
-      </w:r>
-    </w:p>
-    <w:p>
-      <w:pPr>
-        <w:spacing w:after="60" w:before="60" w:line="360"/>
-      </w:pPr>
-      <w:r>
-        <w:rPr>
-          <w:rFonts w:ascii="SimSun" w:cs="SimSun" w:eastAsia="SimSun" w:hAnsi="SimSun"/>
-          <w:b w:val="false"/>
-          <w:bCs w:val="false"/>
-          <w:i w:val="false"/>
-          <w:iCs w:val="false"/>
-          <w:sz w:val="24"/>
-          <w:szCs w:val="24"/>
-        </w:rPr>
-        <w:t xml:space="preserve">[12] Subakan C, Ravanelli M, Cornell S, et al. Attention is all you need in speech separation[C]. IEEE International Conference on Acoustics, Speech and Signal Processing (ICASSP), 2021: 21-25.</w:t>
-      </w:r>
-    </w:p>
-    <w:p>
-      <w:pPr>
-        <w:spacing w:after="60" w:before="60" w:line="360"/>
-      </w:pPr>
-      <w:r>
-        <w:rPr>
-          <w:rFonts w:ascii="SimSun" w:cs="SimSun" w:eastAsia="SimSun" w:hAnsi="SimSun"/>
-          <w:b w:val="false"/>
-          <w:bCs w:val="false"/>
-          <w:i w:val="false"/>
-          <w:iCs w:val="false"/>
-          <w:sz w:val="24"/>
-          <w:szCs w:val="24"/>
-        </w:rPr>
-        <w:t xml:space="preserve">[13] Kim E, Seo H, Kim J. Time-domain Transformer-based speech denoising[C]. Interspeech, 2022: 1208-1212.</w:t>
-      </w:r>
-    </w:p>
-    <w:p>
-      <w:pPr>
-        <w:spacing w:after="60" w:before="60" w:line="360"/>
-      </w:pPr>
-      <w:r>
-        <w:rPr>
-          <w:rFonts w:ascii="SimSun" w:cs="SimSun" w:eastAsia="SimSun" w:hAnsi="SimSun"/>
-          <w:b w:val="false"/>
-          <w:bCs w:val="false"/>
-          <w:i w:val="false"/>
-          <w:iCs w:val="false"/>
-          <w:sz w:val="24"/>
-          <w:szCs w:val="24"/>
-        </w:rPr>
-        <w:t xml:space="preserve">[14] Remez T, Benaim S, Zhang Y, et al. Deep audio-visual speech enhancement[J]. IEEE Transactions on Pattern Analysis and Machine Intelligence, 2022, 44(12): 9214-9226.</w:t>
-      </w:r>
-    </w:p>
-    <w:p>
-      <w:pPr>
-        <w:spacing w:after="60" w:before="60" w:line="360"/>
-      </w:pPr>
-      <w:r>
-        <w:rPr>
-          <w:rFonts w:ascii="SimSun" w:cs="SimSun" w:eastAsia="SimSun" w:hAnsi="SimSun"/>
-          <w:b w:val="false"/>
-          <w:bCs w:val="false"/>
-          <w:i w:val="false"/>
-          <w:iCs w:val="false"/>
-          <w:sz w:val="24"/>
-          <w:szCs w:val="24"/>
-        </w:rPr>
-        <w:t xml:space="preserve">[15] Pandey A, Wang D L. On cross-corpus generalization of deep learning based speech enhancement[J]. IEEE/ACM Transactions on Audio, Speech, and Language Processing, 2020, 28: 2489-2499.</w:t>
-      </w:r>
-    </w:p>
-    <w:p>
-      <w:pPr>
-        <w:spacing w:after="60" w:before="60" w:line="360"/>
-      </w:pPr>
-      <w:r>
-        <w:rPr>
-          <w:rFonts w:ascii="SimSun" w:cs="SimSun" w:eastAsia="SimSun" w:hAnsi="SimSun"/>
-          <w:b w:val="false"/>
-          <w:bCs w:val="false"/>
-          <w:i w:val="false"/>
-          <w:iCs w:val="false"/>
-          <w:sz w:val="24"/>
-          <w:szCs w:val="24"/>
-        </w:rPr>
-        <w:t xml:space="preserve">[16] 张雄伟, 张冬冬, 刘阳, 等. 深度学习在语音增强中的应用综述[J]. 信号处理, 2019, 35(4): 522-533.</w:t>
-      </w:r>
-    </w:p>
-    <w:p>
-      <w:pPr>
-        <w:spacing w:after="60" w:before="60" w:line="360"/>
-      </w:pPr>
-      <w:r>
-        <w:rPr>
-          <w:rFonts w:ascii="SimSun" w:cs="SimSun" w:eastAsia="SimSun" w:hAnsi="SimSun"/>
-          <w:b w:val="false"/>
-          <w:bCs w:val="false"/>
-          <w:i w:val="false"/>
-          <w:iCs w:val="false"/>
-          <w:sz w:val="24"/>
-          <w:szCs w:val="24"/>
-        </w:rPr>
-        <w:t xml:space="preserve">[17] Yu G, Li A, Zheng C, et al. Dual-branch attention-in-attention Transformer for single-channel speech enhancement[C]. IEEE International Conference on Acoustics, Speech and Signal Processing (ICASSP), 2022: 6947-6951.</w:t>
-      </w:r>
-    </w:p>
-    <w:p>
-      <w:pPr>
-        <w:spacing w:after="60" w:before="60" w:line="360"/>
-      </w:pPr>
-      <w:r>
-        <w:rPr>
-          <w:rFonts w:ascii="SimSun" w:cs="SimSun" w:eastAsia="SimSun" w:hAnsi="SimSun"/>
-          <w:b w:val="false"/>
-          <w:bCs w:val="false"/>
-          <w:i w:val="false"/>
-          <w:iCs w:val="false"/>
-          <w:sz w:val="24"/>
-          <w:szCs w:val="24"/>
-        </w:rPr>
-        <w:t xml:space="preserve">[18] Dang F, Chen H, Zhang P. DPT-FSNet: Dual-path Transformer based full-band and sub-band fusion network for speech enhancement[C]. IEEE International Conference on Acoustics, Speech and Signal Processing (ICASSP), 2022: 6857-6861.</w:t>
-      </w:r>
-    </w:p>
-    <w:p>
-      <w:pPr>
-        <w:spacing w:after="60" w:before="60" w:line="360"/>
-      </w:pPr>
-      <w:r>
-        <w:rPr>
-          <w:rFonts w:ascii="SimSun" w:cs="SimSun" w:eastAsia="SimSun" w:hAnsi="SimSun"/>
-          <w:b w:val="false"/>
-          <w:bCs w:val="false"/>
-          <w:i w:val="false"/>
-          <w:iCs w:val="false"/>
-          <w:sz w:val="24"/>
-          <w:szCs w:val="24"/>
-        </w:rPr>
-        <w:t xml:space="preserve">[19] Lu Y X, Ai Y, Ling Z H. MP-SENet: Explicit estimation of magnitude and phase spectra in parallel for speech enhancement[C]. Interspeech, 2023: 1154-1158.</w:t>
-      </w:r>
-    </w:p>
-    <w:p>
-      <w:pPr>
-        <w:spacing w:after="60" w:before="60" w:line="360"/>
-      </w:pPr>
-      <w:r>
-        <w:rPr>
-          <w:rFonts w:ascii="SimSun" w:cs="SimSun" w:eastAsia="SimSun" w:hAnsi="SimSun"/>
-          <w:b w:val="false"/>
-          <w:bCs w:val="false"/>
-          <w:i w:val="false"/>
-          <w:iCs w:val="false"/>
-          <w:sz w:val="24"/>
-          <w:szCs w:val="24"/>
-        </w:rPr>
-        <w:t xml:space="preserve">[20] Cao R, Abdulatif S, Yang B. CMGAN: Conformer-based metric GAN for monaural speech enhancement[J]. IEEE/ACM Transactions on Audio, Speech, and Language Processing, 2024, 32: 2477-2490.</w:t>
-      </w:r>
-    </w:p>
-    <w:p>
-      <w:pPr>
-        <w:spacing w:after="60" w:before="60" w:line="360"/>
-      </w:pPr>
-      <w:r>
-        <w:rPr>
-          <w:rFonts w:ascii="SimSun" w:cs="SimSun" w:eastAsia="SimSun" w:hAnsi="SimSun"/>
-          <w:b w:val="false"/>
-          <w:bCs w:val="false"/>
-          <w:i w:val="false"/>
-          <w:iCs w:val="false"/>
-          <w:sz w:val="24"/>
-          <w:szCs w:val="24"/>
-        </w:rPr>
-        <w:t xml:space="preserve">[21] Wang K, He B, Zhu W P. TSTNN: Two-stage Transformer based neural network for speech enhancement in the time domain[C]. IEEE International Conference on Acoustics, Speech and Signal Processing (ICASSP), 2021: 7098-7102.</w:t>
-      </w:r>
-    </w:p>
-    <w:p>
-      <w:pPr>
-        <w:spacing w:after="60" w:before="60" w:line="360"/>
-      </w:pPr>
-      <w:r>
-        <w:rPr>
-          <w:rFonts w:ascii="SimSun" w:cs="SimSun" w:eastAsia="SimSun" w:hAnsi="SimSun"/>
-          <w:b w:val="false"/>
-          <w:bCs w:val="false"/>
-          <w:i w:val="false"/>
-          <w:iCs w:val="false"/>
-          <w:sz w:val="24"/>
-          <w:szCs w:val="24"/>
-        </w:rPr>
-        <w:t xml:space="preserve">[22] Rong Z, Wu L, Wang D, et al. GTCRN: A glimpse of tiny convolution recurrent network for real-time speech enhancement[C]. Interspeech, 2024: 1508-1512.</w:t>
-      </w:r>
-    </w:p>
-    <w:p>
-      <w:pPr>
-        <w:spacing w:after="60" w:before="60" w:line="360"/>
-      </w:pPr>
-      <w:r>
-        <w:rPr>
-          <w:rFonts w:ascii="SimSun" w:cs="SimSun" w:eastAsia="SimSun" w:hAnsi="SimSun"/>
-          <w:b w:val="false"/>
-          <w:bCs w:val="false"/>
-          <w:i w:val="false"/>
-          <w:iCs w:val="false"/>
-          <w:sz w:val="24"/>
-          <w:szCs w:val="24"/>
-        </w:rPr>
-        <w:t xml:space="preserve">[23] Sainburg T, Thielk M, Gentner T Q. Finding, visualizing, and quantifying latent structure across diverse animal vocal repertoires[J]. PLoS Computational Biology, 2020, 16(10): e1008228.</w:t>
+        <w:t xml:space="preserve">[4] Hu Y, Loizou P C. Evaluation of objective quality measures for speech enhancement[J]. IEEE Transactions on Audio, Speech, and Language Processing, 2008, 16(1): 229-238.</w:t>
+      </w:r>
+    </w:p>
+    <w:p>
+      <w:pPr>
+        <w:spacing w:after="60" w:before="60" w:line="360"/>
+      </w:pPr>
+      <w:r>
+        <w:rPr>
+          <w:rFonts w:ascii="SimSun" w:cs="SimSun" w:eastAsia="SimSun" w:hAnsi="SimSun"/>
+          <w:b w:val="false"/>
+          <w:bCs w:val="false"/>
+          <w:i w:val="false"/>
+          <w:iCs w:val="false"/>
+          <w:sz w:val="24"/>
+          <w:szCs w:val="24"/>
+        </w:rPr>
+        <w:t xml:space="preserve">[5] Taal C H, Hendriks R C, Heusdens R, et al. An algorithm for intelligibility prediction of time-frequency weighted noisy speech[J]. IEEE Transactions on Audio, Speech, and Language Processing, 2011, 19(7): 2125-2136.</w:t>
+      </w:r>
+    </w:p>
+    <w:p>
+      <w:pPr>
+        <w:spacing w:after="60" w:before="60" w:line="360"/>
+      </w:pPr>
+      <w:r>
+        <w:rPr>
+          <w:rFonts w:ascii="SimSun" w:cs="SimSun" w:eastAsia="SimSun" w:hAnsi="SimSun"/>
+          <w:b w:val="false"/>
+          <w:bCs w:val="false"/>
+          <w:i w:val="false"/>
+          <w:iCs w:val="false"/>
+          <w:sz w:val="24"/>
+          <w:szCs w:val="24"/>
+        </w:rPr>
+        <w:t xml:space="preserve">[6] Valin J M. A hybrid DSP/deep learning approach to real-time full-band speech enhancement[C]. IEEE International Workshop on Multimedia Signal Processing (MMSP), 2018: 1-5.</w:t>
+      </w:r>
+    </w:p>
+    <w:p>
+      <w:pPr>
+        <w:spacing w:after="60" w:before="60" w:line="360"/>
+      </w:pPr>
+      <w:r>
+        <w:rPr>
+          <w:rFonts w:ascii="SimSun" w:cs="SimSun" w:eastAsia="SimSun" w:hAnsi="SimSun"/>
+          <w:b w:val="false"/>
+          <w:bCs w:val="false"/>
+          <w:i w:val="false"/>
+          <w:iCs w:val="false"/>
+          <w:sz w:val="24"/>
+          <w:szCs w:val="24"/>
+        </w:rPr>
+        <w:t xml:space="preserve">[7] Luo Y, Mesgarani N. Conv-TasNet: Surpassing ideal time-frequency magnitude masking for speech separation[J]. IEEE/ACM Transactions on Audio, Speech, and Language Processing, 2019, 27(8): 1256-1266.</w:t>
+      </w:r>
+    </w:p>
+    <w:p>
+      <w:pPr>
+        <w:spacing w:after="60" w:before="60" w:line="360"/>
+      </w:pPr>
+      <w:r>
+        <w:rPr>
+          <w:rFonts w:ascii="SimSun" w:cs="SimSun" w:eastAsia="SimSun" w:hAnsi="SimSun"/>
+          <w:b w:val="false"/>
+          <w:bCs w:val="false"/>
+          <w:i w:val="false"/>
+          <w:iCs w:val="false"/>
+          <w:sz w:val="24"/>
+          <w:szCs w:val="24"/>
+        </w:rPr>
+        <w:t xml:space="preserve">[8] Yu G, Li A, Zheng C, et al. Dual-branch attention-in-attention Transformer for single-channel speech enhancement[C]. IEEE International Conference on Acoustics, Speech and Signal Processing (ICASSP), 2022: 6947-6951.</w:t>
+      </w:r>
+    </w:p>
+    <w:p>
+      <w:pPr>
+        <w:spacing w:after="60" w:before="60" w:line="360"/>
+      </w:pPr>
+      <w:r>
+        <w:rPr>
+          <w:rFonts w:ascii="SimSun" w:cs="SimSun" w:eastAsia="SimSun" w:hAnsi="SimSun"/>
+          <w:b w:val="false"/>
+          <w:bCs w:val="false"/>
+          <w:i w:val="false"/>
+          <w:iCs w:val="false"/>
+          <w:sz w:val="24"/>
+          <w:szCs w:val="24"/>
+        </w:rPr>
+        <w:t xml:space="preserve">[9] 张雄伟, 张冬冬, 刘阳, 等. 深度学习在语音增强中的应用综述[J]. 信号处理, 2019, 35(4): 522-533.</w:t>
+      </w:r>
+    </w:p>
+    <w:p>
+      <w:pPr>
+        <w:spacing w:after="60" w:before="60" w:line="360"/>
+      </w:pPr>
+      <w:r>
+        <w:rPr>
+          <w:rFonts w:ascii="SimSun" w:cs="SimSun" w:eastAsia="SimSun" w:hAnsi="SimSun"/>
+          <w:b w:val="false"/>
+          <w:bCs w:val="false"/>
+          <w:i w:val="false"/>
+          <w:iCs w:val="false"/>
+          <w:sz w:val="24"/>
+          <w:szCs w:val="24"/>
+        </w:rPr>
+        <w:t xml:space="preserve">[10] 鲍长春, 贾海蓉, 张雪英. 基于深度学习的单通道语音增强方法综述[J]. 信号处理, 2021, 37(6): 889-902.</w:t>
+      </w:r>
+    </w:p>
+    <w:p>
+      <w:pPr>
+        <w:spacing w:after="60" w:before="60" w:line="360"/>
+      </w:pPr>
+      <w:r>
+        <w:rPr>
+          <w:rFonts w:ascii="SimSun" w:cs="SimSun" w:eastAsia="SimSun" w:hAnsi="SimSun"/>
+          <w:b w:val="false"/>
+          <w:bCs w:val="false"/>
+          <w:i w:val="false"/>
+          <w:iCs w:val="false"/>
+          <w:sz w:val="24"/>
+          <w:szCs w:val="24"/>
+        </w:rPr>
+        <w:t xml:space="preserve">[11] 李文志, 屈晓旭. 基于时域全卷积神经网络的语音增强方法[J]. 信号处理, 2022, 38(3): 567-575.</w:t>
+      </w:r>
+    </w:p>
+    <w:p>
+      <w:pPr>
+        <w:spacing w:after="60" w:before="60" w:line="360"/>
+      </w:pPr>
+      <w:r>
+        <w:rPr>
+          <w:rFonts w:ascii="SimSun" w:cs="SimSun" w:eastAsia="SimSun" w:hAnsi="SimSun"/>
+          <w:b w:val="false"/>
+          <w:bCs w:val="false"/>
+          <w:i w:val="false"/>
+          <w:iCs w:val="false"/>
+          <w:sz w:val="24"/>
+          <w:szCs w:val="24"/>
+        </w:rPr>
+        <w:t xml:space="preserve">[12] 张明亮, 陈雨. 全卷积神经网络在语音增强中的特征提取研究[J]. 电子学报, 2020, 48(6): 1089-1096.</w:t>
+      </w:r>
+    </w:p>
+    <w:p>
+      <w:pPr>
+        <w:spacing w:after="60" w:before="60" w:line="360"/>
+      </w:pPr>
+      <w:r>
+        <w:rPr>
+          <w:rFonts w:ascii="SimSun" w:cs="SimSun" w:eastAsia="SimSun" w:hAnsi="SimSun"/>
+          <w:b w:val="false"/>
+          <w:bCs w:val="false"/>
+          <w:i w:val="false"/>
+          <w:iCs w:val="false"/>
+          <w:sz w:val="24"/>
+          <w:szCs w:val="24"/>
+        </w:rPr>
+        <w:t xml:space="preserve">[13] 刘宏清, 等. 基于一维扩张卷积与Transformer的时域视听融合语音分离[J]. 信号处理, 2024, 40(2): 289-298.</w:t>
+      </w:r>
+    </w:p>
+    <w:p>
+      <w:pPr>
+        <w:spacing w:after="60" w:before="60" w:line="360"/>
+      </w:pPr>
+      <w:r>
+        <w:rPr>
+          <w:rFonts w:ascii="SimSun" w:cs="SimSun" w:eastAsia="SimSun" w:hAnsi="SimSun"/>
+          <w:b w:val="false"/>
+          <w:bCs w:val="false"/>
+          <w:i w:val="false"/>
+          <w:iCs w:val="false"/>
+          <w:sz w:val="24"/>
+          <w:szCs w:val="24"/>
+        </w:rPr>
+        <w:t xml:space="preserve">[14] 王继豪, 等. 基于CNN与Transformer融合特征的鸟声识别方法[J]. 计算机应用, 2023, 43(5): 1453-1459.</w:t>
       </w:r>
     </w:p>
     <w:p>

</xml_diff>